<commit_message>
fix: corrige o resumo e a leitura da validação aninhada na versão 8 e retira Gomes (2019)
- resumo reduzido de 320 para 299 palavras (limite do template: 300)
- validação aninhada descrita como pouco melhor que o modelo sem preditores
  (R² -5,2% contra -10,4%; RMSE R$ 6,47 contra R$ 6,72), como mostra a Tabela 5;
  o texto dizia 'sem ganho sobre a média do preço'
- Gomes (2019) retirado do artigo (fonte com mais de 5 anos) e devolvido a
  Referencias/nao_citadas_no_artigo; índice e planilha de verificação atualizados
- PDF da versão 8
</commit_message>
<xml_diff>
--- a/Docs/Artigo_SIMPOS_2026_v8_2026-10-15.docx
+++ b/Docs/Artigo_SIMPOS_2026_v8_2026-10-15.docx
@@ -361,7 +361,7 @@
           <w:rFonts w:ascii="Times New Roman" w:hAnsi="Times New Roman" w:cs="Times New Roman" w:eastAsia="Times New Roman"/>
           <w:sz w:val="24"/>
         </w:rPr>
-        <w:t xml:space="preserve">: Este trabalho, vinculado ao curso de Especialização em Ciência de Dados do IFTM, na linha de pesquisa Aprendizado de Máquina, insere-se na aplicação da ciência de dados ao agronegócio. Não se sabe quanto o preço da dose de sêmen reflete as provas genéticas dos catálogos. O objetivo geral foi analisar a relação entre as Diferenças Esperadas na Progênie (DEPs), os selos comerciais e as linhagens e o preço da dose de sêmen convencional de touros Nelore. Os objetivos específicos foram ranquear esses atributos pelo </w:t>
+        <w:t xml:space="preserve">: Este trabalho, vinculado ao curso de Especialização em Ciência de Dados do IFTM, na linha de pesquisa Aprendizado de Máquina, insere-se na aplicação da ciência de dados ao agronegócio. Não se sabe quanto o preço do sêmen reflete as provas genéticas dos catálogos. O objetivo geral foi analisar a relação entre as Diferenças Esperadas na Progênie (DEPs), os selos comerciais e as linhagens e o preço da dose de sêmen convencional de touros Nelore. Os objetivos específicos foram ranquear esses atributos pelo </w:t>
       </w:r>
       <w:r>
         <w:rPr>
@@ -391,7 +391,7 @@
           <w:rFonts w:ascii="Times New Roman" w:hAnsi="Times New Roman" w:cs="Times New Roman" w:eastAsia="Times New Roman"/>
           <w:sz w:val="24"/>
         </w:rPr>
-        <w:t xml:space="preserve"> do catálogo da CRV Lagoa em setembro de 2026: 115 touros com avaliação genética da ANCP e preço válido. O quadro teórico baseou-se na Teoria dos Preços Hedônicos (ROSEN, 1974) e no algoritmo </w:t>
+        <w:t xml:space="preserve"> do catálogo da CRV Lagoa em setembro de 2026: 115 touros com avaliação da ANCP e preço válido. O quadro teórico baseou-se na Teoria dos Preços Hedônicos (ROSEN, 1974) e no Random Forest (BREIMAN, 2001)</w:t>
       </w:r>
       <w:r>
         <w:rPr>
@@ -399,6 +399,20 @@
           <w:i/>
           <w:sz w:val="24"/>
         </w:rPr>
+      </w:r>
+      <w:r>
+        <w:rPr>
+          <w:rFonts w:ascii="Times New Roman" w:hAnsi="Times New Roman" w:cs="Times New Roman" w:eastAsia="Times New Roman"/>
+          <w:sz w:val="24"/>
+        </w:rPr>
+        <w:t xml:space="preserve">. A análise combinou </w:t>
+      </w:r>
+      <w:r>
+        <w:rPr>
+          <w:rFonts w:ascii="Times New Roman" w:hAnsi="Times New Roman" w:cs="Times New Roman" w:eastAsia="Times New Roman"/>
+          <w:i/>
+          <w:sz w:val="24"/>
+        </w:rPr>
         <w:t xml:space="preserve">Random Forest</w:t>
       </w:r>
       <w:r>
@@ -406,22 +420,7 @@
           <w:rFonts w:ascii="Times New Roman" w:hAnsi="Times New Roman" w:cs="Times New Roman" w:eastAsia="Times New Roman"/>
           <w:sz w:val="24"/>
         </w:rPr>
-        <w:t xml:space="preserve"> (BREIMAN, 2001). A análise combinou </w:t>
-      </w:r>
-      <w:r>
-        <w:rPr>
-          <w:rFonts w:ascii="Times New Roman" w:hAnsi="Times New Roman" w:cs="Times New Roman" w:eastAsia="Times New Roman"/>
-          <w:i/>
-          <w:sz w:val="24"/>
-        </w:rPr>
-        <w:t xml:space="preserve">Random Forest</w:t>
-      </w:r>
-      <w:r>
-        <w:rPr>
-          <w:rFonts w:ascii="Times New Roman" w:hAnsi="Times New Roman" w:cs="Times New Roman" w:eastAsia="Times New Roman"/>
-          <w:sz w:val="24"/>
-        </w:rPr>
-        <w:t xml:space="preserve">, regressões hedônicas com erros-padrão robustos, critério de Akaike e validação cruzada. As 18 DEPs explicaram pouco do preço; a única significativa na regressão conjunta, o consumo alimentar residual, perdeu significância na forma linear diante dos selos, mas o ágio dos 3% melhores touros nessa característica persistiu. No modelo final (R² = 28,6% na amostra), foram significativos o selo de fertilidade (+R$ 5,21) e, no limite da significância, o de habilidade materna (+R$ 2,32), e nenhuma linhagem apresentou efeito robusto; fora da amostra, com a seleção das variáveis refeita em cada partição da validação cruzada, os modelos não superaram a média do preço. Conclui-se que a sinalização comercial pesa mais que as provas genéticas no preço do sêmen. Por utilizar apenas dados públicos, a pesquisa não foi submetida ao Comitê de Ética em Pesquisa.</w:t>
+        <w:t>, regressões hedônicas com erros-padrão robustos, critério de Akaike e validação cruzada. As 18 DEPs explicaram pouco do preço; a única significativa em conjunto, o consumo alimentar residual, perdeu significância na forma linear diante dos selos, mas o ágio dos 3% melhores nessa característica persistiu. No modelo final (R² = 28,6% na amostra), foram significativos o selo de fertilidade (+R$ 5,21) e, no limite da significância, o de habilidade materna (+R$ 2,32), e nenhuma linhagem apresentou efeito robusto; fora da amostra, o poder preditivo foi baixo. Conclui-se que a sinalização comercial pesa mais que as provas genéticas no preço do sêmen. Por utilizar apenas dados públicos, a pesquisa não foi submetida ao Comitê de Ética em Pesquisa.</w:t>
       </w:r>
     </w:p>
     <w:p>
@@ -7591,7 +7590,7 @@
           <w:sz w:val="24"/>
           <w:lang w:val="pt-BR"/>
         </w:rPr>
-        <w:t xml:space="preserve">Esse resultado é coerente com a ideia de que, em mercados com incerteza sobre a qualidade, surgem instituições para contrabalançá-la, como garantias, marcas e certificações (AKERLOF, 1970). Os selos IFERT e MATERNAL podem ser entendidos dessa forma: resumem em um sinal visual um conjunto de informações que o comprador teria dificuldade de avaliar, aproximando-se dos sinais de mercado descritos por Spence (1973), atributos observáveis a partir dos quais o comprador infere características que não consegue verificar diretamente; nessa direção, em leilões, parte dos compradores de touros privilegia a apresentação visual do animal em relação às informações técnicas (SILVEIRA, 2022), e o baixo peso dos valores genéticos no preço pode estar ligado à desconfiança nesses dados (LOPES et al., 2023). Uma interpretação compatível com esses estudos, mas não testada aqui, é que os selos funcionem como heurísticas, que reduzem tarefas complexas de julgamento a operações mais simples (TVERSKY; KAHNEMAN, 1974), diante do grande número de DEPs, acurácias e percentis apresentados para cada touro, que tende a dificultar a tomada de decisão na seleção (GOMES, 2019). A ausência de efeito do selo RP-ANCP, por sua vez, pode refletir o pequeno número de touros com essa certificação na amostra (N = 7).</w:t>
+        <w:t>Esse resultado é coerente com a ideia de que, em mercados com incerteza sobre a qualidade, surgem instituições para contrabalançá-la, como garantias, marcas e certificações (AKERLOF, 1970). Os selos IFERT e MATERNAL podem ser entendidos dessa forma: resumem em um sinal visual um conjunto de informações que o comprador teria dificuldade de avaliar, aproximando-se dos sinais de mercado descritos por Spence (1973), atributos observáveis a partir dos quais o comprador infere características que não consegue verificar diretamente; nessa direção, em leilões, parte dos compradores de touros privilegia a apresentação visual do animal em relação às informações técnicas (SILVEIRA, 2022), e o baixo peso dos valores genéticos no preço pode estar ligado à desconfiança nesses dados (LOPES et al., 2023). Uma interpretação compatível com esses estudos, mas não testada aqui, é que os selos funcionem como heurísticas, que reduzem tarefas complexas de julgamento a operações mais simples (TVERSKY; KAHNEMAN, 1974), diante do grande número de DEPs, acurácias e percentis apresentados para cada touro. A ausência de efeito do selo RP-ANCP, por sua vez, pode refletir o pequeno número de touros com essa certificação na amostra (N = 7).</w:t>
       </w:r>
     </w:p>
     <w:p>
@@ -11778,7 +11777,7 @@
           <w:sz w:val="24"/>
           <w:lang w:val="pt-BR"/>
         </w:rPr>
-        <w:t xml:space="preserve"> de 8,5% e R² médio de -3,7% na validação cruzada, sinal de sobreajuste à amostra de 115 touros, e o modelo hedônico final passou de 28,6% para 4,1%, com erro médio de previsão (RMSE) de R$ 6,17 por dose, contra R$ 6,72 do modelo sem preditores. A especificação com o CAR na forma de indicador de Super Elite obteve R² de 10,1% (RMSE de R$ 5,95), mas, como o corte em 3% foi escolhido a partir dos próprios dados, esse valor não constitui validação independente. Os valores dos modelos hedônicos são, ainda, otimistas, porque suas variáveis foram selecionadas com a amostra completa: refazendo a seleção dentro de cada partição de treino (validação cruzada aninhada), o R² fora da amostra foi de -5,2% (RMSE de R$ 6,47), sem ganho sobre a média do preço, e o conjunto do modelo final foi selecionado em apenas 2 das 50 partições. Na importância por permutação (Figura 4b), o SELO_IFERT foi o atributo mais relevante (queda de 0,15 no R² quando embaralhado), seguido, a grande distância, do CAR_TOP (0,03), como nos modelos econométricos; o SELO_MATERNAL, significativo nas regressões, praticamente não contribuiu para a previsão, assim como 3P_TOP e MP210_TOP, segunda e quarta variáveis pela redução de impureza no </w:t>
+        <w:t xml:space="preserve"> de 8,5% e R² médio de -3,7% na validação cruzada, sinal de sobreajuste à amostra de 115 touros, e o modelo hedônico final passou de 28,6% para 4,1%, com erro médio de previsão (RMSE) de R$ 6,17 por dose, contra R$ 6,72 do modelo sem preditores. A especificação com o CAR na forma de indicador de Super Elite obteve R² de 10,1% (RMSE de R$ 5,95), mas, como o corte em 3% foi escolhido a partir dos próprios dados, esse valor não constitui validação independente. Os valores dos modelos hedônicos são, ainda, otimistas, porque suas variáveis foram selecionadas com a amostra completa: refazendo a seleção dentro de cada partição de treino (validação cruzada aninhada), o R² fora da amostra foi de -5,2% (RMSE de R$ 6,47), pouco melhor que o do modelo sem preditores (-10,4%; RMSE de R$ 6,72), e o conjunto do modelo final foi selecionado em apenas 2 das 50 partições. Na importância por permutação (Figura 4b), o SELO_IFERT foi o atributo mais relevante (queda de 0,15 no R² quando embaralhado), seguido, a grande distância, do CAR_TOP (0,03), como nos modelos econométricos; o SELO_MATERNAL, significativo nas regressões, praticamente não contribuiu para a previsão, assim como 3P_TOP e MP210_TOP, segunda e quarta variáveis pela redução de impureza no </w:t>
       </w:r>
       <w:r>
         <w:rPr>
@@ -14167,62 +14166,6 @@
           <w:sz w:val="24"/>
         </w:rPr>
         <w:t xml:space="preserve">. Brasília: CNA, 9 abr. 2025. Disponível em: https://cnabrasil.org.br/noticias/pib-do-agronegocio-fecha-2024-com-crescimento-de-1-81. Acesso em: 8 out. 2026.</w:t>
-      </w:r>
-    </w:p>
-    <w:p>
-      <w:pPr>
-        <w:keepNext w:val="0"/>
-        <w:keepLines w:val="0"/>
-        <w:pageBreakBefore w:val="0"/>
-        <w:widowControl w:val="1"/>
-        <w:pBdr>
-          <w:top w:space="0" w:sz="0" w:val="nil"/>
-          <w:left w:space="0" w:sz="0" w:val="nil"/>
-          <w:bottom w:space="0" w:sz="0" w:val="nil"/>
-          <w:right w:space="0" w:sz="0" w:val="nil"/>
-          <w:between w:space="0" w:sz="0" w:val="nil"/>
-        </w:pBdr>
-        <w:shd w:fill="auto" w:val="clear"/>
-        <w:spacing w:after="240" w:before="0" w:line="240" w:lineRule="auto"/>
-        <w:ind w:left="0" w:right="0" w:firstLine="0"/>
-        <w:jc w:val="both"/>
-        <w:rPr>
-          <w:rFonts w:ascii="Times New Roman" w:cs="Times New Roman" w:eastAsia="Times New Roman" w:hAnsi="Times New Roman"/>
-          <w:b w:val="0"/>
-          <w:bCs w:val="0"/>
-          <w:i w:val="0"/>
-          <w:iCs w:val="0"/>
-          <w:smallCaps w:val="0"/>
-          <w:strike w:val="0"/>
-          <w:color w:val="000000"/>
-          <w:sz w:val="24"/>
-          <w:szCs w:val="24"/>
-          <w:u w:val="none"/>
-          <w:shd w:fill="auto" w:val="clear"/>
-          <w:vertAlign w:val="baseline"/>
-        </w:rPr>
-      </w:pPr>
-      <w:r>
-        <w:rPr>
-          <w:rFonts w:ascii="Times New Roman" w:hAnsi="Times New Roman" w:cs="Times New Roman" w:eastAsia="Times New Roman"/>
-          <w:sz w:val="24"/>
-        </w:rPr>
-        <w:t xml:space="preserve">GOMES, M. M. M. </w:t>
-      </w:r>
-      <w:r>
-        <w:rPr>
-          <w:rFonts w:ascii="Times New Roman" w:hAnsi="Times New Roman" w:cs="Times New Roman" w:eastAsia="Times New Roman"/>
-          <w:b/>
-          <w:sz w:val="24"/>
-        </w:rPr>
-        <w:t xml:space="preserve">Fatores que influenciam o preço de touros Nelore em leilões</w:t>
-      </w:r>
-      <w:r>
-        <w:rPr>
-          <w:rFonts w:ascii="Times New Roman" w:hAnsi="Times New Roman" w:cs="Times New Roman" w:eastAsia="Times New Roman"/>
-          <w:sz w:val="24"/>
-        </w:rPr>
-        <w:t xml:space="preserve">. 2019. Dissertação (Mestrado em Ciência Animal) – Universidade Federal de Mato Grosso do Sul, Campo Grande, 2019.</w:t>
       </w:r>
     </w:p>
     <w:p>

</xml_diff>

<commit_message>
docs: remonta a versão 8 do artigo pelo pipeline das partes e retira Spence (1973)
- o conteúdo da v8 feita na nuvem foi levado para as partes do artigo e o texto
  foi remontado com as regras de formatação de sempre (sem os itálicos, o negrito
  das referências e a fonte sob as tabelas que a nuvem acrescentou)
- Spence (1973) retirado: a teoria exige sinal custoso, que os selos concedidos
  pela central não têm, e o Akerlof já sustenta o argumento; PDF e texto voltam
  para Referencias/nao_citadas_no_artigo, com índice e planilha atualizados
- Figura 1 com 13,5 cm e Figura 4 antes da Tabela 5, para não deixar meia página
  em branco; figura, legenda e fonte na mesma página
</commit_message>
<xml_diff>
--- a/Docs/Artigo_SIMPOS_2026_v8_2026-10-15.docx
+++ b/Docs/Artigo_SIMPOS_2026_v8_2026-10-15.docx
@@ -361,66 +361,7 @@
           <w:rFonts w:ascii="Times New Roman" w:hAnsi="Times New Roman" w:cs="Times New Roman" w:eastAsia="Times New Roman"/>
           <w:sz w:val="24"/>
         </w:rPr>
-        <w:t xml:space="preserve">: Este trabalho, vinculado ao curso de Especialização em Ciência de Dados do IFTM, na linha de pesquisa Aprendizado de Máquina, insere-se na aplicação da ciência de dados ao agronegócio. Não se sabe quanto o preço do sêmen reflete as provas genéticas dos catálogos. O objetivo geral foi analisar a relação entre as Diferenças Esperadas na Progênie (DEPs), os selos comerciais e as linhagens e o preço da dose de sêmen convencional de touros Nelore. Os objetivos específicos foram ranquear esses atributos pelo </w:t>
-      </w:r>
-      <w:r>
-        <w:rPr>
-          <w:rFonts w:ascii="Times New Roman" w:hAnsi="Times New Roman" w:cs="Times New Roman" w:eastAsia="Times New Roman"/>
-          <w:i/>
-          <w:sz w:val="24"/>
-        </w:rPr>
-        <w:t xml:space="preserve">Random Forest</w:t>
-      </w:r>
-      <w:r>
-        <w:rPr>
-          <w:rFonts w:ascii="Times New Roman" w:hAnsi="Times New Roman" w:cs="Times New Roman" w:eastAsia="Times New Roman"/>
-          <w:sz w:val="24"/>
-        </w:rPr>
-        <w:t xml:space="preserve">, estimar seus preços implícitos por regressão hedônica e comparar as três dimensões. A pergunta norteadora foi: em que medida as DEPs influenciam o preço da dose, e qual a contribuição dos selos e das linhagens? Partiu-se da hipótese de que touros com melhores DEPs têm doses mais caras. A pesquisa, quantitativa e documental, utilizou dados coletados por </w:t>
-      </w:r>
-      <w:r>
-        <w:rPr>
-          <w:rFonts w:ascii="Times New Roman" w:hAnsi="Times New Roman" w:cs="Times New Roman" w:eastAsia="Times New Roman"/>
-          <w:i/>
-          <w:sz w:val="24"/>
-        </w:rPr>
-        <w:t xml:space="preserve">web scraping</w:t>
-      </w:r>
-      <w:r>
-        <w:rPr>
-          <w:rFonts w:ascii="Times New Roman" w:hAnsi="Times New Roman" w:cs="Times New Roman" w:eastAsia="Times New Roman"/>
-          <w:sz w:val="24"/>
-        </w:rPr>
-        <w:t xml:space="preserve"> do catálogo da CRV Lagoa em setembro de 2026: 115 touros com avaliação da ANCP e preço válido. O quadro teórico baseou-se na Teoria dos Preços Hedônicos (ROSEN, 1974) e no Random Forest (BREIMAN, 2001)</w:t>
-      </w:r>
-      <w:r>
-        <w:rPr>
-          <w:rFonts w:ascii="Times New Roman" w:hAnsi="Times New Roman" w:cs="Times New Roman" w:eastAsia="Times New Roman"/>
-          <w:i/>
-          <w:sz w:val="24"/>
-        </w:rPr>
-      </w:r>
-      <w:r>
-        <w:rPr>
-          <w:rFonts w:ascii="Times New Roman" w:hAnsi="Times New Roman" w:cs="Times New Roman" w:eastAsia="Times New Roman"/>
-          <w:sz w:val="24"/>
-        </w:rPr>
-        <w:t xml:space="preserve">. A análise combinou </w:t>
-      </w:r>
-      <w:r>
-        <w:rPr>
-          <w:rFonts w:ascii="Times New Roman" w:hAnsi="Times New Roman" w:cs="Times New Roman" w:eastAsia="Times New Roman"/>
-          <w:i/>
-          <w:sz w:val="24"/>
-        </w:rPr>
-        <w:t xml:space="preserve">Random Forest</w:t>
-      </w:r>
-      <w:r>
-        <w:rPr>
-          <w:rFonts w:ascii="Times New Roman" w:hAnsi="Times New Roman" w:cs="Times New Roman" w:eastAsia="Times New Roman"/>
-          <w:sz w:val="24"/>
-        </w:rPr>
-        <w:t>, regressões hedônicas com erros-padrão robustos, critério de Akaike e validação cruzada. As 18 DEPs explicaram pouco do preço; a única significativa em conjunto, o consumo alimentar residual, perdeu significância na forma linear diante dos selos, mas o ágio dos 3% melhores nessa característica persistiu. No modelo final (R² = 28,6% na amostra), foram significativos o selo de fertilidade (+R$ 5,21) e, no limite da significância, o de habilidade materna (+R$ 2,32), e nenhuma linhagem apresentou efeito robusto; fora da amostra, o poder preditivo foi baixo. Conclui-se que a sinalização comercial pesa mais que as provas genéticas no preço do sêmen. Por utilizar apenas dados públicos, a pesquisa não foi submetida ao Comitê de Ética em Pesquisa.</w:t>
+        <w:t xml:space="preserve">: Este trabalho, vinculado ao curso de Especialização em Ciência de Dados do IFTM, na linha de pesquisa Aprendizado de Máquina, insere-se na aplicação da ciência de dados ao agronegócio. Não se sabe quanto o preço do sêmen reflete as provas genéticas dos catálogos. O objetivo geral foi analisar a relação entre as Diferenças Esperadas na Progênie (DEPs), os selos comerciais e as linhagens e o preço da dose de sêmen convencional de touros Nelore. Os objetivos específicos foram ranquear esses atributos pelo Random Forest, estimar seus preços implícitos por regressão hedônica e comparar as três dimensões. A pergunta norteadora foi: em que medida as DEPs influenciam o preço da dose, e qual a contribuição dos selos e das linhagens? Partiu-se da hipótese de que touros com melhores DEPs têm doses mais caras. A pesquisa, quantitativa e documental, utilizou dados coletados por web scraping do catálogo da CRV Lagoa em setembro de 2026: 115 touros com avaliação da ANCP e preço válido. O quadro teórico baseou-se na Teoria dos Preços Hedônicos (ROSEN, 1974) e no Random Forest (BREIMAN, 2001). A análise combinou Random Forest, regressões hedônicas com erros-padrão robustos, critério de Akaike e validação cruzada. As 18 DEPs explicaram pouco do preço; a única significativa em conjunto, o consumo alimentar residual, perdeu significância na forma linear diante dos selos, mas o ágio dos 3% melhores nessa característica persistiu. No modelo final (R² = 28,6% na amostra), foram significativos o selo de fertilidade (+R$ 5,21) e, no limite da significância, o de habilidade materna (+R$ 2,32), e nenhuma linhagem apresentou efeito robusto; fora da amostra, o poder preditivo foi baixo. Conclui-se que a sinalização comercial pesa mais que as provas genéticas no preço do sêmen. Por utilizar apenas dados públicos, a pesquisa não foi submetida ao Comitê de Ética em Pesquisa.</w:t>
       </w:r>
     </w:p>
     <w:p>
@@ -503,22 +444,7 @@
           <w:rFonts w:ascii="Times New Roman" w:hAnsi="Times New Roman" w:cs="Times New Roman" w:eastAsia="Times New Roman"/>
           <w:sz w:val="24"/>
         </w:rPr>
-        <w:t xml:space="preserve"> Aprendizado de máquina; Bovinocultura de corte; Diferença Esperada na Progênie; Preços hedônicos; </w:t>
-      </w:r>
-      <w:r>
-        <w:rPr>
-          <w:rFonts w:ascii="Times New Roman" w:hAnsi="Times New Roman" w:cs="Times New Roman" w:eastAsia="Times New Roman"/>
-          <w:i/>
-          <w:sz w:val="24"/>
-        </w:rPr>
-        <w:t xml:space="preserve">Random Forest</w:t>
-      </w:r>
-      <w:r>
-        <w:rPr>
-          <w:rFonts w:ascii="Times New Roman" w:hAnsi="Times New Roman" w:cs="Times New Roman" w:eastAsia="Times New Roman"/>
-          <w:sz w:val="24"/>
-        </w:rPr>
-        <w:t xml:space="preserve">.</w:t>
+        <w:t xml:space="preserve"> Aprendizado de máquina; Bovinocultura de corte; Diferença Esperada na Progênie; Preços hedônicos; Random Forest.</w:t>
       </w:r>
     </w:p>
     <w:p>
@@ -817,45 +743,7 @@
           <w:vertAlign w:val="baseline"/>
           <w:rtl w:val="0"/>
         </w:rPr>
-        <w:t xml:space="preserve">Investigar essa relação exige analisar conjuntamente dezenas de atributos por touro, o que aproxima o problema da ciência de dados, entendida como a tomada de decisão baseada em dados a partir do tratamento de grandes volumes de dados brutos para transformá-los em informação de valor (AMARAL et al., 2024). Na pecuária de corte, em estudo relatado por Amaral et al. (2024), o </w:t>
-      </w:r>
-      <w:r>
-        <w:rPr>
-          <w:rFonts w:ascii="Times New Roman" w:cs="Times New Roman" w:eastAsia="Times New Roman" w:hAnsi="Times New Roman"/>
-          <w:b w:val="0"/>
-          <w:bCs w:val="0"/>
-          <w:i/>
-          <w:iCs w:val="0"/>
-          <w:smallCaps w:val="0"/>
-          <w:strike w:val="0"/>
-          <w:color w:val="000000"/>
-          <w:sz w:val="24"/>
-          <w:szCs w:val="24"/>
-          <w:u w:val="none"/>
-          <w:shd w:fill="auto" w:val="clear"/>
-          <w:vertAlign w:val="baseline"/>
-          <w:rtl w:val="0"/>
-        </w:rPr>
-        <w:t xml:space="preserve">Random Forest</w:t>
-      </w:r>
-      <w:r>
-        <w:rPr>
-          <w:rFonts w:ascii="Times New Roman" w:cs="Times New Roman" w:eastAsia="Times New Roman" w:hAnsi="Times New Roman"/>
-          <w:b w:val="0"/>
-          <w:bCs w:val="0"/>
-          <w:i w:val="0"/>
-          <w:iCs w:val="0"/>
-          <w:smallCaps w:val="0"/>
-          <w:strike w:val="0"/>
-          <w:color w:val="000000"/>
-          <w:sz w:val="24"/>
-          <w:szCs w:val="24"/>
-          <w:u w:val="none"/>
-          <w:shd w:fill="auto" w:val="clear"/>
-          <w:vertAlign w:val="baseline"/>
-          <w:rtl w:val="0"/>
-        </w:rPr>
-        <w:t xml:space="preserve"> superou a regressão linear múltipla na previsão da produção e da qualidade dos bovinos e permitiu quantificar a importância relativa de cada fator. Esse algoritmo fornece estimativas internas da importância de cada variável (BREIMAN, 2001) e, na avaliação de preços de imóveis, superou os modelos hedônicos em capacidade preditiva, enquanto estes forneceram a evidência estatística que sustenta a interpretação dos resultados (AN et al., 2025). A regressão hedônica, por sua vez, quantifica o preço implícito de cada atributo. A combinação das duas abordagens permite identificar quais provas genéticas e demais atributos dos catálogos se relacionam ao preço do sêmen, aplicação ainda pouco explorada para touros de corte no Brasil. Assim, a pergunta que norteia este estudo é: em que medida as provas genéticas, expressas pelas DEPs, influenciam o preço da dose de sêmen de touros Nelore, e qual a contribuição dos selos comerciais e das linhagens nessa formação de preço?</w:t>
+        <w:t xml:space="preserve">Investigar essa relação exige analisar conjuntamente dezenas de atributos por touro, o que aproxima o problema da ciência de dados, entendida como a tomada de decisão baseada em dados a partir do tratamento de grandes volumes de dados brutos para transformá-los em informação de valor (AMARAL et al., 2024). Na pecuária de corte, em estudo relatado por Amaral et al. (2024), o Random Forest superou a regressão linear múltipla na previsão da produção e da qualidade dos bovinos e permitiu quantificar a importância relativa de cada fator. Esse algoritmo fornece estimativas internas da importância de cada variável (BREIMAN, 2001) e, na avaliação de preços de imóveis, superou os modelos hedônicos em capacidade preditiva, enquanto estes forneceram a evidência estatística que sustenta a interpretação dos resultados (AN et al., 2025). A regressão hedônica, por sua vez, quantifica o preço implícito de cada atributo. A combinação das duas abordagens permite identificar quais provas genéticas e demais atributos dos catálogos se relacionam ao preço do sêmen, aplicação ainda pouco explorada para touros de corte no Brasil. Assim, a pergunta que norteia este estudo é: em que medida as provas genéticas, expressas pelas DEPs, influenciam o preço da dose de sêmen de touros Nelore, e qual a contribuição dos selos comerciais e das linhagens nessa formação de preço?</w:t>
       </w:r>
     </w:p>
     <w:p>
@@ -908,45 +796,7 @@
           <w:vertAlign w:val="baseline"/>
           <w:rtl w:val="0"/>
         </w:rPr>
-        <w:t xml:space="preserve">O objetivo deste estudo foi aplicar técnicas de ciência de dados, combinando o algoritmo de aprendizado de máquina </w:t>
-      </w:r>
-      <w:r>
-        <w:rPr>
-          <w:rFonts w:ascii="Times New Roman" w:cs="Times New Roman" w:eastAsia="Times New Roman" w:hAnsi="Times New Roman"/>
-          <w:b w:val="0"/>
-          <w:bCs w:val="0"/>
-          <w:i/>
-          <w:iCs w:val="0"/>
-          <w:smallCaps w:val="0"/>
-          <w:strike w:val="0"/>
-          <w:color w:val="000000"/>
-          <w:sz w:val="24"/>
-          <w:szCs w:val="24"/>
-          <w:u w:val="none"/>
-          <w:shd w:fill="auto" w:val="clear"/>
-          <w:vertAlign w:val="baseline"/>
-          <w:rtl w:val="0"/>
-        </w:rPr>
-        <w:t xml:space="preserve">Random Forest</w:t>
-      </w:r>
-      <w:r>
-        <w:rPr>
-          <w:rFonts w:ascii="Times New Roman" w:cs="Times New Roman" w:eastAsia="Times New Roman" w:hAnsi="Times New Roman"/>
-          <w:b w:val="0"/>
-          <w:bCs w:val="0"/>
-          <w:i w:val="0"/>
-          <w:iCs w:val="0"/>
-          <w:smallCaps w:val="0"/>
-          <w:strike w:val="0"/>
-          <w:color w:val="000000"/>
-          <w:sz w:val="24"/>
-          <w:szCs w:val="24"/>
-          <w:u w:val="none"/>
-          <w:shd w:fill="auto" w:val="clear"/>
-          <w:vertAlign w:val="baseline"/>
-          <w:rtl w:val="0"/>
-        </w:rPr>
-        <w:t xml:space="preserve"> e modelos de preços hedônicos, para analisar a relação entre as provas genéticas (DEPs da ANCP), os selos comerciais e as linhagens e o preço da dose de sêmen convencional de touros Nelore comercializados pela central CRV Lagoa.</w:t>
+        <w:t>O objetivo deste estudo foi aplicar técnicas de ciência de dados, combinando o algoritmo de aprendizado de máquina Random Forest e modelos de preços hedônicos, para analisar a relação entre as provas genéticas (DEPs da ANCP), os selos comerciais e as linhagens e o preço da dose de sêmen convencional de touros Nelore comercializados pela central CRV Lagoa.</w:t>
       </w:r>
     </w:p>
     <w:p>
@@ -1073,24 +923,7 @@
           <w:sz w:val="24"/>
           <w:lang w:val="pt-BR"/>
         </w:rPr>
-        <w:t xml:space="preserve">Os dados utilizados neste estudo foram extraídos do catálogo comercial digital de reprodutores da raça Nelore disponibilizado pela central de inseminação artificial CRV Lagoa (Sertãozinho, SP). A coleta automatizada dos dados (</w:t>
-      </w:r>
-      <w:r>
-        <w:rPr>
-          <w:rFonts w:ascii="Times New Roman" w:hAnsi="Times New Roman" w:cs="Times New Roman" w:eastAsia="Times New Roman"/>
-          <w:i/>
-          <w:sz w:val="24"/>
-          <w:lang w:val="pt-BR"/>
-        </w:rPr>
-        <w:t xml:space="preserve">web scraping</w:t>
-      </w:r>
-      <w:r>
-        <w:rPr>
-          <w:rFonts w:ascii="Times New Roman" w:hAnsi="Times New Roman" w:cs="Times New Roman" w:eastAsia="Times New Roman"/>
-          <w:sz w:val="24"/>
-          <w:lang w:val="pt-BR"/>
-        </w:rPr>
-        <w:t xml:space="preserve">) foi implementada em linguagem Python (versão 3.11), com as bibliotecas requests e BeautifulSoup, em setembro de 2026, capturando informações fenotípicas, comerciais, genealógicas e avaliações genéticas de cada reprodutor.</w:t>
+        <w:t>Os dados utilizados neste estudo foram extraídos do catálogo comercial digital de reprodutores da raça Nelore disponibilizado pela central de inseminação artificial CRV Lagoa (Sertãozinho, SP). A coleta automatizada dos dados (web scraping) foi implementada em linguagem Python (versão 3.11), com as bibliotecas requests e BeautifulSoup, em setembro de 2026, capturando informações fenotípicas, comerciais, genealógicas e avaliações genéticas de cada reprodutor.</w:t>
       </w:r>
     </w:p>
     <w:p>
@@ -1451,7 +1284,159 @@
           <w:sz w:val="24"/>
           <w:lang w:val="pt-BR"/>
         </w:rPr>
-        <w:t xml:space="preserve">P é vetor dos preços das doses de sêmen convencional dos touros em reais (R$)</w:t>
+        <w:t>P</w:t>
+      </w:r>
+      <w:r>
+        <w:rPr>
+          <w:rFonts w:ascii="Times New Roman" w:hAnsi="Times New Roman" w:cs="Times New Roman" w:eastAsia="Times New Roman"/>
+          <w:sz w:val="24"/>
+          <w:lang w:val="pt-BR"/>
+        </w:rPr>
+        <w:t xml:space="preserve"> </w:t>
+      </w:r>
+      <w:r>
+        <w:rPr>
+          <w:rFonts w:ascii="Times New Roman" w:hAnsi="Times New Roman" w:cs="Times New Roman" w:eastAsia="Times New Roman"/>
+          <w:sz w:val="24"/>
+          <w:lang w:val="pt-BR"/>
+        </w:rPr>
+        <w:t>é</w:t>
+      </w:r>
+      <w:r>
+        <w:rPr>
+          <w:rFonts w:ascii="Times New Roman" w:hAnsi="Times New Roman" w:cs="Times New Roman" w:eastAsia="Times New Roman"/>
+          <w:sz w:val="24"/>
+          <w:lang w:val="pt-BR"/>
+        </w:rPr>
+        <w:t xml:space="preserve"> </w:t>
+      </w:r>
+      <w:r>
+        <w:rPr>
+          <w:rFonts w:ascii="Times New Roman" w:hAnsi="Times New Roman" w:cs="Times New Roman" w:eastAsia="Times New Roman"/>
+          <w:sz w:val="24"/>
+          <w:lang w:val="pt-BR"/>
+        </w:rPr>
+        <w:t>v</w:t>
+      </w:r>
+      <w:r>
+        <w:rPr>
+          <w:rFonts w:ascii="Times New Roman" w:hAnsi="Times New Roman" w:cs="Times New Roman" w:eastAsia="Times New Roman"/>
+          <w:sz w:val="24"/>
+          <w:lang w:val="pt-BR"/>
+        </w:rPr>
+        <w:t>etor d</w:t>
+      </w:r>
+      <w:r>
+        <w:rPr>
+          <w:rFonts w:ascii="Times New Roman" w:hAnsi="Times New Roman" w:cs="Times New Roman" w:eastAsia="Times New Roman"/>
+          <w:sz w:val="24"/>
+          <w:lang w:val="pt-BR"/>
+        </w:rPr>
+        <w:t>os</w:t>
+      </w:r>
+      <w:r>
+        <w:rPr>
+          <w:rFonts w:ascii="Times New Roman" w:hAnsi="Times New Roman" w:cs="Times New Roman" w:eastAsia="Times New Roman"/>
+          <w:sz w:val="24"/>
+          <w:lang w:val="pt-BR"/>
+        </w:rPr>
+        <w:t xml:space="preserve"> p</w:t>
+      </w:r>
+      <w:r>
+        <w:rPr>
+          <w:rFonts w:ascii="Times New Roman" w:hAnsi="Times New Roman" w:cs="Times New Roman" w:eastAsia="Times New Roman"/>
+          <w:sz w:val="24"/>
+          <w:lang w:val="pt-BR"/>
+        </w:rPr>
+        <w:t>reço</w:t>
+      </w:r>
+      <w:r>
+        <w:rPr>
+          <w:rFonts w:ascii="Times New Roman" w:hAnsi="Times New Roman" w:cs="Times New Roman" w:eastAsia="Times New Roman"/>
+          <w:sz w:val="24"/>
+          <w:lang w:val="pt-BR"/>
+        </w:rPr>
+        <w:t>s</w:t>
+      </w:r>
+      <w:r>
+        <w:rPr>
+          <w:rFonts w:ascii="Times New Roman" w:hAnsi="Times New Roman" w:cs="Times New Roman" w:eastAsia="Times New Roman"/>
+          <w:sz w:val="24"/>
+          <w:lang w:val="pt-BR"/>
+        </w:rPr>
+        <w:t xml:space="preserve"> da</w:t>
+      </w:r>
+      <w:r>
+        <w:rPr>
+          <w:rFonts w:ascii="Times New Roman" w:hAnsi="Times New Roman" w:cs="Times New Roman" w:eastAsia="Times New Roman"/>
+          <w:sz w:val="24"/>
+          <w:lang w:val="pt-BR"/>
+        </w:rPr>
+        <w:t>s</w:t>
+      </w:r>
+      <w:r>
+        <w:rPr>
+          <w:rFonts w:ascii="Times New Roman" w:hAnsi="Times New Roman" w:cs="Times New Roman" w:eastAsia="Times New Roman"/>
+          <w:sz w:val="24"/>
+          <w:lang w:val="pt-BR"/>
+        </w:rPr>
+        <w:t xml:space="preserve"> dose</w:t>
+      </w:r>
+      <w:r>
+        <w:rPr>
+          <w:rFonts w:ascii="Times New Roman" w:hAnsi="Times New Roman" w:cs="Times New Roman" w:eastAsia="Times New Roman"/>
+          <w:sz w:val="24"/>
+          <w:lang w:val="pt-BR"/>
+        </w:rPr>
+        <w:t>s</w:t>
+      </w:r>
+      <w:r>
+        <w:rPr>
+          <w:rFonts w:ascii="Times New Roman" w:hAnsi="Times New Roman" w:cs="Times New Roman" w:eastAsia="Times New Roman"/>
+          <w:sz w:val="24"/>
+          <w:lang w:val="pt-BR"/>
+        </w:rPr>
+        <w:t xml:space="preserve"> de sêmen convencional</w:t>
+      </w:r>
+      <w:r>
+        <w:rPr>
+          <w:rFonts w:ascii="Times New Roman" w:hAnsi="Times New Roman" w:cs="Times New Roman" w:eastAsia="Times New Roman"/>
+          <w:sz w:val="24"/>
+          <w:lang w:val="pt-BR"/>
+        </w:rPr>
+        <w:t xml:space="preserve"> </w:t>
+      </w:r>
+      <w:r>
+        <w:rPr>
+          <w:rFonts w:ascii="Times New Roman" w:hAnsi="Times New Roman" w:cs="Times New Roman" w:eastAsia="Times New Roman"/>
+          <w:sz w:val="24"/>
+          <w:lang w:val="pt-BR"/>
+        </w:rPr>
+        <w:t xml:space="preserve">dos touros em reais</w:t>
+      </w:r>
+      <w:r>
+        <w:rPr>
+          <w:rFonts w:ascii="Times New Roman" w:hAnsi="Times New Roman" w:cs="Times New Roman" w:eastAsia="Times New Roman"/>
+          <w:sz w:val="24"/>
+          <w:lang w:val="pt-BR"/>
+        </w:rPr>
+        <w:t xml:space="preserve"/>
+      </w:r>
+      <w:r>
+        <w:rPr>
+          <w:rFonts w:ascii="Times New Roman" w:hAnsi="Times New Roman" w:cs="Times New Roman" w:eastAsia="Times New Roman"/>
+          <w:sz w:val="24"/>
+          <w:lang w:val="pt-BR"/>
+        </w:rPr>
+        <w:t xml:space="preserve"/>
+      </w:r>
+      <w:r>
+        <w:rPr>
+          <w:rFonts w:ascii="Times New Roman" w:hAnsi="Times New Roman" w:cs="Times New Roman" w:eastAsia="Times New Roman"/>
+          <w:sz w:val="24"/>
+          <w:lang w:val="pt-BR"/>
+        </w:rPr>
+        <w:t xml:space="preserve"> (R$)</w:t>
       </w:r>
     </w:p>
     <w:p>
@@ -1514,7 +1499,119 @@
           <w:sz w:val="24"/>
           <w:lang w:val="pt-BR"/>
         </w:rPr>
-        <w:t xml:space="preserve">é a matriz dos valores de ranque das DEP dos touros para as 18 características consideradas no estudo, expressos em percentis (%).</w:t>
+        <w:t xml:space="preserve">é a matriz </w:t>
+      </w:r>
+      <w:r>
+        <w:rPr>
+          <w:rFonts w:ascii="Times New Roman" w:hAnsi="Times New Roman" w:cs="Times New Roman" w:eastAsia="Times New Roman"/>
+          <w:sz w:val="24"/>
+          <w:lang w:val="pt-BR"/>
+        </w:rPr>
+        <w:t>d</w:t>
+      </w:r>
+      <w:r>
+        <w:rPr>
+          <w:rFonts w:ascii="Times New Roman" w:hAnsi="Times New Roman" w:cs="Times New Roman" w:eastAsia="Times New Roman"/>
+          <w:sz w:val="24"/>
+          <w:lang w:val="pt-BR"/>
+        </w:rPr>
+        <w:t>os</w:t>
+      </w:r>
+      <w:r>
+        <w:rPr>
+          <w:rFonts w:ascii="Times New Roman" w:hAnsi="Times New Roman" w:cs="Times New Roman" w:eastAsia="Times New Roman"/>
+          <w:sz w:val="24"/>
+          <w:lang w:val="pt-BR"/>
+        </w:rPr>
+        <w:t xml:space="preserve"> valor</w:t>
+      </w:r>
+      <w:r>
+        <w:rPr>
+          <w:rFonts w:ascii="Times New Roman" w:hAnsi="Times New Roman" w:cs="Times New Roman" w:eastAsia="Times New Roman"/>
+          <w:sz w:val="24"/>
+          <w:lang w:val="pt-BR"/>
+        </w:rPr>
+        <w:t xml:space="preserve">es </w:t>
+      </w:r>
+      <w:r>
+        <w:rPr>
+          <w:rFonts w:ascii="Times New Roman" w:hAnsi="Times New Roman" w:cs="Times New Roman" w:eastAsia="Times New Roman"/>
+          <w:sz w:val="24"/>
+          <w:lang w:val="pt-BR"/>
+        </w:rPr>
+        <w:t>de ranque d</w:t>
+      </w:r>
+      <w:r>
+        <w:rPr>
+          <w:rFonts w:ascii="Times New Roman" w:hAnsi="Times New Roman" w:cs="Times New Roman" w:eastAsia="Times New Roman"/>
+          <w:sz w:val="24"/>
+          <w:lang w:val="pt-BR"/>
+        </w:rPr>
+        <w:t xml:space="preserve">as DEP </w:t>
+      </w:r>
+      <w:r>
+        <w:rPr>
+          <w:rFonts w:ascii="Times New Roman" w:hAnsi="Times New Roman" w:cs="Times New Roman" w:eastAsia="Times New Roman"/>
+          <w:sz w:val="24"/>
+          <w:lang w:val="pt-BR"/>
+        </w:rPr>
+        <w:t>dos</w:t>
+      </w:r>
+      <w:r>
+        <w:rPr>
+          <w:rFonts w:ascii="Times New Roman" w:hAnsi="Times New Roman" w:cs="Times New Roman" w:eastAsia="Times New Roman"/>
+          <w:sz w:val="24"/>
+          <w:lang w:val="pt-BR"/>
+        </w:rPr>
+        <w:t xml:space="preserve"> touro</w:t>
+      </w:r>
+      <w:r>
+        <w:rPr>
+          <w:rFonts w:ascii="Times New Roman" w:hAnsi="Times New Roman" w:cs="Times New Roman" w:eastAsia="Times New Roman"/>
+          <w:sz w:val="24"/>
+          <w:lang w:val="pt-BR"/>
+        </w:rPr>
+        <w:t>s</w:t>
+      </w:r>
+      <w:r>
+        <w:rPr>
+          <w:rFonts w:ascii="Times New Roman" w:hAnsi="Times New Roman" w:cs="Times New Roman" w:eastAsia="Times New Roman"/>
+          <w:sz w:val="24"/>
+          <w:lang w:val="pt-BR"/>
+        </w:rPr>
+        <w:t xml:space="preserve"> para</w:t>
+      </w:r>
+      <w:r>
+        <w:rPr>
+          <w:rFonts w:ascii="Times New Roman" w:hAnsi="Times New Roman" w:cs="Times New Roman" w:eastAsia="Times New Roman"/>
+          <w:sz w:val="24"/>
+          <w:lang w:val="pt-BR"/>
+        </w:rPr>
+        <w:t xml:space="preserve"> a</w:t>
+      </w:r>
+      <w:r>
+        <w:rPr>
+          <w:rFonts w:ascii="Times New Roman" w:hAnsi="Times New Roman" w:cs="Times New Roman" w:eastAsia="Times New Roman"/>
+          <w:sz w:val="24"/>
+          <w:lang w:val="pt-BR"/>
+        </w:rPr>
+        <w:t>s 18 características consideradas no estudo,</w:t>
+      </w:r>
+      <w:r>
+        <w:rPr>
+          <w:rFonts w:ascii="Times New Roman" w:hAnsi="Times New Roman" w:cs="Times New Roman" w:eastAsia="Times New Roman"/>
+          <w:sz w:val="24"/>
+          <w:lang w:val="pt-BR"/>
+        </w:rPr>
+        <w:t xml:space="preserve"> expressos em percentis (%)</w:t>
+      </w:r>
+      <w:r>
+        <w:rPr>
+          <w:rFonts w:ascii="Times New Roman" w:hAnsi="Times New Roman" w:cs="Times New Roman" w:eastAsia="Times New Roman"/>
+          <w:sz w:val="24"/>
+          <w:lang w:val="pt-BR"/>
+        </w:rPr>
+        <w:t>.</w:t>
       </w:r>
     </w:p>
     <w:p>
@@ -1562,7 +1659,39 @@
           <w:sz w:val="24"/>
           <w:lang w:val="pt-BR"/>
         </w:rPr>
-        <w:t xml:space="preserve"> é a matriz de incidência dos touros para os 6 selos considerados no estudo</w:t>
+        <w:t xml:space="preserve"> é a matriz de incidência</w:t>
+      </w:r>
+      <w:r>
+        <w:rPr>
+          <w:rFonts w:ascii="Times New Roman" w:hAnsi="Times New Roman" w:cs="Times New Roman" w:eastAsia="Times New Roman"/>
+          <w:sz w:val="24"/>
+          <w:lang w:val="pt-BR"/>
+        </w:rPr>
+        <w:t xml:space="preserve"> </w:t>
+      </w:r>
+      <w:r>
+        <w:rPr>
+          <w:rFonts w:ascii="Times New Roman" w:hAnsi="Times New Roman" w:cs="Times New Roman" w:eastAsia="Times New Roman"/>
+          <w:sz w:val="24"/>
+          <w:lang w:val="pt-BR"/>
+        </w:rPr>
+        <w:t xml:space="preserve">dos touros </w:t>
+      </w:r>
+      <w:r>
+        <w:rPr>
+          <w:rFonts w:ascii="Times New Roman" w:hAnsi="Times New Roman" w:cs="Times New Roman" w:eastAsia="Times New Roman"/>
+          <w:sz w:val="24"/>
+          <w:lang w:val="pt-BR"/>
+        </w:rPr>
+        <w:t>para os 6 selos</w:t>
+      </w:r>
+      <w:r>
+        <w:rPr>
+          <w:rFonts w:ascii="Times New Roman" w:hAnsi="Times New Roman" w:cs="Times New Roman" w:eastAsia="Times New Roman"/>
+          <w:sz w:val="24"/>
+          <w:lang w:val="pt-BR"/>
+        </w:rPr>
+        <w:t xml:space="preserve"> considerados no estudo</w:t>
       </w:r>
     </w:p>
     <w:p>
@@ -1625,7 +1754,31 @@
           <w:sz w:val="24"/>
           <w:lang w:val="pt-BR"/>
         </w:rPr>
-        <w:t xml:space="preserve">é a matriz de incidência dos touros para as 7 linhagens consideradas no estudo.</w:t>
+        <w:t>é a matriz de incidência</w:t>
+      </w:r>
+      <w:r>
+        <w:rPr>
+          <w:rFonts w:ascii="Times New Roman" w:hAnsi="Times New Roman" w:cs="Times New Roman" w:eastAsia="Times New Roman"/>
+          <w:sz w:val="24"/>
+          <w:lang w:val="pt-BR"/>
+        </w:rPr>
+        <w:t xml:space="preserve"> </w:t>
+      </w:r>
+      <w:r>
+        <w:rPr>
+          <w:rFonts w:ascii="Times New Roman" w:hAnsi="Times New Roman" w:cs="Times New Roman" w:eastAsia="Times New Roman"/>
+          <w:sz w:val="24"/>
+          <w:lang w:val="pt-BR"/>
+        </w:rPr>
+        <w:t>dos touros</w:t>
+      </w:r>
+      <w:r>
+        <w:rPr>
+          <w:rFonts w:ascii="Times New Roman" w:hAnsi="Times New Roman" w:cs="Times New Roman" w:eastAsia="Times New Roman"/>
+          <w:sz w:val="24"/>
+          <w:lang w:val="pt-BR"/>
+        </w:rPr>
+        <w:t xml:space="preserve"> para as 7 linhagens consideradas no estudo.</w:t>
       </w:r>
     </w:p>
     <w:p>
@@ -1667,24 +1820,7 @@
           <w:sz w:val="24"/>
           <w:lang w:val="pt-BR"/>
         </w:rPr>
-        <w:t xml:space="preserve">As 18 características cujos percentis das DEPs foram considerados neste estudo, agrupadas, em sua maioria, conforme a ANCP (SILVEIRA, 2022), foram: de Reprodução e Fertilidade, Probabilidade de Parto Precoce (3P_TOP), Idade ao Primeiro Parto (IPP_TOP), Perímetro Escrotal aos 450 dias (PE450_TOP), Produtividade Acumulada (PAC_TOP) e Probabilidade de Permanência no Rebanho, ou </w:t>
-      </w:r>
-      <w:r>
-        <w:rPr>
-          <w:rFonts w:ascii="Times New Roman" w:hAnsi="Times New Roman" w:cs="Times New Roman" w:eastAsia="Times New Roman"/>
-          <w:i/>
-          <w:sz w:val="24"/>
-          <w:lang w:val="pt-BR"/>
-        </w:rPr>
-        <w:t xml:space="preserve">stayability</w:t>
-      </w:r>
-      <w:r>
-        <w:rPr>
-          <w:rFonts w:ascii="Times New Roman" w:hAnsi="Times New Roman" w:cs="Times New Roman" w:eastAsia="Times New Roman"/>
-          <w:sz w:val="24"/>
-          <w:lang w:val="pt-BR"/>
-        </w:rPr>
-        <w:t xml:space="preserve"> (STAY_TOP); de Crescimento, Peso ao Nascer (PN_TOP), Peso aos 210, 365 e 450 dias (P210_TOP, P365_TOP e P450_TOP) e Habilidade Maternal para peso aos 120 e 210 dias (MP120_TOP e MP210_TOP); de Produtividade e Qualidade da Carne, Área de Olho de Lombo (AOL_TOP), Acabamento de Carcaça (ACAB_TOP) e Marmoreio (MARM_TOP); de Eficiência Alimentar, Consumo Alimentar Residual (CAR_TOP); além da Facilidade de Parto (FPP_TOP) e do tamanho corporal (FRAME_TOP), também apresentados no catálogo, e do índice Mérito Genético Total Econômico (MGTe_TOP).</w:t>
+        <w:t xml:space="preserve">As 18 características cujos percentis das DEPs foram considerados neste estudo, agrupadas, em sua maioria, conforme a ANCP (SILVEIRA, 2022), foram: de Reprodução e Fertilidade, Probabilidade de Parto Precoce (3P_TOP), Idade ao Primeiro Parto (IPP_TOP), Perímetro Escrotal aos 450 dias (PE450_TOP), Produtividade Acumulada (PAC_TOP) e Probabilidade de Permanência no Rebanho, ou stayability (STAY_TOP); de Crescimento, Peso ao Nascer (PN_TOP), Peso aos 210, 365 e 450 dias (P210_TOP, P365_TOP e P450_TOP) e Habilidade Maternal para peso aos 120 e 210 dias (MP120_TOP e MP210_TOP); de Produtividade e Qualidade da Carne, Área de Olho de Lombo (AOL_TOP), Acabamento de Carcaça (ACAB_TOP) e Marmoreio (MARM_TOP); de Eficiência Alimentar, Consumo Alimentar Residual (CAR_TOP); além da Facilidade de Parto (FPP_TOP) e do tamanho corporal (FRAME_TOP), também apresentados no catálogo, e do índice Mérito Genético Total Econômico (MGTe_TOP).</w:t>
       </w:r>
     </w:p>
     <w:p>
@@ -1727,7 +1863,23 @@
           <w:lang w:val="pt-BR"/>
         </w:rPr>
         <w:lastRenderedPageBreak/>
-        <w:t xml:space="preserve">O uso do ranking percentil (TOP %) permitiu a padronização dimensional das variáveis em escala comparável de 0,1% a 100%, em que valores menores indicam superioridade genética no catálogo.</w:t>
+        <w:t>O uso do ranking percentil (TOP</w:t>
+      </w:r>
+      <w:r>
+        <w:rPr>
+          <w:rFonts w:ascii="Times New Roman" w:hAnsi="Times New Roman" w:cs="Times New Roman" w:eastAsia="Times New Roman"/>
+          <w:sz w:val="24"/>
+          <w:lang w:val="pt-BR"/>
+        </w:rPr>
+        <w:t xml:space="preserve"> </w:t>
+      </w:r>
+      <w:r>
+        <w:rPr>
+          <w:rFonts w:ascii="Times New Roman" w:hAnsi="Times New Roman" w:cs="Times New Roman" w:eastAsia="Times New Roman"/>
+          <w:sz w:val="24"/>
+          <w:lang w:val="pt-BR"/>
+        </w:rPr>
+        <w:t>%) permitiu a padronização dimensional das variáveis em escala comparável de 0,1% a 100%, em que valores menores indicam superioridade genética no catálogo.</w:t>
       </w:r>
     </w:p>
     <w:p>
@@ -1769,7 +1921,71 @@
           <w:sz w:val="24"/>
           <w:lang w:val="pt-BR"/>
         </w:rPr>
-        <w:t xml:space="preserve">Na avaliação da influência das certificações no valor do sêmen, foram empregados selos de certificação concedidos pela central e programas parceiros à medida que os touros possuíam o respectivo mérito genético. </w:t>
+        <w:t xml:space="preserve">Na avaliação da influência das certificações no valor do sêmen, </w:t>
+      </w:r>
+      <w:r>
+        <w:rPr>
+          <w:rFonts w:ascii="Times New Roman" w:hAnsi="Times New Roman" w:cs="Times New Roman" w:eastAsia="Times New Roman"/>
+          <w:sz w:val="24"/>
+          <w:lang w:val="pt-BR"/>
+        </w:rPr>
+        <w:t xml:space="preserve">foram empregados selos</w:t>
+      </w:r>
+      <w:r>
+        <w:rPr>
+          <w:rFonts w:ascii="Times New Roman" w:hAnsi="Times New Roman" w:cs="Times New Roman" w:eastAsia="Times New Roman"/>
+          <w:sz w:val="24"/>
+          <w:lang w:val="pt-BR"/>
+        </w:rPr>
+        <w:t xml:space="preserve"> de certificação</w:t>
+      </w:r>
+      <w:r>
+        <w:rPr>
+          <w:rFonts w:ascii="Times New Roman" w:hAnsi="Times New Roman" w:cs="Times New Roman" w:eastAsia="Times New Roman"/>
+          <w:sz w:val="24"/>
+          <w:lang w:val="pt-BR"/>
+        </w:rPr>
+        <w:t xml:space="preserve"> </w:t>
+      </w:r>
+      <w:r>
+        <w:rPr>
+          <w:rFonts w:ascii="Times New Roman" w:hAnsi="Times New Roman" w:cs="Times New Roman" w:eastAsia="Times New Roman"/>
+          <w:sz w:val="24"/>
+          <w:lang w:val="pt-BR"/>
+        </w:rPr>
+        <w:t>concedidos pela central e programas parceiros</w:t>
+      </w:r>
+      <w:r>
+        <w:rPr>
+          <w:rFonts w:ascii="Times New Roman" w:hAnsi="Times New Roman" w:cs="Times New Roman" w:eastAsia="Times New Roman"/>
+          <w:sz w:val="24"/>
+          <w:lang w:val="pt-BR"/>
+        </w:rPr>
+        <w:t xml:space="preserve"> </w:t>
+      </w:r>
+      <w:r>
+        <w:rPr>
+          <w:rFonts w:ascii="Times New Roman" w:hAnsi="Times New Roman" w:cs="Times New Roman" w:eastAsia="Times New Roman"/>
+          <w:sz w:val="24"/>
+          <w:lang w:val="pt-BR"/>
+        </w:rPr>
+        <w:t>à medida que os touros possuíam o</w:t>
+      </w:r>
+      <w:r>
+        <w:rPr>
+          <w:rFonts w:ascii="Times New Roman" w:hAnsi="Times New Roman" w:cs="Times New Roman" w:eastAsia="Times New Roman"/>
+          <w:sz w:val="24"/>
+          <w:lang w:val="pt-BR"/>
+        </w:rPr>
+        <w:t xml:space="preserve"> respectivo</w:t>
+      </w:r>
+      <w:r>
+        <w:rPr>
+          <w:rFonts w:ascii="Times New Roman" w:hAnsi="Times New Roman" w:cs="Times New Roman" w:eastAsia="Times New Roman"/>
+          <w:sz w:val="24"/>
+          <w:lang w:val="pt-BR"/>
+        </w:rPr>
+        <w:t xml:space="preserve"> mérito genético. </w:t>
       </w:r>
     </w:p>
     <w:p>
@@ -1832,7 +2048,95 @@
           <w:sz w:val="24"/>
           <w:lang w:val="pt-BR"/>
         </w:rPr>
-        <w:t xml:space="preserve">O SELO_IFERT, que certificava os touros como superiores para o Índice de Fertilidade.</w:t>
+        <w:t xml:space="preserve">O SELO_IFERT, que certificava</w:t>
+      </w:r>
+      <w:r>
+        <w:rPr>
+          <w:rFonts w:ascii="Times New Roman" w:hAnsi="Times New Roman" w:cs="Times New Roman" w:eastAsia="Times New Roman"/>
+          <w:sz w:val="24"/>
+          <w:lang w:val="pt-BR"/>
+        </w:rPr>
+        <w:t xml:space="preserve"/>
+      </w:r>
+      <w:r>
+        <w:rPr>
+          <w:rFonts w:ascii="Times New Roman" w:hAnsi="Times New Roman" w:cs="Times New Roman" w:eastAsia="Times New Roman"/>
+          <w:sz w:val="24"/>
+          <w:lang w:val="pt-BR"/>
+        </w:rPr>
+        <w:t xml:space="preserve"/>
+      </w:r>
+      <w:r>
+        <w:rPr>
+          <w:rFonts w:ascii="Times New Roman" w:hAnsi="Times New Roman" w:cs="Times New Roman" w:eastAsia="Times New Roman"/>
+          <w:sz w:val="24"/>
+          <w:lang w:val="pt-BR"/>
+        </w:rPr>
+        <w:t xml:space="preserve"/>
+      </w:r>
+      <w:r>
+        <w:rPr>
+          <w:rFonts w:ascii="Times New Roman" w:hAnsi="Times New Roman" w:cs="Times New Roman" w:eastAsia="Times New Roman"/>
+          <w:sz w:val="24"/>
+          <w:lang w:val="pt-BR"/>
+        </w:rPr>
+        <w:t xml:space="preserve"> os touros </w:t>
+      </w:r>
+      <w:r>
+        <w:rPr>
+          <w:rFonts w:ascii="Times New Roman" w:hAnsi="Times New Roman" w:cs="Times New Roman" w:eastAsia="Times New Roman"/>
+          <w:sz w:val="24"/>
+          <w:lang w:val="pt-BR"/>
+        </w:rPr>
+        <w:t>como</w:t>
+      </w:r>
+      <w:r>
+        <w:rPr>
+          <w:rFonts w:ascii="Times New Roman" w:hAnsi="Times New Roman" w:cs="Times New Roman" w:eastAsia="Times New Roman"/>
+          <w:sz w:val="24"/>
+          <w:lang w:val="pt-BR"/>
+        </w:rPr>
+        <w:t xml:space="preserve"> superiores </w:t>
+      </w:r>
+      <w:r>
+        <w:rPr>
+          <w:rFonts w:ascii="Times New Roman" w:hAnsi="Times New Roman" w:cs="Times New Roman" w:eastAsia="Times New Roman"/>
+          <w:sz w:val="24"/>
+          <w:lang w:val="pt-BR"/>
+        </w:rPr>
+        <w:t xml:space="preserve">para </w:t>
+      </w:r>
+      <w:r>
+        <w:rPr>
+          <w:rFonts w:ascii="Times New Roman" w:hAnsi="Times New Roman" w:cs="Times New Roman" w:eastAsia="Times New Roman"/>
+          <w:sz w:val="24"/>
+          <w:lang w:val="pt-BR"/>
+        </w:rPr>
+        <w:t>o</w:t>
+      </w:r>
+      <w:r>
+        <w:rPr>
+          <w:rFonts w:ascii="Times New Roman" w:hAnsi="Times New Roman" w:cs="Times New Roman" w:eastAsia="Times New Roman"/>
+          <w:sz w:val="24"/>
+          <w:lang w:val="pt-BR"/>
+        </w:rPr>
+        <w:t xml:space="preserve"> </w:t>
+      </w:r>
+      <w:r>
+        <w:rPr>
+          <w:rFonts w:ascii="Times New Roman" w:hAnsi="Times New Roman" w:cs="Times New Roman" w:eastAsia="Times New Roman"/>
+          <w:sz w:val="24"/>
+          <w:lang w:val="pt-BR"/>
+        </w:rPr>
+        <w:t>Índice de Fertilidade</w:t>
+      </w:r>
+      <w:r>
+        <w:rPr>
+          <w:rFonts w:ascii="Times New Roman" w:hAnsi="Times New Roman" w:cs="Times New Roman" w:eastAsia="Times New Roman"/>
+          <w:sz w:val="24"/>
+          <w:lang w:val="pt-BR"/>
+        </w:rPr>
+        <w:t xml:space="preserve">.</w:t>
       </w:r>
     </w:p>
     <w:p>
@@ -1853,7 +2157,71 @@
           <w:sz w:val="24"/>
           <w:lang w:val="pt-BR"/>
         </w:rPr>
-        <w:t xml:space="preserve">O SELO_MATERNAL, que certificava quanto a aptidão para produção de fêmeas de reposição.</w:t>
+        <w:t>O</w:t>
+      </w:r>
+      <w:r>
+        <w:rPr>
+          <w:rFonts w:ascii="Times New Roman" w:hAnsi="Times New Roman" w:cs="Times New Roman" w:eastAsia="Times New Roman"/>
+          <w:sz w:val="24"/>
+          <w:lang w:val="pt-BR"/>
+        </w:rPr>
+        <w:t xml:space="preserve"> SELO_MATERNAL</w:t>
+      </w:r>
+      <w:r>
+        <w:rPr>
+          <w:rFonts w:ascii="Times New Roman" w:hAnsi="Times New Roman" w:cs="Times New Roman" w:eastAsia="Times New Roman"/>
+          <w:sz w:val="24"/>
+          <w:lang w:val="pt-BR"/>
+        </w:rPr>
+        <w:t>, que</w:t>
+      </w:r>
+      <w:r>
+        <w:rPr>
+          <w:rFonts w:ascii="Times New Roman" w:hAnsi="Times New Roman" w:cs="Times New Roman" w:eastAsia="Times New Roman"/>
+          <w:sz w:val="24"/>
+          <w:lang w:val="pt-BR"/>
+        </w:rPr>
+        <w:t xml:space="preserve"> </w:t>
+      </w:r>
+      <w:r>
+        <w:rPr>
+          <w:rFonts w:ascii="Times New Roman" w:hAnsi="Times New Roman" w:cs="Times New Roman" w:eastAsia="Times New Roman"/>
+          <w:sz w:val="24"/>
+          <w:lang w:val="pt-BR"/>
+        </w:rPr>
+        <w:t>certificava</w:t>
+      </w:r>
+      <w:r>
+        <w:rPr>
+          <w:rFonts w:ascii="Times New Roman" w:hAnsi="Times New Roman" w:cs="Times New Roman" w:eastAsia="Times New Roman"/>
+          <w:sz w:val="24"/>
+          <w:lang w:val="pt-BR"/>
+        </w:rPr>
+        <w:t xml:space="preserve"> quanto a a</w:t>
+      </w:r>
+      <w:r>
+        <w:rPr>
+          <w:rFonts w:ascii="Times New Roman" w:hAnsi="Times New Roman" w:cs="Times New Roman" w:eastAsia="Times New Roman"/>
+          <w:sz w:val="24"/>
+          <w:lang w:val="pt-BR"/>
+        </w:rPr>
+        <w:t>ptidão para produção de fêmeas de reposição</w:t>
+      </w:r>
+      <w:r>
+        <w:rPr>
+          <w:rFonts w:ascii="Times New Roman" w:hAnsi="Times New Roman" w:cs="Times New Roman" w:eastAsia="Times New Roman"/>
+          <w:sz w:val="24"/>
+          <w:lang w:val="pt-BR"/>
+        </w:rPr>
+        <w:t xml:space="preserve">.</w:t>
+      </w:r>
+      <w:r>
+        <w:rPr>
+          <w:rFonts w:ascii="Times New Roman" w:hAnsi="Times New Roman" w:cs="Times New Roman" w:eastAsia="Times New Roman"/>
+          <w:sz w:val="24"/>
+          <w:lang w:val="pt-BR"/>
+        </w:rPr>
+        <w:t xml:space="preserve"/>
       </w:r>
     </w:p>
     <w:p>
@@ -1874,7 +2242,95 @@
           <w:sz w:val="24"/>
           <w:lang w:val="pt-BR"/>
         </w:rPr>
-        <w:t xml:space="preserve">O SELO_CAR, que certificava quanto a eficiência alimentar por meio do critério do Consumo Alimentar Residual.</w:t>
+        <w:t xml:space="preserve">O SELO_CAR, que certificava</w:t>
+      </w:r>
+      <w:r>
+        <w:rPr>
+          <w:rFonts w:ascii="Times New Roman" w:hAnsi="Times New Roman" w:cs="Times New Roman" w:eastAsia="Times New Roman"/>
+          <w:sz w:val="24"/>
+          <w:lang w:val="pt-BR"/>
+        </w:rPr>
+        <w:t xml:space="preserve"/>
+      </w:r>
+      <w:r>
+        <w:rPr>
+          <w:rFonts w:ascii="Times New Roman" w:hAnsi="Times New Roman" w:cs="Times New Roman" w:eastAsia="Times New Roman"/>
+          <w:sz w:val="24"/>
+          <w:lang w:val="pt-BR"/>
+        </w:rPr>
+        <w:t xml:space="preserve"/>
+      </w:r>
+      <w:r>
+        <w:rPr>
+          <w:rFonts w:ascii="Times New Roman" w:hAnsi="Times New Roman" w:cs="Times New Roman" w:eastAsia="Times New Roman"/>
+          <w:sz w:val="24"/>
+          <w:lang w:val="pt-BR"/>
+        </w:rPr>
+        <w:t xml:space="preserve"/>
+      </w:r>
+      <w:r>
+        <w:rPr>
+          <w:rFonts w:ascii="Times New Roman" w:hAnsi="Times New Roman" w:cs="Times New Roman" w:eastAsia="Times New Roman"/>
+          <w:sz w:val="24"/>
+          <w:lang w:val="pt-BR"/>
+        </w:rPr>
+        <w:t xml:space="preserve"/>
+      </w:r>
+      <w:r>
+        <w:rPr>
+          <w:rFonts w:ascii="Times New Roman" w:hAnsi="Times New Roman" w:cs="Times New Roman" w:eastAsia="Times New Roman"/>
+          <w:sz w:val="24"/>
+          <w:lang w:val="pt-BR"/>
+        </w:rPr>
+        <w:t xml:space="preserve"> quanto a</w:t>
+      </w:r>
+      <w:r>
+        <w:rPr>
+          <w:rFonts w:ascii="Times New Roman" w:hAnsi="Times New Roman" w:cs="Times New Roman" w:eastAsia="Times New Roman"/>
+          <w:sz w:val="24"/>
+          <w:lang w:val="pt-BR"/>
+        </w:rPr>
+        <w:t xml:space="preserve"> eficiência alimentar </w:t>
+      </w:r>
+      <w:r>
+        <w:rPr>
+          <w:rFonts w:ascii="Times New Roman" w:hAnsi="Times New Roman" w:cs="Times New Roman" w:eastAsia="Times New Roman"/>
+          <w:sz w:val="24"/>
+          <w:lang w:val="pt-BR"/>
+        </w:rPr>
+        <w:t>p</w:t>
+      </w:r>
+      <w:r>
+        <w:rPr>
+          <w:rFonts w:ascii="Times New Roman" w:hAnsi="Times New Roman" w:cs="Times New Roman" w:eastAsia="Times New Roman"/>
+          <w:sz w:val="24"/>
+          <w:lang w:val="pt-BR"/>
+        </w:rPr>
+        <w:t>or meio do critério do</w:t>
+      </w:r>
+      <w:r>
+        <w:rPr>
+          <w:rFonts w:ascii="Times New Roman" w:hAnsi="Times New Roman" w:cs="Times New Roman" w:eastAsia="Times New Roman"/>
+          <w:sz w:val="24"/>
+          <w:lang w:val="pt-BR"/>
+        </w:rPr>
+        <w:t xml:space="preserve"> Consumo Alimentar R</w:t>
+      </w:r>
+      <w:r>
+        <w:rPr>
+          <w:rFonts w:ascii="Times New Roman" w:hAnsi="Times New Roman" w:cs="Times New Roman" w:eastAsia="Times New Roman"/>
+          <w:sz w:val="24"/>
+          <w:lang w:val="pt-BR"/>
+        </w:rPr>
+        <w:t>esidual</w:t>
+      </w:r>
+      <w:r>
+        <w:rPr>
+          <w:rFonts w:ascii="Times New Roman" w:hAnsi="Times New Roman" w:cs="Times New Roman" w:eastAsia="Times New Roman"/>
+          <w:sz w:val="24"/>
+          <w:lang w:val="pt-BR"/>
+        </w:rPr>
+        <w:t xml:space="preserve">.</w:t>
       </w:r>
     </w:p>
     <w:p>
@@ -1937,7 +2393,7 @@
           <w:sz w:val="24"/>
           <w:lang w:val="pt-BR"/>
         </w:rPr>
-        <w:t>O SELO_RP_ANCP, que identificava os touros aprovados no Programa de Reprodução Programada (RP) da ANCP, teste de progênie criado em 1995 no qual os touros jovens passam por avaliação genética e vistoria técnica (REPRODUÇÃO [...], 2025).</w:t>
+        <w:t xml:space="preserve">O SELO_RP_ANCP, que identificava os touros aprovados no Programa de Reprodução Programada (RP) da ANCP, teste de progênie criado em 1995 no qual os touros jovens passam por avaliação genética e vistoria técnica (REPRODUÇÃO [...], 2025).</w:t>
       </w:r>
     </w:p>
     <w:p>
@@ -2306,41 +2762,7 @@
           <w:sz w:val="24"/>
           <w:lang w:val="pt-BR"/>
         </w:rPr>
-        <w:t xml:space="preserve"> Análise de cada dimensão isoladamente. As DEPs, os selos comerciais e as linhagens foram analisados separadamente, por estatística descritiva, pelo ranking de importância do </w:t>
-      </w:r>
-      <w:r>
-        <w:rPr>
-          <w:rFonts w:ascii="Times New Roman" w:hAnsi="Times New Roman" w:cs="Times New Roman" w:eastAsia="Times New Roman"/>
-          <w:i/>
-          <w:sz w:val="24"/>
-          <w:lang w:val="pt-BR"/>
-        </w:rPr>
-        <w:t xml:space="preserve">Random Forest</w:t>
-      </w:r>
-      <w:r>
-        <w:rPr>
-          <w:rFonts w:ascii="Times New Roman" w:hAnsi="Times New Roman" w:cs="Times New Roman" w:eastAsia="Times New Roman"/>
-          <w:sz w:val="24"/>
-          <w:lang w:val="pt-BR"/>
-        </w:rPr>
-        <w:t xml:space="preserve"> e por regressões hedônicas com todas as variáveis da dimensão (18 DEPs, 6 selos ou 7 linhagens). As variáveis com efeito significativo (p &lt; 0,05, com erros-padrão robustos) foram levadas às etapas seguintes; como nenhuma linhagem foi significativa, essa dimensão foi representada pela linhagem de maior importância no </w:t>
-      </w:r>
-      <w:r>
-        <w:rPr>
-          <w:rFonts w:ascii="Times New Roman" w:hAnsi="Times New Roman" w:cs="Times New Roman" w:eastAsia="Times New Roman"/>
-          <w:i/>
-          <w:sz w:val="24"/>
-          <w:lang w:val="pt-BR"/>
-        </w:rPr>
-        <w:t xml:space="preserve">Random Forest</w:t>
-      </w:r>
-      <w:r>
-        <w:rPr>
-          <w:rFonts w:ascii="Times New Roman" w:hAnsi="Times New Roman" w:cs="Times New Roman" w:eastAsia="Times New Roman"/>
-          <w:sz w:val="24"/>
-          <w:lang w:val="pt-BR"/>
-        </w:rPr>
-        <w:t xml:space="preserve"> (EAO).</w:t>
+        <w:t xml:space="preserve"> Análise de cada dimensão isoladamente. As DEPs, os selos comerciais e as linhagens foram analisados separadamente, por estatística descritiva, pelo ranking de importância do Random Forest e por regressões hedônicas com todas as variáveis da dimensão (18 DEPs, 6 selos ou 7 linhagens). As variáveis com efeito significativo (p &lt; 0,05, com erros-padrão robustos) foram levadas às etapas seguintes; como nenhuma linhagem foi significativa, essa dimensão foi representada pela linhagem de maior importância no Random Forest (EAO).</w:t>
       </w:r>
     </w:p>
     <w:p>
@@ -2496,24 +2918,7 @@
           <w:sz w:val="24"/>
           <w:lang w:val="pt-BR"/>
         </w:rPr>
-        <w:t xml:space="preserve"> Modelo final e validação. O modelo com menor AIC entre os sete foi submetido ao diagnóstico dos resíduos e da multicolinearidade (Fator de Inflação da Variância – VIF), e o desempenho preditivo do </w:t>
-      </w:r>
-      <w:r>
-        <w:rPr>
-          <w:rFonts w:ascii="Times New Roman" w:hAnsi="Times New Roman" w:cs="Times New Roman" w:eastAsia="Times New Roman"/>
-          <w:i/>
-          <w:sz w:val="24"/>
-          <w:lang w:val="pt-BR"/>
-        </w:rPr>
-        <w:t xml:space="preserve">Random Forest</w:t>
-      </w:r>
-      <w:r>
-        <w:rPr>
-          <w:rFonts w:ascii="Times New Roman" w:hAnsi="Times New Roman" w:cs="Times New Roman" w:eastAsia="Times New Roman"/>
-          <w:sz w:val="24"/>
-          <w:lang w:val="pt-BR"/>
-        </w:rPr>
-        <w:t xml:space="preserve"> e dos modelos de regressão foi avaliado fora da amostra.</w:t>
+        <w:t xml:space="preserve"> Modelo final e validação. O modelo com menor AIC entre os sete foi submetido ao diagnóstico dos resíduos e da multicolinearidade (Fator de Inflação da Variância – VIF), e o desempenho preditivo do Random Forest e dos modelos de regressão foi avaliado fora da amostra.</w:t>
       </w:r>
     </w:p>
     <w:p>
@@ -2598,41 +3003,7 @@
           <w:sz w:val="24"/>
           <w:lang w:val="pt-BR"/>
         </w:rPr>
-        <w:t xml:space="preserve">Aplicou-se o algoritmo supervisionado </w:t>
-      </w:r>
-      <w:r>
-        <w:rPr>
-          <w:rFonts w:ascii="Times New Roman" w:hAnsi="Times New Roman" w:cs="Times New Roman" w:eastAsia="Times New Roman"/>
-          <w:i/>
-          <w:sz w:val="24"/>
-          <w:lang w:val="pt-BR"/>
-        </w:rPr>
-        <w:t xml:space="preserve">Random Forest Regressor</w:t>
-      </w:r>
-      <w:r>
-        <w:rPr>
-          <w:rFonts w:ascii="Times New Roman" w:hAnsi="Times New Roman" w:cs="Times New Roman" w:eastAsia="Times New Roman"/>
-          <w:sz w:val="24"/>
-          <w:lang w:val="pt-BR"/>
-        </w:rPr>
-        <w:t xml:space="preserve"> (BREIMAN, 2001), um conjunto de árvores de decisão em que cada árvore é ajustada a uma amostra </w:t>
-      </w:r>
-      <w:r>
-        <w:rPr>
-          <w:rFonts w:ascii="Times New Roman" w:hAnsi="Times New Roman" w:cs="Times New Roman" w:eastAsia="Times New Roman"/>
-          <w:i/>
-          <w:sz w:val="24"/>
-          <w:lang w:val="pt-BR"/>
-        </w:rPr>
-        <w:t xml:space="preserve">bootstrap</w:t>
-      </w:r>
-      <w:r>
-        <w:rPr>
-          <w:rFonts w:ascii="Times New Roman" w:hAnsi="Times New Roman" w:cs="Times New Roman" w:eastAsia="Times New Roman"/>
-          <w:sz w:val="24"/>
-          <w:lang w:val="pt-BR"/>
-        </w:rPr>
-        <w:t xml:space="preserve"> dos dados e, em cada divisão, escolhe a melhor variável entre um subconjunto sorteado. Foram construídos conjuntos com 500 árvores de decisão (n_estimators = 500), semente pseudoaleatória fixada em random_state = 42 para assegurar reprodutibilidade, e seleção de subconjuntos de atributos pela raiz quadrada do total de variáveis</w:t>
+        <w:t xml:space="preserve">Aplicou-se o algoritmo supervisionado Random Forest Regressor (BREIMAN, 2001), um conjunto de árvores de decisão em que cada árvore é ajustada a uma amostra bootstrap dos dados e, em cada divisão, escolhe a melhor variável entre um subconjunto sorteado. Foram construídos conjuntos com 500 árvores de decisão (n_estimators = 500), semente pseudoaleatória fixada em random_state = 42 para assegurar reprodutibilidade, e seleção de subconjuntos de atributos pela raiz quadrada do total de variáveis</w:t>
       </w:r>
       <w:r>
         <w:rPr>
@@ -2681,24 +3052,7 @@
           <w:sz w:val="24"/>
           <w:lang w:val="pt-BR"/>
         </w:rPr>
-        <w:t xml:space="preserve">A importância relativa de cada variável na determinação do preço da dose foi mensurada via decréscimo médio de impureza (</w:t>
-      </w:r>
-      <w:r>
-        <w:rPr>
-          <w:rFonts w:ascii="Times New Roman" w:hAnsi="Times New Roman" w:cs="Times New Roman" w:eastAsia="Times New Roman"/>
-          <w:i/>
-          <w:sz w:val="24"/>
-          <w:lang w:val="pt-BR"/>
-        </w:rPr>
-        <w:t xml:space="preserve">Mean Decrease in Impurity</w:t>
-      </w:r>
-      <w:r>
-        <w:rPr>
-          <w:rFonts w:ascii="Times New Roman" w:hAnsi="Times New Roman" w:cs="Times New Roman" w:eastAsia="Times New Roman"/>
-          <w:sz w:val="24"/>
-          <w:lang w:val="pt-BR"/>
-        </w:rPr>
-        <w:t xml:space="preserve"> / redução de variância), conforme implementado na biblioteca scikit-learn:</w:t>
+        <w:t xml:space="preserve">A importância relativa de cada variável na determinação do preço da dose foi mensurada via decréscimo médio de impureza (Mean Decrease in Impurity / redução de variância), conforme implementado na biblioteca scikit-learn:</w:t>
       </w:r>
     </w:p>
     <w:p>
@@ -3074,75 +3428,7 @@
           <w:sz w:val="24"/>
           <w:lang w:val="pt-BR"/>
         </w:rPr>
-        <w:t xml:space="preserve">Como o coeficiente de determinação calculado na própria amostra de ajuste tende a superestimar o poder explicativo, o desempenho preditivo foi avaliado também fora da amostra: pelo R² </w:t>
-      </w:r>
-      <w:r>
-        <w:rPr>
-          <w:rFonts w:ascii="Times New Roman" w:hAnsi="Times New Roman" w:cs="Times New Roman" w:eastAsia="Times New Roman"/>
-          <w:i/>
-          <w:sz w:val="24"/>
-          <w:lang w:val="pt-BR"/>
-        </w:rPr>
-        <w:t xml:space="preserve">out-of-bag</w:t>
-      </w:r>
-      <w:r>
-        <w:rPr>
-          <w:rFonts w:ascii="Times New Roman" w:hAnsi="Times New Roman" w:cs="Times New Roman" w:eastAsia="Times New Roman"/>
-          <w:sz w:val="24"/>
-          <w:lang w:val="pt-BR"/>
-        </w:rPr>
-        <w:t xml:space="preserve"> do </w:t>
-      </w:r>
-      <w:r>
-        <w:rPr>
-          <w:rFonts w:ascii="Times New Roman" w:hAnsi="Times New Roman" w:cs="Times New Roman" w:eastAsia="Times New Roman"/>
-          <w:i/>
-          <w:sz w:val="24"/>
-          <w:lang w:val="pt-BR"/>
-        </w:rPr>
-        <w:t xml:space="preserve">Random Forest</w:t>
-      </w:r>
-      <w:r>
-        <w:rPr>
-          <w:rFonts w:ascii="Times New Roman" w:hAnsi="Times New Roman" w:cs="Times New Roman" w:eastAsia="Times New Roman"/>
-          <w:sz w:val="24"/>
-          <w:lang w:val="pt-BR"/>
-        </w:rPr>
-        <w:t xml:space="preserve">, em que cada touro é previsto apenas pelas árvores que não o utilizaram no treinamento (BREIMAN, 2001), e por validação cruzada com cinco partições repetida dez vezes, comparando o </w:t>
-      </w:r>
-      <w:r>
-        <w:rPr>
-          <w:rFonts w:ascii="Times New Roman" w:hAnsi="Times New Roman" w:cs="Times New Roman" w:eastAsia="Times New Roman"/>
-          <w:i/>
-          <w:sz w:val="24"/>
-          <w:lang w:val="pt-BR"/>
-        </w:rPr>
-        <w:t xml:space="preserve">Random Forest</w:t>
-      </w:r>
-      <w:r>
-        <w:rPr>
-          <w:rFonts w:ascii="Times New Roman" w:hAnsi="Times New Roman" w:cs="Times New Roman" w:eastAsia="Times New Roman"/>
-          <w:sz w:val="24"/>
-          <w:lang w:val="pt-BR"/>
-        </w:rPr>
-        <w:t xml:space="preserve"> com as 31 variáveis das três dimensões (18 DEPs, 6 selos e 7 linhagens), o modelo hedônico final e sua especificação com o CAR como indicador de Super Elite, um modelo de regressão com as mesmas variáveis do </w:t>
-      </w:r>
-      <w:r>
-        <w:rPr>
-          <w:rFonts w:ascii="Times New Roman" w:hAnsi="Times New Roman" w:cs="Times New Roman" w:eastAsia="Times New Roman"/>
-          <w:i/>
-          <w:sz w:val="24"/>
-          <w:lang w:val="pt-BR"/>
-        </w:rPr>
-        <w:t xml:space="preserve">Random Forest</w:t>
-      </w:r>
-      <w:r>
-        <w:rPr>
-          <w:rFonts w:ascii="Times New Roman" w:hAnsi="Times New Roman" w:cs="Times New Roman" w:eastAsia="Times New Roman"/>
-          <w:sz w:val="24"/>
-          <w:lang w:val="pt-BR"/>
-        </w:rPr>
-        <w:t xml:space="preserve"> e um modelo sem preditores (média do preço), pelo R² e pela raiz do erro quadrático médio (RMSE). Como as variáveis do modelo final foram selecionadas com a amostra completa, sua validação cruzada foi repetida de forma aninhada, refazendo a seleção das variáveis, pela mesma regra das Etapas 1 a 3, dentro de cada partição de treino. A importância das variáveis foi estimada ainda por permutação, que mede a perda de desempenho quando os valores de uma variável são embaralhados nos dados não usados no ajuste (BREIMAN, 2001), em uma validação cruzada própria, com cinco partições e quatro repetições.</w:t>
+        <w:t xml:space="preserve">Como o coeficiente de determinação calculado na própria amostra de ajuste tende a superestimar o poder explicativo, o desempenho preditivo foi avaliado também fora da amostra: pelo R² out-of-bag do Random Forest, em que cada touro é previsto apenas pelas árvores que não o utilizaram no treinamento (BREIMAN, 2001), e por validação cruzada com cinco partições repetida dez vezes, comparando o Random Forest com as 31 variáveis das três dimensões (18 DEPs, 6 selos e 7 linhagens), o modelo hedônico final e sua especificação com o CAR como indicador de Super Elite, um modelo de regressão com as mesmas variáveis do Random Forest e um modelo sem preditores (média do preço), pelo R² e pela raiz do erro quadrático médio (RMSE). Como as variáveis do modelo final foram selecionadas com a amostra completa, sua validação cruzada foi repetida de forma aninhada, refazendo a seleção das variáveis, pela mesma regra das Etapas 1 a 3, dentro de cada partição de treino. A importância das variáveis foi estimada ainda por permutação, que mede a perda de desempenho quando os valores de uma variável são embaralhados nos dados não usados no ajuste (BREIMAN, 2001), em uma validação cruzada própria, com cinco partições e quatro repetições.</w:t>
       </w:r>
     </w:p>
     <w:p>
@@ -3536,7 +3822,15 @@
           <w:sz w:val="24"/>
           <w:lang w:val="pt-BR"/>
         </w:rPr>
-        <w:t xml:space="preserve"> é o preço da dose de sêmen do reprodutor i, </w:t>
+        <w:t xml:space="preserve"> </w:t>
+      </w:r>
+      <w:r>
+        <w:rPr>
+          <w:rFonts w:ascii="Times New Roman" w:hAnsi="Times New Roman" w:cs="Times New Roman" w:eastAsia="Times New Roman"/>
+          <w:sz w:val="24"/>
+          <w:lang w:val="pt-BR"/>
+        </w:rPr>
+        <w:t xml:space="preserve">é o preço da dose de sêmen do reprodutor i, </w:t>
       </w:r>
     </w:p>
     <w:p>
@@ -3585,7 +3879,49 @@
           <w:sz w:val="24"/>
           <w:lang w:val="pt-BR"/>
         </w:rPr>
-        <w:t xml:space="preserve"> é o intercepto (preço base)</w:t>
+        <w:t xml:space="preserve"> </w:t>
+      </w:r>
+      <w:proofErr w:type="spellStart"/>
+      <w:r>
+        <w:rPr>
+          <w:rFonts w:ascii="Times New Roman" w:hAnsi="Times New Roman" w:cs="Times New Roman" w:eastAsia="Times New Roman"/>
+          <w:sz w:val="24"/>
+          <w:lang w:val="pt-BR"/>
+        </w:rPr>
+        <w:t>é</w:t>
+      </w:r>
+      <w:proofErr w:type="spellEnd"/>
+      <w:r>
+        <w:rPr>
+          <w:rFonts w:ascii="Times New Roman" w:hAnsi="Times New Roman" w:cs="Times New Roman" w:eastAsia="Times New Roman"/>
+          <w:sz w:val="24"/>
+          <w:lang w:val="pt-BR"/>
+        </w:rPr>
+        <w:t xml:space="preserve"> </w:t>
+      </w:r>
+      <w:r>
+        <w:rPr>
+          <w:rFonts w:ascii="Times New Roman" w:hAnsi="Times New Roman" w:cs="Times New Roman" w:eastAsia="Times New Roman"/>
+          <w:sz w:val="24"/>
+          <w:lang w:val="pt-BR"/>
+        </w:rPr>
+        <w:t>o intercepto (preço</w:t>
+      </w:r>
+      <w:r>
+        <w:rPr>
+          <w:rFonts w:ascii="Times New Roman" w:hAnsi="Times New Roman" w:cs="Times New Roman" w:eastAsia="Times New Roman"/>
+          <w:sz w:val="24"/>
+          <w:lang w:val="pt-BR"/>
+        </w:rPr>
+        <w:t xml:space="preserve"> </w:t>
+      </w:r>
+      <w:r>
+        <w:rPr>
+          <w:rFonts w:ascii="Times New Roman" w:hAnsi="Times New Roman" w:cs="Times New Roman" w:eastAsia="Times New Roman"/>
+          <w:sz w:val="24"/>
+          <w:lang w:val="pt-BR"/>
+        </w:rPr>
+        <w:t>base)</w:t>
       </w:r>
     </w:p>
     <w:p>
@@ -3766,24 +4102,7 @@
           <w:sz w:val="24"/>
           <w:lang w:val="pt-BR"/>
         </w:rPr>
-        <w:t xml:space="preserve">A qualidade de ajuste e a parcimônia dos modelos foram comparadas mediante: Coeficiente de Determinação (R²) e R² Ajustado: Percentual da variabilidade do preço explicado pelo conjunto de regressores, penalizado pelo número de parâmetros. Critério de Informação de Akaike (AIC): Penaliza o sobreajuste (</w:t>
-      </w:r>
-      <w:r>
-        <w:rPr>
-          <w:rFonts w:ascii="Times New Roman" w:hAnsi="Times New Roman" w:cs="Times New Roman" w:eastAsia="Times New Roman"/>
-          <w:i/>
-          <w:sz w:val="24"/>
-          <w:lang w:val="pt-BR"/>
-        </w:rPr>
-        <w:t xml:space="preserve">overfitting</w:t>
-      </w:r>
-      <w:r>
-        <w:rPr>
-          <w:rFonts w:ascii="Times New Roman" w:hAnsi="Times New Roman" w:cs="Times New Roman" w:eastAsia="Times New Roman"/>
-          <w:sz w:val="24"/>
-          <w:lang w:val="pt-BR"/>
-        </w:rPr>
-        <w:t xml:space="preserve">), em que valores menores indicam melhor equilíbrio entre o ajuste e o número de parâmetros:</w:t>
+        <w:t xml:space="preserve">A qualidade de ajuste e a parcimônia dos modelos foram comparadas mediante: Coeficiente de Determinação (R²) e R² Ajustado: Percentual da variabilidade do preço explicado pelo conjunto de regressores, penalizado pelo número de parâmetros. Critério de Informação de Akaike (AIC): Penaliza o sobreajuste (overfitting), em que valores menores indicam melhor equilíbrio entre o ajuste e o número de parâmetros:</w:t>
       </w:r>
     </w:p>
     <w:p>
@@ -3946,7 +4265,31 @@
           <w:sz w:val="24"/>
           <w:lang w:val="pt-BR"/>
         </w:rPr>
-        <w:t xml:space="preserve">Teste F de Significância Global: Avaliação da hipótese nula de que todos os coeficientes angulares são conjuntamente nulos (p&lt;0,05). Nos modelos com erros-padrão robustos, o teste global corresponde ao teste de Wald com a matriz de covariância HC3. Multicolinearidade (VIF - Variance Inflation Factor):</w:t>
+        <w:t xml:space="preserve">Teste F de Significância Global: Avaliação da hipótese nula de que todos os coeficientes angulares são </w:t>
+      </w:r>
+      <w:r>
+        <w:rPr>
+          <w:rFonts w:ascii="Times New Roman" w:hAnsi="Times New Roman" w:cs="Times New Roman" w:eastAsia="Times New Roman"/>
+          <w:sz w:val="24"/>
+          <w:lang w:val="pt-BR"/>
+        </w:rPr>
+        <w:t>conjuntamente nulos (p&lt;0,05).</w:t>
+      </w:r>
+      <w:r>
+        <w:rPr>
+          <w:rFonts w:ascii="Times New Roman" w:hAnsi="Times New Roman" w:cs="Times New Roman" w:eastAsia="Times New Roman"/>
+          <w:sz w:val="24"/>
+          <w:lang w:val="pt-BR"/>
+        </w:rPr>
+        <w:t xml:space="preserve"> Nos modelos com erros-padrão robustos, o teste global corresponde ao teste de Wald com a matriz de covariância HC3.</w:t>
+      </w:r>
+      <w:r>
+        <w:rPr>
+          <w:rFonts w:ascii="Times New Roman" w:hAnsi="Times New Roman" w:cs="Times New Roman" w:eastAsia="Times New Roman"/>
+          <w:sz w:val="24"/>
+          <w:lang w:val="pt-BR"/>
+        </w:rPr>
+        <w:t xml:space="preserve"> Multicolinearidade (VIF - Variance Inflation Factor):</w:t>
       </w:r>
     </w:p>
     <w:p>
@@ -4212,6 +4555,8 @@
         </w:rPr>
         <w:t xml:space="preserve">Todos os scripts, manipulações de dados, modelos econométricos e visualizações gráficas foram codificados em Jupyter Notebooks. A coleta foi executada em Python 3.11, com requests (2.34.2) e beautifulsoup4 (4.15.0), e as análises em Python 3.13, com pandas (3.0.6), numpy (2.5.3), scikit-learn (1.9.1), statsmodels (0.15.0), scipy (1.18.1), matplotlib (3.11.2) e seaborn (0.13.2).</w:t>
       </w:r>
+      <w:proofErr w:type="spellStart"/>
+      <w:proofErr w:type="spellEnd"/>
     </w:p>
     <w:p>
       <w:pPr>
@@ -4337,7 +4682,15 @@
           <w:sz w:val="24"/>
           <w:lang w:val="pt-BR"/>
         </w:rPr>
-        <w:t xml:space="preserve">A base amostral analisada foi composta por 115 reprodutores da raça Nelore comercializados pela central CRV Lagoa que possuíam avaliação genética completa no sumário ANCP. O preço médio da dose convencional foi de R$ 32,40 (desvio-padrão de R$ 6,79), oscilando entre a cotação mínima de R$ 18,70 e a máxima de R$ 60,00, com mediana de R$ 31,20 (Tabela 1).</w:t>
+        <w:t xml:space="preserve">A base amostral analisada foi composta por 115 reprodutores da raça Nelore comercializados pela central CRV Lagoa que possuíam avaliação genética completa no sumário ANCP. </w:t>
+      </w:r>
+      <w:r>
+        <w:rPr>
+          <w:rFonts w:ascii="Times New Roman" w:hAnsi="Times New Roman" w:cs="Times New Roman" w:eastAsia="Times New Roman"/>
+          <w:sz w:val="24"/>
+          <w:lang w:val="pt-BR"/>
+        </w:rPr>
+        <w:t>O preço médio da dose convencional foi de R$ 32,40 (desvio-padrão de R$ 6,79), oscilando entre a cotação mínima de R$ 18,70 e a máxima de R$ 60,00, com mediana de R$ 31,20 (Tabela 1).</w:t>
       </w:r>
     </w:p>
     <w:p>
@@ -4382,6 +4735,26 @@
           <w:lang w:val="pt-BR"/>
         </w:rPr>
         <w:t xml:space="preserve">Tabela 1.</w:t>
+      </w:r>
+      <w:r>
+        <w:rPr>
+          <w:rFonts w:ascii="Times New Roman" w:hAnsi="Times New Roman" w:cs="Times New Roman" w:eastAsia="Times New Roman"/>
+          <w:b w:val="0"/>
+          <w:bCs/>
+          <w:sz w:val="24"/>
+          <w:lang w:val="pt-BR"/>
+        </w:rPr>
+        <w:t xml:space="preserve"/>
+      </w:r>
+      <w:r>
+        <w:rPr>
+          <w:rFonts w:ascii="Times New Roman" w:hAnsi="Times New Roman" w:cs="Times New Roman" w:eastAsia="Times New Roman"/>
+          <w:b w:val="0"/>
+          <w:bCs/>
+          <w:sz w:val="24"/>
+          <w:lang w:val="pt-BR"/>
+        </w:rPr>
+        <w:t xml:space="preserve"/>
       </w:r>
       <w:r>
         <w:rPr>
@@ -4865,9 +5238,9 @@
           <w:between w:space="0" w:sz="0" w:val="nil"/>
         </w:pBdr>
         <w:shd w:fill="auto" w:val="clear"/>
-        <w:spacing w:after="240" w:before="0" w:line="240" w:lineRule="auto"/>
-        <w:ind w:left="0" w:right="0" w:firstLine="0"/>
-        <w:jc w:val="center"/>
+        <w:spacing w:after="0" w:before="0" w:line="360" w:lineRule="auto"/>
+        <w:ind w:left="0" w:right="0" w:firstLine="709"/>
+        <w:jc w:val="both"/>
         <w:rPr>
           <w:rFonts w:ascii="Times New Roman" w:cs="Times New Roman" w:eastAsia="Times New Roman" w:hAnsi="Times New Roman"/>
           <w:b w:val="0"/>
@@ -4888,8 +5261,53 @@
         <w:rPr>
           <w:rFonts w:ascii="Times New Roman" w:hAnsi="Times New Roman" w:cs="Times New Roman" w:eastAsia="Times New Roman"/>
           <w:sz w:val="24"/>
-        </w:rPr>
-        <w:t xml:space="preserve">Fonte: elaborado pelos autores (2026).</w:t>
+          <w:lang w:val="pt-BR"/>
+        </w:rPr>
+        <w:t xml:space="preserve">A proximidade entre a média (R$ 32,40) e a mediana (R$ 31,20), aliada ao coeficiente de variação de 20,96%, indica dispersão moderada dos preços, que se concentram em poucos patamares comerciais: metade dos touros tem a dose cotada em até R$ 31,20 e 75% em até R$ 33,90. A assimetria à direita decorre de uma cauda estreita de touros de maior cotação — apenas oito touros (7,0%) têm a dose acima de R$ 38,90 e quatro (3,5%) acima de R$ 45,40 —, chegando ao máximo de R$ 60,00. É essa variação de preço entre touros da mesma raça e da mesma central que a abordagem hedônica procura relacionar aos atributos de cada animal (ROSEN, 1974).</w:t>
+      </w:r>
+    </w:p>
+    <w:p>
+      <w:pPr>
+        <w:keepNext w:val="1"/>
+        <w:keepLines w:val="0"/>
+        <w:pageBreakBefore w:val="0"/>
+        <w:widowControl w:val="1"/>
+        <w:pBdr>
+          <w:top w:space="0" w:sz="0" w:val="nil"/>
+          <w:left w:space="0" w:sz="0" w:val="nil"/>
+          <w:bottom w:space="0" w:sz="0" w:val="nil"/>
+          <w:right w:space="0" w:sz="0" w:val="nil"/>
+          <w:between w:space="0" w:sz="0" w:val="nil"/>
+        </w:pBdr>
+        <w:shd w:fill="auto" w:val="clear"/>
+        <w:spacing w:after="120" w:before="120" w:line="360" w:lineRule="auto"/>
+        <w:ind w:left="0" w:right="0" w:firstLine="0"/>
+        <w:jc w:val="both"/>
+        <w:rPr>
+          <w:rFonts w:ascii="Times New Roman" w:cs="Times New Roman" w:eastAsia="Times New Roman" w:hAnsi="Times New Roman"/>
+          <w:b w:val="0"/>
+          <w:bCs w:val="0"/>
+          <w:i w:val="0"/>
+          <w:iCs w:val="0"/>
+          <w:smallCaps w:val="0"/>
+          <w:strike w:val="0"/>
+          <w:color w:val="000000"/>
+          <w:sz w:val="24"/>
+          <w:szCs w:val="24"/>
+          <w:u w:val="none"/>
+          <w:shd w:fill="auto" w:val="clear"/>
+          <w:vertAlign w:val="baseline"/>
+        </w:rPr>
+      </w:pPr>
+      <w:r>
+        <w:rPr>
+          <w:rFonts w:ascii="Times New Roman" w:hAnsi="Times New Roman" w:cs="Times New Roman" w:eastAsia="Times New Roman"/>
+          <w:b/>
+          <w:i w:val="0"/>
+          <w:sz w:val="24"/>
+        </w:rPr>
+        <w:lastRenderedPageBreak/>
+        <w:t xml:space="preserve">Diferenças Esperadas na Progênie (DEPs)</w:t>
       </w:r>
     </w:p>
     <w:p>
@@ -4931,51 +5349,7 @@
           <w:sz w:val="24"/>
           <w:lang w:val="pt-BR"/>
         </w:rPr>
-        <w:t xml:space="preserve">A proximidade entre a média (R$ 32,40) e a mediana (R$ 31,20), aliada ao coeficiente de variação de 20,96%, indica dispersão moderada dos preços, que se concentram em poucos patamares comerciais: metade dos touros tem a dose cotada em até R$ 31,20 e 75% em até R$ 33,90. A assimetria à direita decorre de uma cauda estreita de touros de maior cotação — apenas oito touros (7,0%) têm a dose acima de R$ 38,90 e quatro (3,5%) acima de R$ 45,40 —, chegando ao máximo de R$ 60,00. É essa variação de preço entre touros da mesma raça e da mesma central que a abordagem hedônica procura relacionar aos atributos de cada animal (ROSEN, 1974).</w:t>
-      </w:r>
-    </w:p>
-    <w:p>
-      <w:pPr>
-        <w:keepNext w:val="1"/>
-        <w:keepLines w:val="0"/>
-        <w:pageBreakBefore w:val="0"/>
-        <w:widowControl w:val="1"/>
-        <w:pBdr>
-          <w:top w:space="0" w:sz="0" w:val="nil"/>
-          <w:left w:space="0" w:sz="0" w:val="nil"/>
-          <w:bottom w:space="0" w:sz="0" w:val="nil"/>
-          <w:right w:space="0" w:sz="0" w:val="nil"/>
-          <w:between w:space="0" w:sz="0" w:val="nil"/>
-        </w:pBdr>
-        <w:shd w:fill="auto" w:val="clear"/>
-        <w:spacing w:after="120" w:before="120" w:line="360" w:lineRule="auto"/>
-        <w:ind w:left="0" w:right="0" w:firstLine="0"/>
-        <w:jc w:val="both"/>
-        <w:rPr>
-          <w:rFonts w:ascii="Times New Roman" w:cs="Times New Roman" w:eastAsia="Times New Roman" w:hAnsi="Times New Roman"/>
-          <w:b w:val="0"/>
-          <w:bCs w:val="0"/>
-          <w:i w:val="0"/>
-          <w:iCs w:val="0"/>
-          <w:smallCaps w:val="0"/>
-          <w:strike w:val="0"/>
-          <w:color w:val="000000"/>
-          <w:sz w:val="24"/>
-          <w:szCs w:val="24"/>
-          <w:u w:val="none"/>
-          <w:shd w:fill="auto" w:val="clear"/>
-          <w:vertAlign w:val="baseline"/>
-        </w:rPr>
-      </w:pPr>
-      <w:r>
-        <w:rPr>
-          <w:rFonts w:ascii="Times New Roman" w:hAnsi="Times New Roman" w:cs="Times New Roman" w:eastAsia="Times New Roman"/>
-          <w:b/>
-          <w:i w:val="0"/>
-          <w:sz w:val="24"/>
-        </w:rPr>
-        <w:lastRenderedPageBreak/>
-        <w:t xml:space="preserve">Diferenças Esperadas na Progênie (DEPs)</w:t>
+        <w:t xml:space="preserve">No catálogo, cada DEP é acompanhada do seu percentil (TOP%), que indica a posição do reprodutor em relação aos demais animais avaliados da raça.</w:t>
       </w:r>
     </w:p>
     <w:p>
@@ -5017,48 +5391,6 @@
           <w:sz w:val="24"/>
           <w:lang w:val="pt-BR"/>
         </w:rPr>
-        <w:t xml:space="preserve">No catálogo, cada DEP é acompanhada do seu percentil (TOP%), que indica a posição do reprodutor em relação aos demais animais avaliados da raça.</w:t>
-      </w:r>
-    </w:p>
-    <w:p>
-      <w:pPr>
-        <w:keepNext w:val="0"/>
-        <w:keepLines w:val="0"/>
-        <w:pageBreakBefore w:val="0"/>
-        <w:widowControl w:val="1"/>
-        <w:pBdr>
-          <w:top w:space="0" w:sz="0" w:val="nil"/>
-          <w:left w:space="0" w:sz="0" w:val="nil"/>
-          <w:bottom w:space="0" w:sz="0" w:val="nil"/>
-          <w:right w:space="0" w:sz="0" w:val="nil"/>
-          <w:between w:space="0" w:sz="0" w:val="nil"/>
-        </w:pBdr>
-        <w:shd w:fill="auto" w:val="clear"/>
-        <w:spacing w:after="0" w:before="0" w:line="360" w:lineRule="auto"/>
-        <w:ind w:left="0" w:right="0" w:firstLine="709"/>
-        <w:jc w:val="both"/>
-        <w:rPr>
-          <w:rFonts w:ascii="Times New Roman" w:cs="Times New Roman" w:eastAsia="Times New Roman" w:hAnsi="Times New Roman"/>
-          <w:b w:val="0"/>
-          <w:bCs w:val="0"/>
-          <w:i w:val="0"/>
-          <w:iCs w:val="0"/>
-          <w:smallCaps w:val="0"/>
-          <w:strike w:val="0"/>
-          <w:color w:val="000000"/>
-          <w:sz w:val="24"/>
-          <w:szCs w:val="24"/>
-          <w:u w:val="none"/>
-          <w:shd w:fill="auto" w:val="clear"/>
-          <w:vertAlign w:val="baseline"/>
-        </w:rPr>
-      </w:pPr>
-      <w:r>
-        <w:rPr>
-          <w:rFonts w:ascii="Times New Roman" w:hAnsi="Times New Roman" w:cs="Times New Roman" w:eastAsia="Times New Roman"/>
-          <w:sz w:val="24"/>
-          <w:lang w:val="pt-BR"/>
-        </w:rPr>
         <w:t xml:space="preserve">Para avaliar a sensibilidade de preço em relação ao mérito genético, as características foram estratificadas em 4 classes: Comercial: TOP&gt;20% (animais com desempenho padrão de rebanho comercial); Superior: TOP 11 a 20% (animais superiores à média populacional); Elite: TOP 4 a 10% (animais no topo 10% da raça); Super Elite: TOP ≤3% (os melhores 3% do sumário nacional).</w:t>
       </w:r>
     </w:p>
@@ -5112,7 +5444,52 @@
           <w:sz w:val="24"/>
           <w:lang w:val="pt-BR"/>
         </w:rPr>
-        <w:t xml:space="preserve"> As 6 DEPs da ANCP com maior valorização (ágio) no preço da dose</w:t>
+        <w:t xml:space="preserve"> </w:t>
+      </w:r>
+      <w:r>
+        <w:rPr>
+          <w:rFonts w:ascii="Times New Roman" w:hAnsi="Times New Roman" w:cs="Times New Roman" w:eastAsia="Times New Roman"/>
+          <w:b w:val="0"/>
+          <w:sz w:val="24"/>
+          <w:lang w:val="pt-BR"/>
+        </w:rPr>
+        <w:t xml:space="preserve">As 6 </w:t>
+      </w:r>
+      <w:r>
+        <w:rPr>
+          <w:rFonts w:ascii="Times New Roman" w:hAnsi="Times New Roman" w:cs="Times New Roman" w:eastAsia="Times New Roman"/>
+          <w:b w:val="0"/>
+          <w:sz w:val="24"/>
+          <w:lang w:val="pt-BR"/>
+        </w:rPr>
+        <w:t>DEPs</w:t>
+      </w:r>
+      <w:r>
+        <w:rPr>
+          <w:rFonts w:ascii="Times New Roman" w:hAnsi="Times New Roman" w:cs="Times New Roman" w:eastAsia="Times New Roman"/>
+          <w:b w:val="0"/>
+          <w:sz w:val="24"/>
+          <w:lang w:val="pt-BR"/>
+        </w:rPr>
+        <w:t xml:space="preserve"> da </w:t>
+      </w:r>
+      <w:r>
+        <w:rPr>
+          <w:rFonts w:ascii="Times New Roman" w:hAnsi="Times New Roman" w:cs="Times New Roman" w:eastAsia="Times New Roman"/>
+          <w:b w:val="0"/>
+          <w:sz w:val="24"/>
+          <w:lang w:val="pt-BR"/>
+        </w:rPr>
+        <w:t>ANCP</w:t>
+      </w:r>
+      <w:r>
+        <w:rPr>
+          <w:rFonts w:ascii="Times New Roman" w:hAnsi="Times New Roman" w:cs="Times New Roman" w:eastAsia="Times New Roman"/>
+          <w:b w:val="0"/>
+          <w:sz w:val="24"/>
+          <w:lang w:val="pt-BR"/>
+        </w:rPr>
+        <w:t xml:space="preserve"> com maior valorização (ágio) no preço da dose</w:t>
       </w:r>
     </w:p>
     <w:tbl>
@@ -5204,7 +5581,17 @@
                 <w:szCs w:val="22"/>
                 <w:lang w:val="pt-BR" w:eastAsia="pt-BR"/>
               </w:rPr>
-              <w:t xml:space="preserve">Preço TOP (R$)</w:t>
+              <w:t xml:space="preserve">Preço TOP </w:t>
+            </w:r>
+            <w:r>
+              <w:rPr>
+                <w:rFonts w:eastAsia="Times New Roman" w:cs="Times New Roman" w:ascii="Times New Roman" w:hAnsi="Times New Roman"/>
+                <w:color w:val="000000"/>
+                <w:sz w:val="22"/>
+                <w:szCs w:val="22"/>
+                <w:lang w:val="pt-BR" w:eastAsia="pt-BR"/>
+              </w:rPr>
+              <w:t>(R$)</w:t>
             </w:r>
           </w:p>
         </w:tc>
@@ -5860,7 +6247,7 @@
                 <w:szCs w:val="22"/>
                 <w:lang w:val="pt-BR" w:eastAsia="pt-BR"/>
               </w:rPr>
-              <w:t>11,4</w:t>
+              <w:t xml:space="preserve">11,4</w:t>
             </w:r>
           </w:p>
         </w:tc>
@@ -6334,47 +6721,6 @@
         </w:tc>
       </w:tr>
     </w:tbl>
-    <w:p>
-      <w:pPr>
-        <w:keepNext w:val="0"/>
-        <w:keepLines w:val="0"/>
-        <w:pageBreakBefore w:val="0"/>
-        <w:widowControl w:val="1"/>
-        <w:pBdr>
-          <w:top w:space="0" w:sz="0" w:val="nil"/>
-          <w:left w:space="0" w:sz="0" w:val="nil"/>
-          <w:bottom w:space="0" w:sz="0" w:val="nil"/>
-          <w:right w:space="0" w:sz="0" w:val="nil"/>
-          <w:between w:space="0" w:sz="0" w:val="nil"/>
-        </w:pBdr>
-        <w:shd w:fill="auto" w:val="clear"/>
-        <w:spacing w:after="240" w:before="0" w:line="240" w:lineRule="auto"/>
-        <w:ind w:left="0" w:right="0" w:firstLine="0"/>
-        <w:jc w:val="center"/>
-        <w:rPr>
-          <w:rFonts w:ascii="Times New Roman" w:cs="Times New Roman" w:eastAsia="Times New Roman" w:hAnsi="Times New Roman"/>
-          <w:b w:val="0"/>
-          <w:bCs w:val="0"/>
-          <w:i w:val="0"/>
-          <w:iCs w:val="0"/>
-          <w:smallCaps w:val="0"/>
-          <w:strike w:val="0"/>
-          <w:color w:val="000000"/>
-          <w:sz w:val="24"/>
-          <w:szCs w:val="24"/>
-          <w:u w:val="none"/>
-          <w:shd w:fill="auto" w:val="clear"/>
-          <w:vertAlign w:val="baseline"/>
-        </w:rPr>
-      </w:pPr>
-      <w:r>
-        <w:rPr>
-          <w:rFonts w:ascii="Times New Roman" w:hAnsi="Times New Roman" w:cs="Times New Roman" w:eastAsia="Times New Roman"/>
-          <w:sz w:val="24"/>
-        </w:rPr>
-        <w:t xml:space="preserve">Fonte: elaborado pelos autores (2026).</w:t>
-      </w:r>
-    </w:p>
     <w:p>
       <w:pPr>
         <w:keepNext w:val="0"/>
@@ -6414,24 +6760,7 @@
           <w:sz w:val="20"/>
           <w:lang w:val="pt-BR"/>
         </w:rPr>
-        <w:t xml:space="preserve">CAR = Consumo Alimentar Residual, STAY = Probabilidade de permanência no rebanho (</w:t>
-      </w:r>
-      <w:r>
-        <w:rPr>
-          <w:rFonts w:ascii="Times New Roman" w:hAnsi="Times New Roman" w:cs="Times New Roman" w:eastAsia="Times New Roman"/>
-          <w:i/>
-          <w:sz w:val="20"/>
-          <w:lang w:val="pt-BR"/>
-        </w:rPr>
-        <w:t xml:space="preserve">stayability</w:t>
-      </w:r>
-      <w:r>
-        <w:rPr>
-          <w:rFonts w:ascii="Times New Roman" w:hAnsi="Times New Roman" w:cs="Times New Roman" w:eastAsia="Times New Roman"/>
-          <w:sz w:val="20"/>
-          <w:lang w:val="pt-BR"/>
-        </w:rPr>
-        <w:t xml:space="preserve">), FRAME = Tamanho corporal, MP210 = Habilidade maternal para peso aos 210 dias, MGTe = Mérito Genético Total Econômico, AOL = Área de Olho de Lombo. Ágio calculado entre as classes TOP ≤3% e TOP &gt;20%.</w:t>
+        <w:t xml:space="preserve">CAR = Consumo Alimentar Residual, STAY = Probabilidade de permanência no rebanho (stayability), FRAME = Tamanho corporal, MP210 = Habilidade maternal para peso aos 210 dias, MGTe = Mérito Genético Total Econômico, AOL = Área de Olho de Lombo. Ágio calculado entre as classes TOP ≤3% e TOP &gt;20%.</w:t>
       </w:r>
     </w:p>
     <w:p>
@@ -6518,10 +6847,74 @@
         </w:rPr>
         <w:t xml:space="preserve">A Figura 1 apresenta o ágio entre as classes extremas de TOP para as 18 DEPs. Apenas CAR, STAY e MP210 apresentaram ágio com intervalo de confiança de 95% inteiramente acima de zero, mas nenhuma delas se manteria significativa com a correção de Bonferroni para as 18 comparações (p &lt; 0,0028); para as demais, inclusive o MGTe, a diferença entre as classes não se distinguiu da variação casual.</w:t>
       </w:r>
-    </w:p>
-    <w:p>
-      <w:pPr>
-        <w:keepNext w:val="0"/>
+      <w:r>
+        <w:rPr>
+          <w:rFonts w:ascii="Times New Roman" w:hAnsi="Times New Roman" w:cs="Times New Roman" w:eastAsia="Times New Roman"/>
+          <w:sz w:val="24"/>
+          <w:lang w:val="pt-BR"/>
+        </w:rPr>
+        <w:t/>
+      </w:r>
+      <w:r>
+        <w:rPr>
+          <w:rFonts w:ascii="Times New Roman" w:hAnsi="Times New Roman" w:cs="Times New Roman" w:eastAsia="Times New Roman"/>
+          <w:sz w:val="24"/>
+          <w:lang w:val="pt-BR"/>
+        </w:rPr>
+        <w:t xml:space="preserve"/>
+      </w:r>
+      <w:r>
+        <w:rPr>
+          <w:rFonts w:ascii="Times New Roman" w:hAnsi="Times New Roman" w:cs="Times New Roman" w:eastAsia="Times New Roman"/>
+          <w:sz w:val="24"/>
+          <w:lang w:val="pt-BR"/>
+        </w:rPr>
+        <w:t/>
+      </w:r>
+      <w:r>
+        <w:rPr>
+          <w:rFonts w:ascii="Times New Roman" w:hAnsi="Times New Roman" w:cs="Times New Roman" w:eastAsia="Times New Roman"/>
+          <w:sz w:val="24"/>
+          <w:lang w:val="pt-BR"/>
+        </w:rPr>
+        <w:t/>
+      </w:r>
+      <w:r>
+        <w:rPr>
+          <w:rFonts w:ascii="Times New Roman" w:hAnsi="Times New Roman" w:cs="Times New Roman" w:eastAsia="Times New Roman"/>
+          <w:sz w:val="24"/>
+          <w:lang w:val="pt-BR"/>
+        </w:rPr>
+        <w:t xml:space="preserve"/>
+      </w:r>
+      <w:r>
+        <w:rPr>
+          <w:rFonts w:ascii="Times New Roman" w:hAnsi="Times New Roman" w:cs="Times New Roman" w:eastAsia="Times New Roman"/>
+          <w:sz w:val="24"/>
+          <w:lang w:val="pt-BR"/>
+        </w:rPr>
+        <w:t/>
+      </w:r>
+      <w:r>
+        <w:rPr>
+          <w:rFonts w:ascii="Times New Roman" w:hAnsi="Times New Roman" w:cs="Times New Roman" w:eastAsia="Times New Roman"/>
+          <w:sz w:val="24"/>
+          <w:lang w:val="pt-BR"/>
+        </w:rPr>
+        <w:t/>
+      </w:r>
+      <w:r>
+        <w:rPr>
+          <w:rFonts w:ascii="Times New Roman" w:hAnsi="Times New Roman" w:cs="Times New Roman" w:eastAsia="Times New Roman"/>
+          <w:sz w:val="24"/>
+          <w:lang w:val="pt-BR"/>
+        </w:rPr>
+        <w:t/>
+      </w:r>
+    </w:p>
+    <w:p>
+      <w:pPr>
+        <w:keepNext w:val="1"/>
         <w:keepLines w:val="0"/>
         <w:pageBreakBefore w:val="0"/>
         <w:widowControl w:val="1"/>
@@ -6555,7 +6948,7 @@
       <w:r>
         <w:drawing>
           <wp:inline xmlns:a="http://schemas.openxmlformats.org/drawingml/2006/main" xmlns:pic="http://schemas.openxmlformats.org/drawingml/2006/picture">
-            <wp:extent cx="5760000" cy="4480000"/>
+            <wp:extent cx="4860000" cy="3780000"/>
             <wp:docPr id="1" name="Picture 1"/>
             <wp:cNvGraphicFramePr>
               <a:graphicFrameLocks noChangeAspect="1"/>
@@ -6576,7 +6969,7 @@
                   <pic:spPr>
                     <a:xfrm>
                       <a:off x="0" y="0"/>
-                      <a:ext cx="5760000" cy="4480000"/>
+                      <a:ext cx="4860000" cy="3780000"/>
                     </a:xfrm>
                     <a:prstGeom prst="rect"/>
                   </pic:spPr>
@@ -6589,8 +6982,8 @@
     </w:p>
     <w:p>
       <w:pPr>
-        <w:keepNext w:val="0"/>
-        <w:keepLines w:val="0"/>
+        <w:keepNext w:val="1"/>
+        <w:keepLines w:val="1"/>
         <w:pageBreakBefore w:val="0"/>
         <w:widowControl w:val="1"/>
         <w:pBdr>
@@ -6668,7 +7061,7 @@
           <w:rFonts w:ascii="Times New Roman" w:hAnsi="Times New Roman" w:cs="Times New Roman" w:eastAsia="Times New Roman"/>
           <w:sz w:val="24"/>
         </w:rPr>
-        <w:t xml:space="preserve">Fonte: elaborado pelos autores (2026).</w:t>
+        <w:t xml:space="preserve">Fonte: elaborado pelo autor (2026).</w:t>
       </w:r>
     </w:p>
     <w:p>
@@ -6799,7 +7192,7 @@
     </w:p>
     <w:p>
       <w:pPr>
-        <w:keepNext w:val="0"/>
+        <w:keepNext w:val="1"/>
         <w:keepLines w:val="0"/>
         <w:pageBreakBefore w:val="0"/>
         <w:widowControl w:val="1"/>
@@ -6846,7 +7239,7 @@
                     <pic:cNvPicPr/>
                   </pic:nvPicPr>
                   <pic:blipFill>
-                    <a:blip r:embed="rId18"/>
+                    <a:blip r:embed="rId16"/>
                     <a:stretch>
                       <a:fillRect/>
                     </a:stretch>
@@ -6867,8 +7260,8 @@
     </w:p>
     <w:p>
       <w:pPr>
-        <w:keepNext w:val="0"/>
-        <w:keepLines w:val="0"/>
+        <w:keepNext w:val="1"/>
+        <w:keepLines w:val="1"/>
         <w:pageBreakBefore w:val="0"/>
         <w:widowControl w:val="1"/>
         <w:pBdr>
@@ -6946,7 +7339,7 @@
           <w:rFonts w:ascii="Times New Roman" w:hAnsi="Times New Roman" w:cs="Times New Roman" w:eastAsia="Times New Roman"/>
           <w:sz w:val="24"/>
         </w:rPr>
-        <w:t xml:space="preserve">Fonte: elaborado pelos autores (2026).</w:t>
+        <w:t xml:space="preserve">Fonte: elaborado pelo autor (2026).</w:t>
       </w:r>
     </w:p>
     <w:p>
@@ -7073,24 +7466,7 @@
           <w:sz w:val="24"/>
           <w:lang w:val="pt-BR"/>
         </w:rPr>
-        <w:t xml:space="preserve">Segundo a revisão de Pacheco et al. (2023), os frigoríficos adotaram a espessura de gordura subcutânea como critério para bonificar o produtor, com faixa recomendada pela indústria brasileira de 3 a 6 mm, e carcaças com menos de 3 mm tendem a produzir carne menos macia, pelo resfriamento mais rápido e o consequente encurtamento das fibras pelo frio (</w:t>
-      </w:r>
-      <w:r>
-        <w:rPr>
-          <w:rFonts w:ascii="Times New Roman" w:hAnsi="Times New Roman" w:cs="Times New Roman" w:eastAsia="Times New Roman"/>
-          <w:i/>
-          <w:sz w:val="24"/>
-          <w:lang w:val="pt-BR"/>
-        </w:rPr>
-        <w:t xml:space="preserve">cold shortening</w:t>
-      </w:r>
-      <w:r>
-        <w:rPr>
-          <w:rFonts w:ascii="Times New Roman" w:hAnsi="Times New Roman" w:cs="Times New Roman" w:eastAsia="Times New Roman"/>
-          <w:sz w:val="24"/>
-          <w:lang w:val="pt-BR"/>
-        </w:rPr>
-        <w:t xml:space="preserve">), embora, na meta-análise desses autores, o aumento da força de cisalhamento tenha sido apenas marginal. Seria de esperar, portanto, que touros no topo da régua de carcaça recebessem ágio para uso em cruzamentos terminais e sistemas de abate precoce. Para a AOL, o ágio teve a mesma direção observada em um leilão de touros de corte nos Estados Unidos, no qual a DEP de área de olho de lombo teve efeito significativo sobre o preço (THOMPSON et al., 2022), mas, neste estudo, a diferença não foi estatisticamente significativa; para o ACAB, foi pequena (+R$ 0,63).</w:t>
+        <w:t xml:space="preserve">Segundo a revisão de Pacheco et al. (2023), os frigoríficos adotaram a espessura de gordura subcutânea como critério para bonificar o produtor, com faixa recomendada pela indústria brasileira de 3 a 6 mm, e carcaças com menos de 3 mm tendem a produzir carne menos macia, pelo resfriamento mais rápido e o consequente encurtamento das fibras pelo frio (cold shortening), embora, na meta-análise desses autores, o aumento da força de cisalhamento tenha sido apenas marginal. Seria de esperar, portanto, que touros no topo da régua de carcaça recebessem ágio para uso em cruzamentos terminais e sistemas de abate precoce. Para a AOL, o ágio teve a mesma direção observada em um leilão de touros de corte nos Estados Unidos, no qual a DEP de área de olho de lombo teve efeito significativo sobre o preço (THOMPSON et al., 2022), mas, neste estudo, a diferença não foi estatisticamente significativa; para o ACAB, foi pequena (+R$ 0,63).</w:t>
       </w:r>
     </w:p>
     <w:p>
@@ -7219,6 +7595,15 @@
         </w:rPr>
         <w:t xml:space="preserve">Regressão Hedônica das DEPs</w:t>
       </w:r>
+      <w:r>
+        <w:rPr>
+          <w:rFonts w:ascii="Times New Roman" w:hAnsi="Times New Roman" w:cs="Times New Roman" w:eastAsia="Times New Roman"/>
+          <w:b/>
+          <w:i/>
+          <w:sz w:val="24"/>
+        </w:rPr>
+        <w:t xml:space="preserve"/>
+      </w:r>
     </w:p>
     <w:p>
       <w:pPr>
@@ -7259,24 +7644,7 @@
           <w:sz w:val="24"/>
           <w:lang w:val="pt-BR"/>
         </w:rPr>
-        <w:t xml:space="preserve">No ranking do </w:t>
-      </w:r>
-      <w:r>
-        <w:rPr>
-          <w:rFonts w:ascii="Times New Roman" w:hAnsi="Times New Roman" w:cs="Times New Roman" w:eastAsia="Times New Roman"/>
-          <w:i/>
-          <w:sz w:val="24"/>
-          <w:lang w:val="pt-BR"/>
-        </w:rPr>
-        <w:t xml:space="preserve">Random Forest</w:t>
-      </w:r>
-      <w:r>
-        <w:rPr>
-          <w:rFonts w:ascii="Times New Roman" w:hAnsi="Times New Roman" w:cs="Times New Roman" w:eastAsia="Times New Roman"/>
-          <w:sz w:val="24"/>
-          <w:lang w:val="pt-BR"/>
-        </w:rPr>
-        <w:t xml:space="preserve"> com as 18 DEPs, o CAR foi a característica de maior importância (14,4%), seguido da 3P (9,6%) e da MP210 (6,2%). Na regressão hedônica com as 18 DEPs (Mínimos Quadrados Ordinários - OLS), o modelo como um todo não foi significativo (R² = 11,3%; R² ajustado = -5,3%; p = 0,505).</w:t>
+        <w:t xml:space="preserve">No ranking do Random Forest com as 18 DEPs, o CAR foi a característica de maior importância (14,4%), seguido da 3P (9,6%) e da MP210 (6,2%). Na regressão hedônica com as 18 DEPs (Mínimos Quadrados Ordinários - OLS), o modelo como um todo não foi significativo (R² = 11,3%; R² ajustado = -5,3%; p = 0,505).</w:t>
       </w:r>
     </w:p>
     <w:p>
@@ -7489,24 +7857,7 @@
           <w:sz w:val="24"/>
           <w:lang w:val="pt-BR"/>
         </w:rPr>
-        <w:t xml:space="preserve">No ranking do </w:t>
-      </w:r>
-      <w:r>
-        <w:rPr>
-          <w:rFonts w:ascii="Times New Roman" w:hAnsi="Times New Roman" w:cs="Times New Roman" w:eastAsia="Times New Roman"/>
-          <w:i/>
-          <w:sz w:val="24"/>
-          <w:lang w:val="pt-BR"/>
-        </w:rPr>
-        <w:t xml:space="preserve">Random Forest</w:t>
-      </w:r>
-      <w:r>
-        <w:rPr>
-          <w:rFonts w:ascii="Times New Roman" w:hAnsi="Times New Roman" w:cs="Times New Roman" w:eastAsia="Times New Roman"/>
-          <w:sz w:val="24"/>
-          <w:lang w:val="pt-BR"/>
-        </w:rPr>
-        <w:t xml:space="preserve"> com os seis selos funcionais, o SELO_IFERT foi o de maior importância (39,1%), seguido do SELO_CARCACA_5_ESTRELAS (16,0%) e do SELO_CAR (14,8%). Na modelagem específica para os selos (seis selos funcionais; R² = 24,2%; R² ajustado = 20,0%), duas certificações apresentaram efeito significativo sobre o preço: SELO_IFERT (Fertilidade e Eficiência Reprodutiva), que agregou um prêmio médio de +R$ 5,67 por dose (p &lt; 0,001), e SELO_MATERNAL (Habilidade Materna e Desempenho da Fêmea), que agregou +R$ 2,28 por dose (p = 0,048; p = 0,051 com a distribuição t, no limite da significância). Os selos CAR, CARCAÇA 5 ESTRELAS, NOVILHAS e RP-ANCP não apresentaram efeito significativo.</w:t>
+        <w:t xml:space="preserve">No ranking do Random Forest com os seis selos funcionais, o SELO_IFERT foi o de maior importância (39,1%), seguido do SELO_CARCACA_5_ESTRELAS (16,0%) e do SELO_CAR (14,8%). Na modelagem específica para os selos (seis selos funcionais; R² = 24,2%; R² ajustado = 20,0%), duas certificações apresentaram efeito significativo sobre o preço: SELO_IFERT (Fertilidade e Eficiência Reprodutiva), que agregou um prêmio médio de +R$ 5,67 por dose (p &lt; 0,001), e SELO_MATERNAL (Habilidade Materna e Desempenho da Fêmea), que agregou +R$ 2,28 por dose (p = 0,048; p = 0,051 com a distribuição t, no limite da significância). Os selos CAR, CARCAÇA 5 ESTRELAS, NOVILHAS e RP-ANCP não apresentaram efeito significativo.</w:t>
       </w:r>
     </w:p>
     <w:p>
@@ -7590,7 +7941,7 @@
           <w:sz w:val="24"/>
           <w:lang w:val="pt-BR"/>
         </w:rPr>
-        <w:t>Esse resultado é coerente com a ideia de que, em mercados com incerteza sobre a qualidade, surgem instituições para contrabalançá-la, como garantias, marcas e certificações (AKERLOF, 1970). Os selos IFERT e MATERNAL podem ser entendidos dessa forma: resumem em um sinal visual um conjunto de informações que o comprador teria dificuldade de avaliar, aproximando-se dos sinais de mercado descritos por Spence (1973), atributos observáveis a partir dos quais o comprador infere características que não consegue verificar diretamente; nessa direção, em leilões, parte dos compradores de touros privilegia a apresentação visual do animal em relação às informações técnicas (SILVEIRA, 2022), e o baixo peso dos valores genéticos no preço pode estar ligado à desconfiança nesses dados (LOPES et al., 2023). Uma interpretação compatível com esses estudos, mas não testada aqui, é que os selos funcionem como heurísticas, que reduzem tarefas complexas de julgamento a operações mais simples (TVERSKY; KAHNEMAN, 1974), diante do grande número de DEPs, acurácias e percentis apresentados para cada touro. A ausência de efeito do selo RP-ANCP, por sua vez, pode refletir o pequeno número de touros com essa certificação na amostra (N = 7).</w:t>
+        <w:t xml:space="preserve">Esse resultado é coerente com a ideia de que, em mercados com incerteza sobre a qualidade, surgem instituições para contrabalançá-la, como garantias, marcas e certificações (AKERLOF, 1970). Os selos IFERT e MATERNAL podem ser entendidos dessa forma: resumem em um sinal visual um conjunto de informações que o comprador teria dificuldade de avaliar; nessa direção, em leilões, parte dos compradores de touros privilegia a apresentação visual do animal em relação às informações técnicas (SILVEIRA, 2022), e o baixo peso dos valores genéticos no preço pode estar ligado à desconfiança nesses dados (LOPES et al., 2023). Uma interpretação compatível com esses estudos, mas não testada aqui, é que os selos funcionem como heurísticas, que reduzem tarefas complexas de julgamento a operações mais simples (TVERSKY; KAHNEMAN, 1974), diante do grande número de DEPs, acurácias e percentis apresentados para cada touro. A ausência de efeito do selo RP-ANCP, por sua vez, pode refletir o pequeno número de touros com essa certificação na amostra (N = 7).</w:t>
       </w:r>
     </w:p>
     <w:p>
@@ -7804,6 +8155,26 @@
           <w:lang w:val="pt-BR"/>
         </w:rPr>
         <w:t xml:space="preserve">Tabela 3.</w:t>
+      </w:r>
+      <w:r>
+        <w:rPr>
+          <w:rFonts w:ascii="Times New Roman" w:hAnsi="Times New Roman" w:cs="Times New Roman" w:eastAsia="Times New Roman"/>
+          <w:b w:val="0"/>
+          <w:bCs/>
+          <w:sz w:val="24"/>
+          <w:lang w:val="pt-BR"/>
+        </w:rPr>
+        <w:t xml:space="preserve"/>
+      </w:r>
+      <w:r>
+        <w:rPr>
+          <w:rFonts w:ascii="Times New Roman" w:hAnsi="Times New Roman" w:cs="Times New Roman" w:eastAsia="Times New Roman"/>
+          <w:b w:val="0"/>
+          <w:bCs/>
+          <w:sz w:val="24"/>
+          <w:lang w:val="pt-BR"/>
+        </w:rPr>
+        <w:t xml:space="preserve"/>
       </w:r>
       <w:r>
         <w:rPr>
@@ -9149,47 +9520,6 @@
           <w:between w:space="0" w:sz="0" w:val="nil"/>
         </w:pBdr>
         <w:shd w:fill="auto" w:val="clear"/>
-        <w:spacing w:after="240" w:before="0" w:line="240" w:lineRule="auto"/>
-        <w:ind w:left="0" w:right="0" w:firstLine="0"/>
-        <w:jc w:val="center"/>
-        <w:rPr>
-          <w:rFonts w:ascii="Times New Roman" w:cs="Times New Roman" w:eastAsia="Times New Roman" w:hAnsi="Times New Roman"/>
-          <w:b w:val="0"/>
-          <w:bCs w:val="0"/>
-          <w:i w:val="0"/>
-          <w:iCs w:val="0"/>
-          <w:smallCaps w:val="0"/>
-          <w:strike w:val="0"/>
-          <w:color w:val="000000"/>
-          <w:sz w:val="24"/>
-          <w:szCs w:val="24"/>
-          <w:u w:val="none"/>
-          <w:shd w:fill="auto" w:val="clear"/>
-          <w:vertAlign w:val="baseline"/>
-        </w:rPr>
-      </w:pPr>
-      <w:r>
-        <w:rPr>
-          <w:rFonts w:ascii="Times New Roman" w:hAnsi="Times New Roman" w:cs="Times New Roman" w:eastAsia="Times New Roman"/>
-          <w:sz w:val="24"/>
-        </w:rPr>
-        <w:t xml:space="preserve">Fonte: elaborado pelos autores (2026).</w:t>
-      </w:r>
-    </w:p>
-    <w:p>
-      <w:pPr>
-        <w:keepNext w:val="0"/>
-        <w:keepLines w:val="0"/>
-        <w:pageBreakBefore w:val="0"/>
-        <w:widowControl w:val="1"/>
-        <w:pBdr>
-          <w:top w:space="0" w:sz="0" w:val="nil"/>
-          <w:left w:space="0" w:sz="0" w:val="nil"/>
-          <w:bottom w:space="0" w:sz="0" w:val="nil"/>
-          <w:right w:space="0" w:sz="0" w:val="nil"/>
-          <w:between w:space="0" w:sz="0" w:val="nil"/>
-        </w:pBdr>
-        <w:shd w:fill="auto" w:val="clear"/>
         <w:spacing w:after="0" w:before="0" w:line="240" w:lineRule="auto"/>
         <w:ind w:left="0" w:right="0" w:firstLine="0"/>
         <w:jc w:val="both"/>
@@ -9426,7 +9756,7 @@
           <w:sz w:val="24"/>
           <w:lang w:val="pt-BR"/>
         </w:rPr>
-        <w:t>Na análise das linhagens, os touros do TRONCO_EAO apresentaram o maior preço médio do catálogo (R$ 41,06, contra R$ 32,01 dos demais; ágio de +R$ 9,05), mas com mediana de apenas R$ 34,90, o que indica que a média é elevada por poucos animais de preço alto. No modelo com as sete linhagens, o coeficiente estimado para EAO foi de +R$ 9,61 por dose, sem significância estatística com erros-padrão robustos (p = 0,162), e nenhuma outra linhagem apresentou efeito significativo (modelo global: R² = 8,7%; p = 0,712). O pequeno número de touros da linhagem EAO (N = 5; 4,3% da amostra), cujo ágio decorre principalmente de dois animais (R$ 60,00 e R$ 48,00), impede afirmar a existência de um prêmio sistemático associado a ela.</w:t>
+        <w:t xml:space="preserve">Na análise das linhagens, os touros do TRONCO_EAO apresentaram o maior preço médio do catálogo (R$ 41,06, contra R$ 32,01 dos demais; ágio de +R$ 9,05), mas com mediana de apenas R$ 34,90, o que indica que a média é elevada por poucos animais de preço alto. No modelo com as sete linhagens, o coeficiente estimado para EAO foi de +R$ 9,61 por dose, sem significância estatística com erros-padrão robustos (p = 0,162), e nenhuma outra linhagem apresentou efeito significativo (modelo global: R² = 8,7%; p = 0,712). O pequeno número de touros da linhagem EAO (N = 5; 4,3% da amostra), cujo ágio decorre principalmente de dois animais (R$ 60,00 e R$ 48,00), impede afirmar a existência de um prêmio sistemático associado a ela.</w:t>
       </w:r>
     </w:p>
     <w:p>
@@ -9596,7 +9926,24 @@
           <w:sz w:val="24"/>
           <w:lang w:val="pt-BR"/>
         </w:rPr>
-        <w:t xml:space="preserve">Tabela 4. Síntese comparativa dos modelos hedônicos no catálogo CRV Lagoa (ANCP).</w:t>
+      </w:r>
+      <w:r>
+        <w:rPr>
+          <w:rFonts w:ascii="Times New Roman" w:hAnsi="Times New Roman" w:cs="Times New Roman" w:eastAsia="Times New Roman"/>
+          <w:b w:val="0"/>
+          <w:sz w:val="24"/>
+          <w:lang w:val="pt-BR"/>
+        </w:rPr>
+        <w:t xml:space="preserve">Tabela 4.</w:t>
+      </w:r>
+      <w:r>
+        <w:rPr>
+          <w:rFonts w:ascii="Times New Roman" w:hAnsi="Times New Roman" w:cs="Times New Roman" w:eastAsia="Times New Roman"/>
+          <w:b w:val="0"/>
+          <w:sz w:val="24"/>
+          <w:lang w:val="pt-BR"/>
+        </w:rPr>
+        <w:t xml:space="preserve"> Síntese comparativa dos modelos hedônicos no catálogo CRV Lagoa (ANCP).</w:t>
       </w:r>
     </w:p>
     <w:tbl>
@@ -10905,47 +11252,6 @@
         </w:tc>
       </w:tr>
     </w:tbl>
-    <w:p>
-      <w:pPr>
-        <w:keepNext w:val="0"/>
-        <w:keepLines w:val="0"/>
-        <w:pageBreakBefore w:val="0"/>
-        <w:widowControl w:val="1"/>
-        <w:pBdr>
-          <w:top w:space="0" w:sz="0" w:val="nil"/>
-          <w:left w:space="0" w:sz="0" w:val="nil"/>
-          <w:bottom w:space="0" w:sz="0" w:val="nil"/>
-          <w:right w:space="0" w:sz="0" w:val="nil"/>
-          <w:between w:space="0" w:sz="0" w:val="nil"/>
-        </w:pBdr>
-        <w:shd w:fill="auto" w:val="clear"/>
-        <w:spacing w:after="240" w:before="0" w:line="240" w:lineRule="auto"/>
-        <w:ind w:left="0" w:right="0" w:firstLine="0"/>
-        <w:jc w:val="center"/>
-        <w:rPr>
-          <w:rFonts w:ascii="Times New Roman" w:cs="Times New Roman" w:eastAsia="Times New Roman" w:hAnsi="Times New Roman"/>
-          <w:b w:val="0"/>
-          <w:bCs w:val="0"/>
-          <w:i w:val="0"/>
-          <w:iCs w:val="0"/>
-          <w:smallCaps w:val="0"/>
-          <w:strike w:val="0"/>
-          <w:color w:val="000000"/>
-          <w:sz w:val="24"/>
-          <w:szCs w:val="24"/>
-          <w:u w:val="none"/>
-          <w:shd w:fill="auto" w:val="clear"/>
-          <w:vertAlign w:val="baseline"/>
-        </w:rPr>
-      </w:pPr>
-      <w:r>
-        <w:rPr>
-          <w:rFonts w:ascii="Times New Roman" w:hAnsi="Times New Roman" w:cs="Times New Roman" w:eastAsia="Times New Roman"/>
-          <w:sz w:val="24"/>
-        </w:rPr>
-        <w:t xml:space="preserve">Fonte: elaborado pelos autores (2026).</w:t>
-      </w:r>
-    </w:p>
     <w:p>
       <w:pPr>
         <w:keepNext w:val="0"/>
@@ -11512,7 +11818,7 @@
     </w:p>
     <w:p>
       <w:pPr>
-        <w:keepNext w:val="0"/>
+        <w:keepNext w:val="1"/>
         <w:keepLines w:val="0"/>
         <w:pageBreakBefore w:val="0"/>
         <w:widowControl w:val="1"/>
@@ -11580,8 +11886,8 @@
     </w:p>
     <w:p>
       <w:pPr>
-        <w:keepNext w:val="0"/>
-        <w:keepLines w:val="0"/>
+        <w:keepNext w:val="1"/>
+        <w:keepLines w:val="1"/>
         <w:pageBreakBefore w:val="0"/>
         <w:widowControl w:val="1"/>
         <w:pBdr>
@@ -11659,7 +11965,7 @@
           <w:rFonts w:ascii="Times New Roman" w:hAnsi="Times New Roman" w:cs="Times New Roman" w:eastAsia="Times New Roman"/>
           <w:sz w:val="24"/>
         </w:rPr>
-        <w:t xml:space="preserve">Fonte: elaborado pelos autores (2026).</w:t>
+        <w:t xml:space="preserve">Fonte: elaborado pelo autor (2026).</w:t>
       </w:r>
     </w:p>
     <w:p>
@@ -11743,58 +12049,159 @@
           <w:sz w:val="24"/>
           <w:lang w:val="pt-BR"/>
         </w:rPr>
-        <w:t xml:space="preserve">Os valores de R² acima foram calculados na mesma amostra usada no ajuste. Fora dela, o poder preditivo foi baixo (Tabela 5): o </w:t>
-      </w:r>
-      <w:r>
-        <w:rPr>
-          <w:rFonts w:ascii="Times New Roman" w:hAnsi="Times New Roman" w:cs="Times New Roman" w:eastAsia="Times New Roman"/>
-          <w:i/>
-          <w:sz w:val="24"/>
-          <w:lang w:val="pt-BR"/>
-        </w:rPr>
-        <w:t xml:space="preserve">Random Forest</w:t>
-      </w:r>
-      <w:r>
-        <w:rPr>
-          <w:rFonts w:ascii="Times New Roman" w:hAnsi="Times New Roman" w:cs="Times New Roman" w:eastAsia="Times New Roman"/>
-          <w:sz w:val="24"/>
-          <w:lang w:val="pt-BR"/>
-        </w:rPr>
-        <w:t xml:space="preserve"> com as 31 variáveis, que explicou 88,1% da variação no treinamento, obteve R² </w:t>
-      </w:r>
-      <w:r>
-        <w:rPr>
-          <w:rFonts w:ascii="Times New Roman" w:hAnsi="Times New Roman" w:cs="Times New Roman" w:eastAsia="Times New Roman"/>
-          <w:i/>
-          <w:sz w:val="24"/>
-          <w:lang w:val="pt-BR"/>
-        </w:rPr>
-        <w:t xml:space="preserve">out-of-bag</w:t>
-      </w:r>
-      <w:r>
-        <w:rPr>
-          <w:rFonts w:ascii="Times New Roman" w:hAnsi="Times New Roman" w:cs="Times New Roman" w:eastAsia="Times New Roman"/>
-          <w:sz w:val="24"/>
-          <w:lang w:val="pt-BR"/>
-        </w:rPr>
-        <w:t xml:space="preserve"> de 8,5% e R² médio de -3,7% na validação cruzada, sinal de sobreajuste à amostra de 115 touros, e o modelo hedônico final passou de 28,6% para 4,1%, com erro médio de previsão (RMSE) de R$ 6,17 por dose, contra R$ 6,72 do modelo sem preditores. A especificação com o CAR na forma de indicador de Super Elite obteve R² de 10,1% (RMSE de R$ 5,95), mas, como o corte em 3% foi escolhido a partir dos próprios dados, esse valor não constitui validação independente. Os valores dos modelos hedônicos são, ainda, otimistas, porque suas variáveis foram selecionadas com a amostra completa: refazendo a seleção dentro de cada partição de treino (validação cruzada aninhada), o R² fora da amostra foi de -5,2% (RMSE de R$ 6,47), pouco melhor que o do modelo sem preditores (-10,4%; RMSE de R$ 6,72), e o conjunto do modelo final foi selecionado em apenas 2 das 50 partições. Na importância por permutação (Figura 4b), o SELO_IFERT foi o atributo mais relevante (queda de 0,15 no R² quando embaralhado), seguido, a grande distância, do CAR_TOP (0,03), como nos modelos econométricos; o SELO_MATERNAL, significativo nas regressões, praticamente não contribuiu para a previsão, assim como 3P_TOP e MP210_TOP, segunda e quarta variáveis pela redução de impureza no </w:t>
-      </w:r>
-      <w:r>
-        <w:rPr>
-          <w:rFonts w:ascii="Times New Roman" w:hAnsi="Times New Roman" w:cs="Times New Roman" w:eastAsia="Times New Roman"/>
-          <w:i/>
-          <w:sz w:val="24"/>
-          <w:lang w:val="pt-BR"/>
-        </w:rPr>
-        <w:t xml:space="preserve">Random Forest</w:t>
-      </w:r>
-      <w:r>
-        <w:rPr>
-          <w:rFonts w:ascii="Times New Roman" w:hAnsi="Times New Roman" w:cs="Times New Roman" w:eastAsia="Times New Roman"/>
-          <w:sz w:val="24"/>
-          <w:lang w:val="pt-BR"/>
-        </w:rPr>
-        <w:t xml:space="preserve"> com as 31 variáveis (Figura 4a).</w:t>
+        <w:t xml:space="preserve">Os valores de R² acima foram calculados na mesma amostra usada no ajuste. Fora dela, o poder preditivo foi baixo (Tabela 5): o Random Forest com as 31 variáveis, que explicou 88,1% da variação no treinamento, obteve R² out-of-bag de 8,5% e R² médio de -3,7% na validação cruzada, sinal de sobreajuste à amostra de 115 touros, e o modelo hedônico final passou de 28,6% para 4,1%, com erro médio de previsão (RMSE) de R$ 6,17 por dose, contra R$ 6,72 do modelo sem preditores. A especificação com o CAR na forma de indicador de Super Elite obteve R² de 10,1% (RMSE de R$ 5,95), mas, como o corte em 3% foi escolhido a partir dos próprios dados, esse valor não constitui validação independente. Os valores dos modelos hedônicos são, ainda, otimistas, porque suas variáveis foram selecionadas com a amostra completa: refazendo a seleção dentro de cada partição de treino (validação cruzada aninhada), o R² fora da amostra foi de -5,2% (RMSE de R$ 6,47), pouco melhor que o do modelo sem preditores (-10,4%; RMSE de R$ 6,72), e o conjunto do modelo final foi selecionado em apenas 2 das 50 partições. Na importância por permutação (Figura 4b), o SELO_IFERT foi o atributo mais relevante (queda de 0,15 no R² quando embaralhado), seguido, a grande distância, do CAR_TOP (0,03), como nos modelos econométricos; o SELO_MATERNAL, significativo nas regressões, praticamente não contribuiu para a previsão, assim como 3P_TOP e MP210_TOP, segunda e quarta variáveis pela redução de impureza no Random Forest com as 31 variáveis (Figura 4a).</w:t>
+      </w:r>
+    </w:p>
+    <w:p>
+      <w:pPr>
+        <w:keepNext w:val="1"/>
+        <w:keepLines w:val="0"/>
+        <w:pageBreakBefore w:val="0"/>
+        <w:widowControl w:val="1"/>
+        <w:pBdr>
+          <w:top w:space="0" w:sz="0" w:val="nil"/>
+          <w:left w:space="0" w:sz="0" w:val="nil"/>
+          <w:bottom w:space="0" w:sz="0" w:val="nil"/>
+          <w:right w:space="0" w:sz="0" w:val="nil"/>
+          <w:between w:space="0" w:sz="0" w:val="nil"/>
+        </w:pBdr>
+        <w:shd w:fill="auto" w:val="clear"/>
+        <w:spacing w:after="0" w:before="0" w:line="240" w:lineRule="auto"/>
+        <w:ind w:left="0" w:right="0" w:firstLine="0"/>
+        <w:jc w:val="center"/>
+        <w:rPr>
+          <w:rFonts w:ascii="Times New Roman" w:cs="Times New Roman" w:eastAsia="Times New Roman" w:hAnsi="Times New Roman"/>
+          <w:b w:val="0"/>
+          <w:bCs w:val="0"/>
+          <w:i w:val="0"/>
+          <w:iCs w:val="0"/>
+          <w:smallCaps w:val="0"/>
+          <w:strike w:val="0"/>
+          <w:color w:val="000000"/>
+          <w:sz w:val="24"/>
+          <w:szCs w:val="24"/>
+          <w:u w:val="none"/>
+          <w:shd w:fill="auto" w:val="clear"/>
+          <w:vertAlign w:val="baseline"/>
+        </w:rPr>
+      </w:pPr>
+      <w:r>
+        <w:drawing>
+          <wp:inline xmlns:a="http://schemas.openxmlformats.org/drawingml/2006/main" xmlns:pic="http://schemas.openxmlformats.org/drawingml/2006/picture">
+            <wp:extent cx="4500000" cy="4714285"/>
+            <wp:docPr id="3" name="Picture 3"/>
+            <wp:cNvGraphicFramePr>
+              <a:graphicFrameLocks noChangeAspect="1"/>
+            </wp:cNvGraphicFramePr>
+            <a:graphic>
+              <a:graphicData uri="http://schemas.openxmlformats.org/drawingml/2006/picture">
+                <pic:pic>
+                  <pic:nvPicPr>
+                    <pic:cNvPr id="0" name="fig_importancia_mdi_permutacao.png"/>
+                    <pic:cNvPicPr/>
+                  </pic:nvPicPr>
+                  <pic:blipFill>
+                    <a:blip r:embed="rId15"/>
+                    <a:stretch>
+                      <a:fillRect/>
+                    </a:stretch>
+                  </pic:blipFill>
+                  <pic:spPr>
+                    <a:xfrm>
+                      <a:off x="0" y="0"/>
+                      <a:ext cx="4500000" cy="4714285"/>
+                    </a:xfrm>
+                    <a:prstGeom prst="rect"/>
+                  </pic:spPr>
+                </pic:pic>
+              </a:graphicData>
+            </a:graphic>
+          </wp:inline>
+        </w:drawing>
+      </w:r>
+    </w:p>
+    <w:p>
+      <w:pPr>
+        <w:keepNext w:val="1"/>
+        <w:keepLines w:val="1"/>
+        <w:pageBreakBefore w:val="0"/>
+        <w:widowControl w:val="1"/>
+        <w:pBdr>
+          <w:top w:space="0" w:sz="0" w:val="nil"/>
+          <w:left w:space="0" w:sz="0" w:val="nil"/>
+          <w:bottom w:space="0" w:sz="0" w:val="nil"/>
+          <w:right w:space="0" w:sz="0" w:val="nil"/>
+          <w:between w:space="0" w:sz="0" w:val="nil"/>
+        </w:pBdr>
+        <w:shd w:fill="auto" w:val="clear"/>
+        <w:spacing w:after="0" w:before="0" w:line="240" w:lineRule="auto"/>
+        <w:ind w:left="0" w:right="0" w:firstLine="0"/>
+        <w:jc w:val="center"/>
+        <w:rPr>
+          <w:rFonts w:ascii="Times New Roman" w:cs="Times New Roman" w:eastAsia="Times New Roman" w:hAnsi="Times New Roman"/>
+          <w:b w:val="0"/>
+          <w:bCs w:val="0"/>
+          <w:i w:val="0"/>
+          <w:iCs w:val="0"/>
+          <w:smallCaps w:val="0"/>
+          <w:strike w:val="0"/>
+          <w:color w:val="000000"/>
+          <w:sz w:val="24"/>
+          <w:szCs w:val="24"/>
+          <w:u w:val="none"/>
+          <w:shd w:fill="auto" w:val="clear"/>
+          <w:vertAlign w:val="baseline"/>
+        </w:rPr>
+      </w:pPr>
+      <w:r>
+        <w:rPr>
+          <w:rFonts w:ascii="Times New Roman" w:hAnsi="Times New Roman" w:cs="Times New Roman" w:eastAsia="Times New Roman"/>
+          <w:b w:val="0"/>
+          <w:i w:val="0"/>
+          <w:sz w:val="24"/>
+        </w:rPr>
+        <w:t xml:space="preserve">Figura 4. Importância dos atributos no Random Forest com as 31 variáveis: (a) redução média de impureza (MDI), calculada na amostra de ajuste; (b) permutação, calculada nos dados de teste de uma validação cruzada com cinco partições e quatro repetições. Atributos agrupados por dimensão e ordenados pela MDI dentro de cada grupo.</w:t>
+      </w:r>
+    </w:p>
+    <w:p>
+      <w:pPr>
+        <w:keepNext w:val="0"/>
+        <w:keepLines w:val="0"/>
+        <w:pageBreakBefore w:val="0"/>
+        <w:widowControl w:val="1"/>
+        <w:pBdr>
+          <w:top w:space="0" w:sz="0" w:val="nil"/>
+          <w:left w:space="0" w:sz="0" w:val="nil"/>
+          <w:bottom w:space="0" w:sz="0" w:val="nil"/>
+          <w:right w:space="0" w:sz="0" w:val="nil"/>
+          <w:between w:space="0" w:sz="0" w:val="nil"/>
+        </w:pBdr>
+        <w:shd w:fill="auto" w:val="clear"/>
+        <w:spacing w:after="240" w:before="0" w:line="240" w:lineRule="auto"/>
+        <w:ind w:left="0" w:right="0" w:firstLine="0"/>
+        <w:jc w:val="center"/>
+        <w:rPr>
+          <w:rFonts w:ascii="Times New Roman" w:cs="Times New Roman" w:eastAsia="Times New Roman" w:hAnsi="Times New Roman"/>
+          <w:b w:val="0"/>
+          <w:bCs w:val="0"/>
+          <w:i w:val="0"/>
+          <w:iCs w:val="0"/>
+          <w:smallCaps w:val="0"/>
+          <w:strike w:val="0"/>
+          <w:color w:val="000000"/>
+          <w:sz w:val="24"/>
+          <w:szCs w:val="24"/>
+          <w:u w:val="none"/>
+          <w:shd w:fill="auto" w:val="clear"/>
+          <w:vertAlign w:val="baseline"/>
+        </w:rPr>
+      </w:pPr>
+      <w:r>
+        <w:rPr>
+          <w:rFonts w:ascii="Times New Roman" w:hAnsi="Times New Roman" w:cs="Times New Roman" w:eastAsia="Times New Roman"/>
+          <w:sz w:val="24"/>
+        </w:rPr>
+        <w:t xml:space="preserve">Fonte: elaborado pelo autor (2026).</w:t>
       </w:r>
     </w:p>
     <w:p>
@@ -11837,7 +12244,24 @@
           <w:sz w:val="24"/>
           <w:lang w:val="pt-BR"/>
         </w:rPr>
+      </w:r>
+      <w:r>
+        <w:rPr>
+          <w:rFonts w:ascii="Times New Roman" w:hAnsi="Times New Roman" w:cs="Times New Roman" w:eastAsia="Times New Roman"/>
+          <w:b w:val="0"/>
+          <w:sz w:val="24"/>
+          <w:lang w:val="pt-BR"/>
+        </w:rPr>
         <w:t xml:space="preserve">Tabela 5. Desempenho preditivo dos modelos dentro e fora da amostra (validação cruzada com cinco partições e dez repetições; N = 115).</w:t>
+      </w:r>
+      <w:r>
+        <w:rPr>
+          <w:rFonts w:ascii="Times New Roman" w:hAnsi="Times New Roman" w:cs="Times New Roman" w:eastAsia="Times New Roman"/>
+          <w:b w:val="0"/>
+          <w:sz w:val="24"/>
+          <w:lang w:val="pt-BR"/>
+        </w:rPr>
+        <w:t xml:space="preserve"/>
       </w:r>
     </w:p>
     <w:tbl>
@@ -12396,7 +12820,7 @@
                 <w:szCs w:val="20"/>
                 <w:lang w:val="pt-BR" w:eastAsia="pt-BR"/>
               </w:rPr>
-              <w:t>OLS - modelo final (validação aninhada)</w:t>
+              <w:t xml:space="preserve">OLS - modelo final (validação aninhada)</w:t>
             </w:r>
           </w:p>
         </w:tc>
@@ -12428,7 +12852,7 @@
                 <w:szCs w:val="20"/>
                 <w:lang w:val="pt-BR" w:eastAsia="pt-BR"/>
               </w:rPr>
-              <w:t>Seleção das variáveis refeita em cada partição</w:t>
+              <w:t xml:space="preserve">Seleção das variáveis refeita em cada partição</w:t>
             </w:r>
           </w:p>
         </w:tc>
@@ -12460,7 +12884,7 @@
                 <w:szCs w:val="20"/>
                 <w:lang w:val="pt-BR" w:eastAsia="pt-BR"/>
               </w:rPr>
-              <w:t>-</w:t>
+              <w:t xml:space="preserve">-</w:t>
             </w:r>
           </w:p>
         </w:tc>
@@ -12492,7 +12916,7 @@
                 <w:szCs w:val="20"/>
                 <w:lang w:val="pt-BR" w:eastAsia="pt-BR"/>
               </w:rPr>
-              <w:t>-5,2</w:t>
+              <w:t xml:space="preserve">-5,2</w:t>
             </w:r>
           </w:p>
         </w:tc>
@@ -12524,7 +12948,7 @@
                 <w:szCs w:val="20"/>
                 <w:lang w:val="pt-BR" w:eastAsia="pt-BR"/>
               </w:rPr>
-              <w:t>6,47</w:t>
+              <w:t xml:space="preserve">6,47</w:t>
             </w:r>
           </w:p>
         </w:tc>
@@ -12888,7 +13312,6 @@
             <w:r>
               <w:rPr>
                 <w:rFonts w:eastAsia="Times New Roman" w:cs="Times New Roman" w:ascii="Times New Roman" w:hAnsi="Times New Roman"/>
-                <w:i/>
                 <w:color w:val="000000"/>
                 <w:sz w:val="20"/>
                 <w:szCs w:val="20"/>
@@ -13024,217 +13447,6 @@
         </w:tc>
       </w:tr>
     </w:tbl>
-    <w:p>
-      <w:pPr>
-        <w:keepNext w:val="0"/>
-        <w:keepLines w:val="0"/>
-        <w:pageBreakBefore w:val="0"/>
-        <w:widowControl w:val="1"/>
-        <w:pBdr>
-          <w:top w:space="0" w:sz="0" w:val="nil"/>
-          <w:left w:space="0" w:sz="0" w:val="nil"/>
-          <w:bottom w:space="0" w:sz="0" w:val="nil"/>
-          <w:right w:space="0" w:sz="0" w:val="nil"/>
-          <w:between w:space="0" w:sz="0" w:val="nil"/>
-        </w:pBdr>
-        <w:shd w:fill="auto" w:val="clear"/>
-        <w:spacing w:after="240" w:before="0" w:line="240" w:lineRule="auto"/>
-        <w:ind w:left="0" w:right="0" w:firstLine="0"/>
-        <w:jc w:val="center"/>
-        <w:rPr>
-          <w:rFonts w:ascii="Times New Roman" w:cs="Times New Roman" w:eastAsia="Times New Roman" w:hAnsi="Times New Roman"/>
-          <w:b w:val="0"/>
-          <w:bCs w:val="0"/>
-          <w:i w:val="0"/>
-          <w:iCs w:val="0"/>
-          <w:smallCaps w:val="0"/>
-          <w:strike w:val="0"/>
-          <w:color w:val="000000"/>
-          <w:sz w:val="24"/>
-          <w:szCs w:val="24"/>
-          <w:u w:val="none"/>
-          <w:shd w:fill="auto" w:val="clear"/>
-          <w:vertAlign w:val="baseline"/>
-        </w:rPr>
-      </w:pPr>
-      <w:r>
-        <w:rPr>
-          <w:rFonts w:ascii="Times New Roman" w:hAnsi="Times New Roman" w:cs="Times New Roman" w:eastAsia="Times New Roman"/>
-          <w:sz w:val="24"/>
-        </w:rPr>
-        <w:t xml:space="preserve">Fonte: elaborado pelos autores (2026).</w:t>
-      </w:r>
-    </w:p>
-    <w:p>
-      <w:pPr>
-        <w:keepNext w:val="0"/>
-        <w:keepLines w:val="0"/>
-        <w:pageBreakBefore w:val="0"/>
-        <w:widowControl w:val="1"/>
-        <w:pBdr>
-          <w:top w:space="0" w:sz="0" w:val="nil"/>
-          <w:left w:space="0" w:sz="0" w:val="nil"/>
-          <w:bottom w:space="0" w:sz="0" w:val="nil"/>
-          <w:right w:space="0" w:sz="0" w:val="nil"/>
-          <w:between w:space="0" w:sz="0" w:val="nil"/>
-        </w:pBdr>
-        <w:shd w:fill="auto" w:val="clear"/>
-        <w:spacing w:after="0" w:before="0" w:line="240" w:lineRule="auto"/>
-        <w:ind w:left="0" w:right="0" w:firstLine="0"/>
-        <w:jc w:val="center"/>
-        <w:rPr>
-          <w:rFonts w:ascii="Times New Roman" w:cs="Times New Roman" w:eastAsia="Times New Roman" w:hAnsi="Times New Roman"/>
-          <w:b w:val="0"/>
-          <w:bCs w:val="0"/>
-          <w:i w:val="0"/>
-          <w:iCs w:val="0"/>
-          <w:smallCaps w:val="0"/>
-          <w:strike w:val="0"/>
-          <w:color w:val="000000"/>
-          <w:sz w:val="24"/>
-          <w:szCs w:val="24"/>
-          <w:u w:val="none"/>
-          <w:shd w:fill="auto" w:val="clear"/>
-          <w:vertAlign w:val="baseline"/>
-        </w:rPr>
-      </w:pPr>
-      <w:r>
-        <w:drawing>
-          <wp:inline xmlns:a="http://schemas.openxmlformats.org/drawingml/2006/main" xmlns:pic="http://schemas.openxmlformats.org/drawingml/2006/picture">
-            <wp:extent cx="5760000" cy="6034286"/>
-            <wp:docPr id="3" name="Picture 3"/>
-            <wp:cNvGraphicFramePr>
-              <a:graphicFrameLocks noChangeAspect="1"/>
-            </wp:cNvGraphicFramePr>
-            <a:graphic>
-              <a:graphicData uri="http://schemas.openxmlformats.org/drawingml/2006/picture">
-                <pic:pic>
-                  <pic:nvPicPr>
-                    <pic:cNvPr id="0" name="fig_importancia_mdi_permutacao.png"/>
-                    <pic:cNvPicPr/>
-                  </pic:nvPicPr>
-                  <pic:blipFill>
-                    <a:blip r:embed="rId15"/>
-                    <a:stretch>
-                      <a:fillRect/>
-                    </a:stretch>
-                  </pic:blipFill>
-                  <pic:spPr>
-                    <a:xfrm>
-                      <a:off x="0" y="0"/>
-                      <a:ext cx="5760000" cy="6034286"/>
-                    </a:xfrm>
-                    <a:prstGeom prst="rect"/>
-                  </pic:spPr>
-                </pic:pic>
-              </a:graphicData>
-            </a:graphic>
-          </wp:inline>
-        </w:drawing>
-      </w:r>
-    </w:p>
-    <w:p>
-      <w:pPr>
-        <w:keepNext w:val="0"/>
-        <w:keepLines w:val="0"/>
-        <w:pageBreakBefore w:val="0"/>
-        <w:widowControl w:val="1"/>
-        <w:pBdr>
-          <w:top w:space="0" w:sz="0" w:val="nil"/>
-          <w:left w:space="0" w:sz="0" w:val="nil"/>
-          <w:bottom w:space="0" w:sz="0" w:val="nil"/>
-          <w:right w:space="0" w:sz="0" w:val="nil"/>
-          <w:between w:space="0" w:sz="0" w:val="nil"/>
-        </w:pBdr>
-        <w:shd w:fill="auto" w:val="clear"/>
-        <w:spacing w:after="0" w:before="0" w:line="240" w:lineRule="auto"/>
-        <w:ind w:left="0" w:right="0" w:firstLine="0"/>
-        <w:jc w:val="center"/>
-        <w:rPr>
-          <w:rFonts w:ascii="Times New Roman" w:cs="Times New Roman" w:eastAsia="Times New Roman" w:hAnsi="Times New Roman"/>
-          <w:b w:val="0"/>
-          <w:bCs w:val="0"/>
-          <w:i w:val="0"/>
-          <w:iCs w:val="0"/>
-          <w:smallCaps w:val="0"/>
-          <w:strike w:val="0"/>
-          <w:color w:val="000000"/>
-          <w:sz w:val="24"/>
-          <w:szCs w:val="24"/>
-          <w:u w:val="none"/>
-          <w:shd w:fill="auto" w:val="clear"/>
-          <w:vertAlign w:val="baseline"/>
-        </w:rPr>
-      </w:pPr>
-      <w:r>
-        <w:rPr>
-          <w:rFonts w:ascii="Times New Roman" w:hAnsi="Times New Roman" w:cs="Times New Roman" w:eastAsia="Times New Roman"/>
-          <w:b w:val="0"/>
-          <w:i w:val="0"/>
-          <w:sz w:val="24"/>
-        </w:rPr>
-        <w:t xml:space="preserve">Figura 4. Importância dos atributos no </w:t>
-      </w:r>
-      <w:r>
-        <w:rPr>
-          <w:rFonts w:ascii="Times New Roman" w:hAnsi="Times New Roman" w:cs="Times New Roman" w:eastAsia="Times New Roman"/>
-          <w:b w:val="0"/>
-          <w:i/>
-          <w:sz w:val="24"/>
-        </w:rPr>
-        <w:t xml:space="preserve">Random Forest</w:t>
-      </w:r>
-      <w:r>
-        <w:rPr>
-          <w:rFonts w:ascii="Times New Roman" w:hAnsi="Times New Roman" w:cs="Times New Roman" w:eastAsia="Times New Roman"/>
-          <w:b w:val="0"/>
-          <w:i w:val="0"/>
-          <w:sz w:val="24"/>
-        </w:rPr>
-        <w:t xml:space="preserve"> com as 31 variáveis: (a) redução média de impureza (MDI), calculada na amostra de ajuste; (b) permutação, calculada nos dados de teste de uma validação cruzada com cinco partições e quatro repetições. Atributos agrupados por dimensão e ordenados pela MDI dentro de cada grupo.</w:t>
-      </w:r>
-    </w:p>
-    <w:p>
-      <w:pPr>
-        <w:keepNext w:val="0"/>
-        <w:keepLines w:val="0"/>
-        <w:pageBreakBefore w:val="0"/>
-        <w:widowControl w:val="1"/>
-        <w:pBdr>
-          <w:top w:space="0" w:sz="0" w:val="nil"/>
-          <w:left w:space="0" w:sz="0" w:val="nil"/>
-          <w:bottom w:space="0" w:sz="0" w:val="nil"/>
-          <w:right w:space="0" w:sz="0" w:val="nil"/>
-          <w:between w:space="0" w:sz="0" w:val="nil"/>
-        </w:pBdr>
-        <w:shd w:fill="auto" w:val="clear"/>
-        <w:spacing w:after="240" w:before="0" w:line="240" w:lineRule="auto"/>
-        <w:ind w:left="0" w:right="0" w:firstLine="0"/>
-        <w:jc w:val="center"/>
-        <w:rPr>
-          <w:rFonts w:ascii="Times New Roman" w:cs="Times New Roman" w:eastAsia="Times New Roman" w:hAnsi="Times New Roman"/>
-          <w:b w:val="0"/>
-          <w:bCs w:val="0"/>
-          <w:i w:val="0"/>
-          <w:iCs w:val="0"/>
-          <w:smallCaps w:val="0"/>
-          <w:strike w:val="0"/>
-          <w:color w:val="000000"/>
-          <w:sz w:val="24"/>
-          <w:szCs w:val="24"/>
-          <w:u w:val="none"/>
-          <w:shd w:fill="auto" w:val="clear"/>
-          <w:vertAlign w:val="baseline"/>
-        </w:rPr>
-      </w:pPr>
-      <w:r>
-        <w:rPr>
-          <w:rFonts w:ascii="Times New Roman" w:hAnsi="Times New Roman" w:cs="Times New Roman" w:eastAsia="Times New Roman"/>
-          <w:sz w:val="24"/>
-        </w:rPr>
-        <w:t xml:space="preserve">Fonte: elaborado pelos autores (2026).</w:t>
-      </w:r>
-    </w:p>
     <w:p>
       <w:pPr>
         <w:keepNext w:val="0"/>
@@ -13604,22 +13816,7 @@
           <w:rFonts w:ascii="Times New Roman" w:hAnsi="Times New Roman" w:cs="Times New Roman" w:eastAsia="Times New Roman"/>
           <w:sz w:val="24"/>
         </w:rPr>
-        <w:t xml:space="preserve">A combinação do algoritmo </w:t>
-      </w:r>
-      <w:r>
-        <w:rPr>
-          <w:rFonts w:ascii="Times New Roman" w:hAnsi="Times New Roman" w:cs="Times New Roman" w:eastAsia="Times New Roman"/>
-          <w:i/>
-          <w:sz w:val="24"/>
-        </w:rPr>
-        <w:t xml:space="preserve">Random Forest</w:t>
-      </w:r>
-      <w:r>
-        <w:rPr>
-          <w:rFonts w:ascii="Times New Roman" w:hAnsi="Times New Roman" w:cs="Times New Roman" w:eastAsia="Times New Roman"/>
-          <w:sz w:val="24"/>
-        </w:rPr>
-        <w:t xml:space="preserve"> com a regressão hedônica permite identificar e quantificar os atributos associados ao preço e constitui uma abordagem de ciência de dados replicável para outras centrais e raças.</w:t>
+        <w:t xml:space="preserve">A combinação do algoritmo Random Forest com a regressão hedônica permite identificar e quantificar os atributos associados ao preço e constitui uma abordagem de ciência de dados replicável para outras centrais e raças.</w:t>
       </w:r>
     </w:p>
     <w:p>
@@ -13702,22 +13899,7 @@
           <w:rFonts w:ascii="Times New Roman" w:hAnsi="Times New Roman" w:cs="Times New Roman" w:eastAsia="Times New Roman"/>
           <w:sz w:val="24"/>
         </w:rPr>
-        <w:t xml:space="preserve">AKERLOF, G. A. The market for “lemons”: quality uncertainty and the market mechanism. </w:t>
-      </w:r>
-      <w:r>
-        <w:rPr>
-          <w:rFonts w:ascii="Times New Roman" w:hAnsi="Times New Roman" w:cs="Times New Roman" w:eastAsia="Times New Roman"/>
-          <w:b/>
-          <w:sz w:val="24"/>
-        </w:rPr>
-        <w:t xml:space="preserve">The Quarterly Journal of Economics</w:t>
-      </w:r>
-      <w:r>
-        <w:rPr>
-          <w:rFonts w:ascii="Times New Roman" w:hAnsi="Times New Roman" w:cs="Times New Roman" w:eastAsia="Times New Roman"/>
-          <w:sz w:val="24"/>
-        </w:rPr>
-        <w:t xml:space="preserve">, v. 84, n. 3, p. 488-500, 1970. DOI: https://doi.org/10.2307/1879431.</w:t>
+        <w:t xml:space="preserve">AKERLOF, G. A. The market for “lemons”: quality uncertainty and the market mechanism. The Quarterly Journal of Economics, v. 84, n. 3, p. 488-500, 1970. DOI: https://doi.org/10.2307/1879431.</w:t>
       </w:r>
     </w:p>
     <w:p>
@@ -13758,22 +13940,7 @@
           <w:rFonts w:ascii="Times New Roman" w:hAnsi="Times New Roman" w:cs="Times New Roman" w:eastAsia="Times New Roman"/>
           <w:sz w:val="24"/>
         </w:rPr>
-        <w:t xml:space="preserve">AMARAL, T. B.; ROSA, G. J. de M.; VISOLI, M. C.; DIAS, F. M. G. N. Ciência de dados aplicada à pecuária de corte. In: BASSOI, L. H.; BERNARDI, A. C. de C.; VAZ, C. M. P.; PIRES, J. L. F.; GEBLER, L.; JORGE, L. A. de C.; INAMASU, R. Y. (ed.). </w:t>
-      </w:r>
-      <w:r>
-        <w:rPr>
-          <w:rFonts w:ascii="Times New Roman" w:hAnsi="Times New Roman" w:cs="Times New Roman" w:eastAsia="Times New Roman"/>
-          <w:b/>
-          <w:sz w:val="24"/>
-        </w:rPr>
-        <w:t xml:space="preserve">Agricultura de precisão</w:t>
-      </w:r>
-      <w:r>
-        <w:rPr>
-          <w:rFonts w:ascii="Times New Roman" w:hAnsi="Times New Roman" w:cs="Times New Roman" w:eastAsia="Times New Roman"/>
-          <w:sz w:val="24"/>
-        </w:rPr>
-        <w:t xml:space="preserve">: um novo olhar na era digital. São Carlos: Cubo, 2024. p. 647-656. DOI: https://doi.org/10.4322/978-65-86819-38-0.1000063.</w:t>
+        <w:t xml:space="preserve">AMARAL, T. B.; ROSA, G. J. de M.; VISOLI, M. C.; DIAS, F. M. G. N. Ciência de dados aplicada à pecuária de corte. In: BASSOI, L. H.; BERNARDI, A. C. de C.; VAZ, C. M. P.; PIRES, J. L. F.; GEBLER, L.; JORGE, L. A. de C.; INAMASU, R. Y. (ed.). Agricultura de precisão: um novo olhar na era digital. São Carlos: Cubo, 2024. p. 647-656. DOI: https://doi.org/10.4322/978-65-86819-38-0.1000063.</w:t>
       </w:r>
     </w:p>
     <w:p>
@@ -13814,22 +13981,7 @@
           <w:rFonts w:ascii="Times New Roman" w:hAnsi="Times New Roman" w:cs="Times New Roman" w:eastAsia="Times New Roman"/>
           <w:sz w:val="24"/>
         </w:rPr>
-        <w:t xml:space="preserve">AN, S.; SONG, Y.; JANG, H.; AHN, K. Toward transparent and accurate housing price appraisal: hedonic price models versus machine learning algorithms. </w:t>
-      </w:r>
-      <w:r>
-        <w:rPr>
-          <w:rFonts w:ascii="Times New Roman" w:hAnsi="Times New Roman" w:cs="Times New Roman" w:eastAsia="Times New Roman"/>
-          <w:b/>
-          <w:sz w:val="24"/>
-        </w:rPr>
-        <w:t xml:space="preserve">Financial Innovation</w:t>
-      </w:r>
-      <w:r>
-        <w:rPr>
-          <w:rFonts w:ascii="Times New Roman" w:hAnsi="Times New Roman" w:cs="Times New Roman" w:eastAsia="Times New Roman"/>
-          <w:sz w:val="24"/>
-        </w:rPr>
-        <w:t xml:space="preserve">, v. 11, art. 141, 2025. DOI: https://doi.org/10.1186/s40854-025-00874-w.</w:t>
+        <w:t xml:space="preserve">AN, S.; SONG, Y.; JANG, H.; AHN, K. Toward transparent and accurate housing price appraisal: hedonic price models versus machine learning algorithms. Financial Innovation, v. 11, 141, 2025. DOI: https://doi.org/10.1186/s40854-025-00874-w.</w:t>
       </w:r>
     </w:p>
     <w:p>
@@ -13870,22 +14022,7 @@
           <w:rFonts w:ascii="Times New Roman" w:hAnsi="Times New Roman" w:cs="Times New Roman" w:eastAsia="Times New Roman"/>
           <w:sz w:val="24"/>
         </w:rPr>
-        <w:t xml:space="preserve">BASSO, M. F.; NEVES, M. F.; GROSSI-DE-SÁ, M. F. Agriculture evolution, sustainability and trends, focusing on Brazilian agribusiness: a review. </w:t>
-      </w:r>
-      <w:r>
-        <w:rPr>
-          <w:rFonts w:ascii="Times New Roman" w:hAnsi="Times New Roman" w:cs="Times New Roman" w:eastAsia="Times New Roman"/>
-          <w:b/>
-          <w:sz w:val="24"/>
-        </w:rPr>
-        <w:t xml:space="preserve">Frontiers in Sustainable Food Systems</w:t>
-      </w:r>
-      <w:r>
-        <w:rPr>
-          <w:rFonts w:ascii="Times New Roman" w:hAnsi="Times New Roman" w:cs="Times New Roman" w:eastAsia="Times New Roman"/>
-          <w:sz w:val="24"/>
-        </w:rPr>
-        <w:t xml:space="preserve">, v. 7, art. 1296337, 2024. DOI: https://doi.org/10.3389/fsufs.2023.1296337.</w:t>
+        <w:t xml:space="preserve">BASSO, M. F.; NEVES, M. F.; GROSSI-DE-SÁ, M. F. Agriculture evolution, sustainability and trends, focusing on Brazilian agribusiness: a review. Frontiers in Sustainable Food Systems, v. 7, 1296337, 2024. DOI: https://doi.org/10.3389/fsufs.2023.1296337.</w:t>
       </w:r>
     </w:p>
     <w:p>
@@ -13926,22 +14063,7 @@
           <w:rFonts w:ascii="Times New Roman" w:hAnsi="Times New Roman" w:cs="Times New Roman" w:eastAsia="Times New Roman"/>
           <w:sz w:val="24"/>
         </w:rPr>
-        <w:t xml:space="preserve">BRAGA, A. P.; CARNEIRO JUNIOR, J. M.; ROSA, A. do N. F.; PINHEIRO, A. K.; SILVA, M. S. Efeitos de ambiente na definição de valor de touros Nelore comercializados em leilões no Brasil. In: SEMINÁRIO DA EMBRAPA ACRE DE INICIAÇÃO CIENTÍFICA E PÓS-GRADUAÇÃO, 5., 2022, Rio Branco. </w:t>
-      </w:r>
-      <w:r>
-        <w:rPr>
-          <w:rFonts w:ascii="Times New Roman" w:hAnsi="Times New Roman" w:cs="Times New Roman" w:eastAsia="Times New Roman"/>
-          <w:b/>
-          <w:sz w:val="24"/>
-        </w:rPr>
-        <w:t xml:space="preserve">Anais</w:t>
-      </w:r>
-      <w:r>
-        <w:rPr>
-          <w:rFonts w:ascii="Times New Roman" w:hAnsi="Times New Roman" w:cs="Times New Roman" w:eastAsia="Times New Roman"/>
-          <w:sz w:val="24"/>
-        </w:rPr>
-        <w:t xml:space="preserve"> [...]: o papel da tecnologia agrícola na segurança alimentar. Rio Branco: Embrapa Acre, 2023. p. 135-141. Disponível em: https://www.alice.cnptia.embrapa.br/handle/doc/1157483. Acesso em: 8 out. 2026.</w:t>
+        <w:t xml:space="preserve">BRAGA, A. P.; CARNEIRO JUNIOR, J. M.; ROSA, A. do N. F.; PINHEIRO, A. K.; SILVA, M. S. Efeitos de ambiente na definição de valor de touros Nelore comercializados em leilões no Brasil. In: SEMINÁRIO DA EMBRAPA ACRE DE INICIAÇÃO CIENTÍFICA E PÓS-GRADUAÇÃO, 5., 2022, Rio Branco. O papel da tecnologia agrícola na segurança alimentar: anais. Rio Branco: Embrapa Acre, 2023. p. 135-141. Disponível em: https://www.alice.cnptia.embrapa.br/handle/doc/1157483. Acesso em: 8 out. 2026.</w:t>
       </w:r>
     </w:p>
     <w:p>
@@ -13982,22 +14104,7 @@
           <w:rFonts w:ascii="Times New Roman" w:hAnsi="Times New Roman" w:cs="Times New Roman" w:eastAsia="Times New Roman"/>
           <w:sz w:val="24"/>
         </w:rPr>
-        <w:t xml:space="preserve">BREIMAN, L. Random forests. </w:t>
-      </w:r>
-      <w:r>
-        <w:rPr>
-          <w:rFonts w:ascii="Times New Roman" w:hAnsi="Times New Roman" w:cs="Times New Roman" w:eastAsia="Times New Roman"/>
-          <w:b/>
-          <w:sz w:val="24"/>
-        </w:rPr>
-        <w:t xml:space="preserve">Machine Learning</w:t>
-      </w:r>
-      <w:r>
-        <w:rPr>
-          <w:rFonts w:ascii="Times New Roman" w:hAnsi="Times New Roman" w:cs="Times New Roman" w:eastAsia="Times New Roman"/>
-          <w:sz w:val="24"/>
-        </w:rPr>
-        <w:t xml:space="preserve">, v. 45, n. 1, p. 5-32, 2001. DOI: https://doi.org/10.1023/A:1010933404324.</w:t>
+        <w:t xml:space="preserve">BREIMAN, L. Random forests. Machine Learning, v. 45, n. 1, p. 5-32, 2001. DOI: https://doi.org/10.1023/A:1010933404324.</w:t>
       </w:r>
     </w:p>
     <w:p>
@@ -14038,22 +14145,7 @@
           <w:rFonts w:ascii="Times New Roman" w:hAnsi="Times New Roman" w:cs="Times New Roman" w:eastAsia="Times New Roman"/>
           <w:sz w:val="24"/>
         </w:rPr>
-        <w:t xml:space="preserve">CARNEIRO JUNIOR, J. M.; BRAGA, A. P.; PINHEIRO, A. K.; CARNEIRO, G. A. M.; AGUIAR, E. F. P. de; SILVA, M. S.; CAVALCANTE, F. A. Correlação entre potencial genético e preço de arremate de touros Nelore em leilões. In: SEMINÁRIO DA EMBRAPA ACRE DE INICIAÇÃO CIENTÍFICA E PÓS-GRADUAÇÃO, 6., 2023, Rio Branco. </w:t>
-      </w:r>
-      <w:r>
-        <w:rPr>
-          <w:rFonts w:ascii="Times New Roman" w:hAnsi="Times New Roman" w:cs="Times New Roman" w:eastAsia="Times New Roman"/>
-          <w:b/>
-          <w:sz w:val="24"/>
-        </w:rPr>
-        <w:t xml:space="preserve">Anais</w:t>
-      </w:r>
-      <w:r>
-        <w:rPr>
-          <w:rFonts w:ascii="Times New Roman" w:hAnsi="Times New Roman" w:cs="Times New Roman" w:eastAsia="Times New Roman"/>
-          <w:sz w:val="24"/>
-        </w:rPr>
-        <w:t xml:space="preserve"> [...]: sistemas agroalimentares sustentáveis e o futuro da Amazônia. Rio Branco: Embrapa Acre, 2024. p. 81-85. Disponível em: https://www.alice.cnptia.embrapa.br/handle/doc/1163825. Acesso em: 8 out. 2026.</w:t>
+        <w:t xml:space="preserve">CARNEIRO JUNIOR, J. M.; BRAGA, A. P.; PINHEIRO, A. K.; CARNEIRO, G. A. M.; AGUIAR, E. F. P. de; SILVA, M. S.; CAVALCANTE, F. A. Correlação entre potencial genético e preço de arremate de touros Nelore em leilões. In: SEMINÁRIO DA EMBRAPA ACRE DE INICIAÇÃO CIENTÍFICA E PÓS-GRADUAÇÃO, 6., 2023, Rio Branco. Sistemas agroalimentares sustentáveis e o futuro da Amazônia: anais. Rio Branco: Embrapa Acre, 2024. p. 81-85. Disponível em: https://www.alice.cnptia.embrapa.br/handle/doc/1163825. Acesso em: 8 out. 2026.</w:t>
       </w:r>
     </w:p>
     <w:p>
@@ -14094,22 +14186,7 @@
           <w:rFonts w:ascii="Times New Roman" w:hAnsi="Times New Roman" w:cs="Times New Roman" w:eastAsia="Times New Roman"/>
           <w:sz w:val="24"/>
         </w:rPr>
-        <w:t xml:space="preserve">CARVALHO, G. R.; FARIA, W. R.; NARDY, V. P. D. R.; BETARELLI JUNIOR, A. A. Hedonic pricing analysis for semen of dairy bulls in Brazil. </w:t>
-      </w:r>
-      <w:r>
-        <w:rPr>
-          <w:rFonts w:ascii="Times New Roman" w:hAnsi="Times New Roman" w:cs="Times New Roman" w:eastAsia="Times New Roman"/>
-          <w:b/>
-          <w:sz w:val="24"/>
-        </w:rPr>
-        <w:t xml:space="preserve">PLoS ONE</w:t>
-      </w:r>
-      <w:r>
-        <w:rPr>
-          <w:rFonts w:ascii="Times New Roman" w:hAnsi="Times New Roman" w:cs="Times New Roman" w:eastAsia="Times New Roman"/>
-          <w:sz w:val="24"/>
-        </w:rPr>
-        <w:t xml:space="preserve">, v. 17, n. 4, e0267109, 2022. DOI: https://doi.org/10.1371/journal.pone.0267109.</w:t>
+        <w:t xml:space="preserve">CARVALHO, G. R.; FARIA, W. R.; NARDY, V. P. D. R.; BETARELLI JUNIOR, A. A. Hedonic pricing analysis for semen of dairy bulls in Brazil. PLoS ONE, v. 17, n. 4, e0267109, 2022. DOI: https://doi.org/10.1371/journal.pone.0267109.</w:t>
       </w:r>
     </w:p>
     <w:p>
@@ -14150,22 +14227,7 @@
           <w:rFonts w:ascii="Times New Roman" w:hAnsi="Times New Roman" w:cs="Times New Roman" w:eastAsia="Times New Roman"/>
           <w:sz w:val="24"/>
         </w:rPr>
-        <w:t xml:space="preserve">CONFEDERAÇÃO DA AGRICULTURA E PECUÁRIA DO BRASIL (CNA). </w:t>
-      </w:r>
-      <w:r>
-        <w:rPr>
-          <w:rFonts w:ascii="Times New Roman" w:hAnsi="Times New Roman" w:cs="Times New Roman" w:eastAsia="Times New Roman"/>
-          <w:b/>
-          <w:sz w:val="24"/>
-        </w:rPr>
-        <w:t xml:space="preserve">PIB do agronegócio fecha 2024 com crescimento de 1,81%</w:t>
-      </w:r>
-      <w:r>
-        <w:rPr>
-          <w:rFonts w:ascii="Times New Roman" w:hAnsi="Times New Roman" w:cs="Times New Roman" w:eastAsia="Times New Roman"/>
-          <w:sz w:val="24"/>
-        </w:rPr>
-        <w:t xml:space="preserve">. Brasília: CNA, 9 abr. 2025. Disponível em: https://cnabrasil.org.br/noticias/pib-do-agronegocio-fecha-2024-com-crescimento-de-1-81. Acesso em: 8 out. 2026.</w:t>
+        <w:t xml:space="preserve">CNA – CONFEDERAÇÃO DA AGRICULTURA E PECUÁRIA DO BRASIL. PIB do agronegócio fecha 2024 com crescimento de 1,81%. Brasília: CNA, 9 abr. 2025. Disponível em: https://cnabrasil.org.br/noticias/pib-do-agronegocio-fecha-2024-com-crescimento-de-1-81. Acesso em: 8 out. 2026.</w:t>
       </w:r>
     </w:p>
     <w:p>
@@ -14206,22 +14268,7 @@
           <w:rFonts w:ascii="Times New Roman" w:hAnsi="Times New Roman" w:cs="Times New Roman" w:eastAsia="Times New Roman"/>
           <w:sz w:val="24"/>
         </w:rPr>
-        <w:t xml:space="preserve">JOSEPH, K.; SANDERS, D. R.; NAIR, J.; PRILL-ADAMS, A. L. Buyer valuation of Angus bull attributes in Wisconsin. </w:t>
-      </w:r>
-      <w:r>
-        <w:rPr>
-          <w:rFonts w:ascii="Times New Roman" w:hAnsi="Times New Roman" w:cs="Times New Roman" w:eastAsia="Times New Roman"/>
-          <w:b/>
-          <w:sz w:val="24"/>
-        </w:rPr>
-        <w:t xml:space="preserve">Journal of Agricultural and Applied Economics</w:t>
-      </w:r>
-      <w:r>
-        <w:rPr>
-          <w:rFonts w:ascii="Times New Roman" w:hAnsi="Times New Roman" w:cs="Times New Roman" w:eastAsia="Times New Roman"/>
-          <w:sz w:val="24"/>
-        </w:rPr>
-        <w:t xml:space="preserve">, v. 56, n. 4, p. 621-634, 2024. DOI: https://doi.org/10.1017/aae.2024.28.</w:t>
+        <w:t xml:space="preserve">JOSEPH, K.; SANDERS, D. R.; NAIR, J.; PRILL-ADAMS, A. L. Buyer valuation of Angus bull attributes in Wisconsin. Journal of Agricultural and Applied Economics, v. 56, n. 4, p. 621-634, 2024. DOI: https://doi.org/10.1017/aae.2024.28.</w:t>
       </w:r>
     </w:p>
     <w:p>
@@ -14262,22 +14309,7 @@
           <w:rFonts w:ascii="Times New Roman" w:hAnsi="Times New Roman" w:cs="Times New Roman" w:eastAsia="Times New Roman"/>
           <w:sz w:val="24"/>
         </w:rPr>
-        <w:t xml:space="preserve">LOPES, J. F.; CANOZZI, M. E. A.; GONÇALVES, T. L.; ROCHA, M. K. da; SARTORI, E. D.; SESSIM, A. G.; PEREIRA, I. P.; AGUIAR, L. K. de; PAPARAS, D.; MENEGASSI, S. R. O.; KOETZ JUNIOR, C.; OAIGEN, R. P.; ZAGO, D.; BARCELLOS, J. O. J. Price determinants of beef bulls sold in livestock auctions. </w:t>
-      </w:r>
-      <w:r>
-        <w:rPr>
-          <w:rFonts w:ascii="Times New Roman" w:hAnsi="Times New Roman" w:cs="Times New Roman" w:eastAsia="Times New Roman"/>
-          <w:b/>
-          <w:sz w:val="24"/>
-        </w:rPr>
-        <w:t xml:space="preserve">Revista Brasileira de Zootecnia</w:t>
-      </w:r>
-      <w:r>
-        <w:rPr>
-          <w:rFonts w:ascii="Times New Roman" w:hAnsi="Times New Roman" w:cs="Times New Roman" w:eastAsia="Times New Roman"/>
-          <w:sz w:val="24"/>
-        </w:rPr>
-        <w:t xml:space="preserve">, v. 52, e20210227, 2023. DOI: https://doi.org/10.37496/rbz5220210227.</w:t>
+        <w:t xml:space="preserve">LOPES, J. F.; CANOZZI, M. E. A.; GONÇALVES, T. L.; ROCHA, M. K. da; SARTORI, E. D.; SESSIM, A. G.; PEREIRA, I. P.; AGUIAR, L. K. de; PAPARAS, D.; MENEGASSI, S. R. O.; KOETZ JUNIOR, C.; OAIGEN, R. P.; ZAGO, D.; BARCELLOS, J. O. J. Price determinants of beef bulls sold in livestock auctions. Revista Brasileira de Zootecnia, v. 52, e20210227, 2023. DOI: https://doi.org/10.37496/rbz5220210227.</w:t>
       </w:r>
     </w:p>
     <w:p>
@@ -14318,22 +14350,7 @@
           <w:rFonts w:ascii="Times New Roman" w:hAnsi="Times New Roman" w:cs="Times New Roman" w:eastAsia="Times New Roman"/>
           <w:sz w:val="24"/>
         </w:rPr>
-        <w:t xml:space="preserve">MACKINNON, J. G.; WHITE, H. Some heteroskedasticity-consistent covariance matrix estimators with improved finite sample properties. </w:t>
-      </w:r>
-      <w:r>
-        <w:rPr>
-          <w:rFonts w:ascii="Times New Roman" w:hAnsi="Times New Roman" w:cs="Times New Roman" w:eastAsia="Times New Roman"/>
-          <w:b/>
-          <w:sz w:val="24"/>
-        </w:rPr>
-        <w:t xml:space="preserve">Journal of Econometrics</w:t>
-      </w:r>
-      <w:r>
-        <w:rPr>
-          <w:rFonts w:ascii="Times New Roman" w:hAnsi="Times New Roman" w:cs="Times New Roman" w:eastAsia="Times New Roman"/>
-          <w:sz w:val="24"/>
-        </w:rPr>
-        <w:t xml:space="preserve">, v. 29, n. 3, p. 305-325, 1985. DOI: https://doi.org/10.1016/0304-4076(85)90158-7.</w:t>
+        <w:t xml:space="preserve">MACKINNON, J. G.; WHITE, H. Some heteroskedasticity-consistent covariance matrix estimators with improved finite sample properties. Journal of Econometrics, v. 29, n. 3, p. 305-325, 1985. DOI: https://doi.org/10.1016/0304-4076(85)90158-7.</w:t>
       </w:r>
     </w:p>
     <w:p>
@@ -14374,22 +14391,7 @@
           <w:rFonts w:ascii="Times New Roman" w:hAnsi="Times New Roman" w:cs="Times New Roman" w:eastAsia="Times New Roman"/>
           <w:sz w:val="24"/>
         </w:rPr>
-        <w:t xml:space="preserve">PACHECO, R. F.; MACHADO, D. S.; RESTLE, J.; SARTORI, D. B. S.; COSTA, P. T.; VAZ, R. Z. Meta-analysis of meat quality of cattle slaughtered with different subcutaneous fat thicknesses. </w:t>
-      </w:r>
-      <w:r>
-        <w:rPr>
-          <w:rFonts w:ascii="Times New Roman" w:hAnsi="Times New Roman" w:cs="Times New Roman" w:eastAsia="Times New Roman"/>
-          <w:b/>
-          <w:sz w:val="24"/>
-        </w:rPr>
-        <w:t xml:space="preserve">Pesquisa Agropecuária Brasileira</w:t>
-      </w:r>
-      <w:r>
-        <w:rPr>
-          <w:rFonts w:ascii="Times New Roman" w:hAnsi="Times New Roman" w:cs="Times New Roman" w:eastAsia="Times New Roman"/>
-          <w:sz w:val="24"/>
-        </w:rPr>
-        <w:t xml:space="preserve">, v. 58, e03110, 2023. DOI: https://doi.org/10.1590/S1678-3921.pab2023.v58.03110.</w:t>
+        <w:t xml:space="preserve">PACHECO, R. F.; MACHADO, D. S.; RESTLE, J.; SARTORI, D. B. S.; COSTA, P. T.; VAZ, R. Z. Meta-analysis of meat quality of cattle slaughtered with different subcutaneous fat thicknesses. Pesquisa Agropecuária Brasileira, v. 58, e03110, 2023. DOI: https://doi.org/10.1590/S1678-3921.pab2023.v58.03110.</w:t>
       </w:r>
     </w:p>
     <w:p>
@@ -14430,22 +14432,7 @@
           <w:rFonts w:ascii="Times New Roman" w:hAnsi="Times New Roman" w:cs="Times New Roman" w:eastAsia="Times New Roman"/>
           <w:sz w:val="24"/>
         </w:rPr>
-        <w:t xml:space="preserve">REPRODUÇÃO Programada da ANCP completa 30 anos com salto de 192% na produtividade genética da pecuária. </w:t>
-      </w:r>
-      <w:r>
-        <w:rPr>
-          <w:rFonts w:ascii="Times New Roman" w:hAnsi="Times New Roman" w:cs="Times New Roman" w:eastAsia="Times New Roman"/>
-          <w:b/>
-          <w:sz w:val="24"/>
-        </w:rPr>
-        <w:t xml:space="preserve">O Presente Rural</w:t>
-      </w:r>
-      <w:r>
-        <w:rPr>
-          <w:rFonts w:ascii="Times New Roman" w:hAnsi="Times New Roman" w:cs="Times New Roman" w:eastAsia="Times New Roman"/>
-          <w:sz w:val="24"/>
-        </w:rPr>
-        <w:t xml:space="preserve">, 10 jul. 2025. Disponível em: https://opresenterural.com.br/reproducao-programada-da-ancp-completa-30-anos-com-salto-de-192-na-produtividade-genetica-da-pecuaria/. Acesso em: 8 out. 2026.</w:t>
+        <w:t xml:space="preserve">REPRODUÇÃO Programada da ANCP completa 30 anos com salto de 192% na produtividade genética da pecuária. O Presente Rural, 10 jul. 2025. Disponível em: https://opresenterural.com.br/reproducao-programada-da-ancp-completa-30-anos-com-salto-de-192-na-produtividade-genetica-da-pecuaria/. Acesso em: 8 out. 2026.</w:t>
       </w:r>
     </w:p>
     <w:p>
@@ -14486,22 +14473,7 @@
           <w:rFonts w:ascii="Times New Roman" w:hAnsi="Times New Roman" w:cs="Times New Roman" w:eastAsia="Times New Roman"/>
           <w:sz w:val="24"/>
         </w:rPr>
-        <w:t xml:space="preserve">ROSEN, S. Hedonic prices and implicit markets: product differentiation in pure competition. </w:t>
-      </w:r>
-      <w:r>
-        <w:rPr>
-          <w:rFonts w:ascii="Times New Roman" w:hAnsi="Times New Roman" w:cs="Times New Roman" w:eastAsia="Times New Roman"/>
-          <w:b/>
-          <w:sz w:val="24"/>
-        </w:rPr>
-        <w:t xml:space="preserve">Journal of Political Economy</w:t>
-      </w:r>
-      <w:r>
-        <w:rPr>
-          <w:rFonts w:ascii="Times New Roman" w:hAnsi="Times New Roman" w:cs="Times New Roman" w:eastAsia="Times New Roman"/>
-          <w:sz w:val="24"/>
-        </w:rPr>
-        <w:t xml:space="preserve">, v. 82, n. 1, p. 34-55, 1974. DOI: https://doi.org/10.1086/260169.</w:t>
+        <w:t xml:space="preserve">ROSEN, S. Hedonic prices and implicit markets: product differentiation in pure competition. Journal of Political Economy, v. 82, n. 1, p. 34-55, 1974. DOI: https://doi.org/10.1086/260169.</w:t>
       </w:r>
     </w:p>
     <w:p>
@@ -14542,22 +14514,7 @@
           <w:rFonts w:ascii="Times New Roman" w:hAnsi="Times New Roman" w:cs="Times New Roman" w:eastAsia="Times New Roman"/>
           <w:sz w:val="24"/>
         </w:rPr>
-        <w:t xml:space="preserve">ROWAN, T. N. Facilitating profit-driven breeding for commercial cow-calf producers. </w:t>
-      </w:r>
-      <w:r>
-        <w:rPr>
-          <w:rFonts w:ascii="Times New Roman" w:hAnsi="Times New Roman" w:cs="Times New Roman" w:eastAsia="Times New Roman"/>
-          <w:b/>
-          <w:sz w:val="24"/>
-        </w:rPr>
-        <w:t xml:space="preserve">AABP Recent Graduate Conference Proceedings</w:t>
-      </w:r>
-      <w:r>
-        <w:rPr>
-          <w:rFonts w:ascii="Times New Roman" w:hAnsi="Times New Roman" w:cs="Times New Roman" w:eastAsia="Times New Roman"/>
-          <w:sz w:val="24"/>
-        </w:rPr>
-        <w:t xml:space="preserve">, v. 55, n. 1, p. 56-57, 2022. DOI: https://doi.org/10.21423/aabppro20228515.</w:t>
+        <w:t xml:space="preserve">ROWAN, T. N. Facilitating profit-driven breeding for commercial cow-calf producers. AABP Recent Graduate Conference Proceedings, v. 55, n. 1, p. 56-57, 2022. DOI: https://doi.org/10.21423/aabppro20228515.</w:t>
       </w:r>
     </w:p>
     <w:p>
@@ -14598,22 +14555,7 @@
           <w:rFonts w:ascii="Times New Roman" w:hAnsi="Times New Roman" w:cs="Times New Roman" w:eastAsia="Times New Roman"/>
           <w:sz w:val="24"/>
         </w:rPr>
-        <w:t xml:space="preserve">SALES, J. N. de S.; PUGLIESI, G.; CARVALHO, L. R.; SIMÕES, L. M. S.; LEMOS, L. A.; VICENTE, M. P.; SILVA, R. R. R.; BARUSELLI, P. S. Evolution over the last 40 years of the assisted reproduction technologies in cattle – the Brazilian perspective I – timed artificial insemination. </w:t>
-      </w:r>
-      <w:r>
-        <w:rPr>
-          <w:rFonts w:ascii="Times New Roman" w:hAnsi="Times New Roman" w:cs="Times New Roman" w:eastAsia="Times New Roman"/>
-          <w:b/>
-          <w:sz w:val="24"/>
-        </w:rPr>
-        <w:t xml:space="preserve">Animal Reproduction</w:t>
-      </w:r>
-      <w:r>
-        <w:rPr>
-          <w:rFonts w:ascii="Times New Roman" w:hAnsi="Times New Roman" w:cs="Times New Roman" w:eastAsia="Times New Roman"/>
-          <w:sz w:val="24"/>
-        </w:rPr>
-        <w:t xml:space="preserve">, v. 21, n. 3, e20240034, 2024. DOI: https://doi.org/10.1590/1984-3143-AR2024-0034.</w:t>
+        <w:t xml:space="preserve">SALES, J. N. de S.; PUGLIESI, G.; CARVALHO, L. R.; SIMÕES, L. M. S.; LEMOS, L. A.; VICENTE, M. P.; SILVA, R. R. R.; BARUSELLI, P. S. Evolution over the last 40 years of the assisted reproduction technologies in cattle – the Brazilian perspective I – timed artificial insemination. Animal Reproduction, v. 21, n. 3, e20240034, 2024. DOI: https://doi.org/10.1590/1984-3143-AR2024-0034.</w:t>
       </w:r>
     </w:p>
     <w:p>
@@ -14654,22 +14596,7 @@
           <w:rFonts w:ascii="Times New Roman" w:hAnsi="Times New Roman" w:cs="Times New Roman" w:eastAsia="Times New Roman"/>
           <w:sz w:val="24"/>
         </w:rPr>
-        <w:t xml:space="preserve">SILVEIRA, V. C. da. </w:t>
-      </w:r>
-      <w:r>
-        <w:rPr>
-          <w:rFonts w:ascii="Times New Roman" w:hAnsi="Times New Roman" w:cs="Times New Roman" w:eastAsia="Times New Roman"/>
-          <w:b/>
-          <w:sz w:val="24"/>
-        </w:rPr>
-        <w:t xml:space="preserve">Avaliação do efeito de atributos intrínsecos e extrínsecos na formação de valor pelo cliente</w:t>
-      </w:r>
-      <w:r>
-        <w:rPr>
-          <w:rFonts w:ascii="Times New Roman" w:hAnsi="Times New Roman" w:cs="Times New Roman" w:eastAsia="Times New Roman"/>
-          <w:sz w:val="24"/>
-        </w:rPr>
-        <w:t xml:space="preserve">: o caso do mercado de touros certificados da raça nelore. 2022. 233 f. Tese (Doutorado em Administração) – Universidade Federal de Mato Grosso do Sul, Campo Grande, 2022. Disponível em: https://posgraduacao.ufms.br/portal/trabalho-arquivos/download/10143. Acesso em: 8 out. 2026.</w:t>
+        <w:t xml:space="preserve">SILVEIRA, V. C. da. Avaliação do efeito de atributos intrínsecos e extrínsecos na formação de valor pelo cliente: o caso do mercado de touros certificados da raça nelore. 2022. 233 f. Tese (Doutorado em Administração) – Universidade Federal de Mato Grosso do Sul, Campo Grande, 2022. Disponível em: https://posgraduacao.ufms.br/portal/trabalho-arquivos/download/10143. Acesso em: 8 out. 2026.</w:t>
       </w:r>
     </w:p>
     <w:p>
@@ -14710,22 +14637,7 @@
           <w:rFonts w:ascii="Times New Roman" w:hAnsi="Times New Roman" w:cs="Times New Roman" w:eastAsia="Times New Roman"/>
           <w:sz w:val="24"/>
         </w:rPr>
-        <w:t xml:space="preserve">SPENCE, M. Job market signaling. </w:t>
-      </w:r>
-      <w:r>
-        <w:rPr>
-          <w:rFonts w:ascii="Times New Roman" w:hAnsi="Times New Roman" w:cs="Times New Roman" w:eastAsia="Times New Roman"/>
-          <w:b/>
-          <w:sz w:val="24"/>
-        </w:rPr>
-        <w:t xml:space="preserve">The Quarterly Journal of Economics</w:t>
-      </w:r>
-      <w:r>
-        <w:rPr>
-          <w:rFonts w:ascii="Times New Roman" w:hAnsi="Times New Roman" w:cs="Times New Roman" w:eastAsia="Times New Roman"/>
-          <w:sz w:val="24"/>
-        </w:rPr>
-        <w:t xml:space="preserve">, v. 87, n. 3, p. 355-374, 1973. DOI: https://doi.org/10.2307/1882010.</w:t>
+        <w:t xml:space="preserve">THOMPSON, T.; BOYER, C. N.; MARTINEZ, C. C.; ROWAN, T. N.; RHINEHART, J. Valuation of genomic-enhanced expected progeny differences in bull purchasing. Journal of Agricultural and Applied Economics, v. 54, n. 4, p. 713-722, 2022. DOI: https://doi.org/10.1017/aae.2022.36.</w:t>
       </w:r>
     </w:p>
     <w:p>
@@ -14766,83 +14678,12 @@
           <w:rFonts w:ascii="Times New Roman" w:hAnsi="Times New Roman" w:cs="Times New Roman" w:eastAsia="Times New Roman"/>
           <w:sz w:val="24"/>
         </w:rPr>
-        <w:t xml:space="preserve">THOMPSON, T.; BOYER, C. N.; MARTINEZ, C. C.; ROWAN, T. N.; RHINEHART, J. Valuation of genomic-enhanced expected progeny differences in bull purchasing. </w:t>
-      </w:r>
-      <w:r>
-        <w:rPr>
-          <w:rFonts w:ascii="Times New Roman" w:hAnsi="Times New Roman" w:cs="Times New Roman" w:eastAsia="Times New Roman"/>
-          <w:b/>
-          <w:sz w:val="24"/>
-        </w:rPr>
-        <w:t xml:space="preserve">Journal of Agricultural and Applied Economics</w:t>
-      </w:r>
-      <w:r>
-        <w:rPr>
-          <w:rFonts w:ascii="Times New Roman" w:hAnsi="Times New Roman" w:cs="Times New Roman" w:eastAsia="Times New Roman"/>
-          <w:sz w:val="24"/>
-        </w:rPr>
-        <w:t xml:space="preserve">, v. 54, n. 4, p. 713-722, 2022. DOI: https://doi.org/10.1017/aae.2022.36.</w:t>
-      </w:r>
-    </w:p>
-    <w:p>
-      <w:pPr>
-        <w:keepNext w:val="0"/>
-        <w:keepLines w:val="0"/>
-        <w:pageBreakBefore w:val="0"/>
-        <w:widowControl w:val="1"/>
-        <w:pBdr>
-          <w:top w:space="0" w:sz="0" w:val="nil"/>
-          <w:left w:space="0" w:sz="0" w:val="nil"/>
-          <w:bottom w:space="0" w:sz="0" w:val="nil"/>
-          <w:right w:space="0" w:sz="0" w:val="nil"/>
-          <w:between w:space="0" w:sz="0" w:val="nil"/>
-        </w:pBdr>
-        <w:shd w:fill="auto" w:val="clear"/>
-        <w:spacing w:after="240" w:before="0" w:line="240" w:lineRule="auto"/>
-        <w:ind w:left="0" w:right="0" w:firstLine="0"/>
-        <w:jc w:val="both"/>
-        <w:rPr>
-          <w:rFonts w:ascii="Times New Roman" w:cs="Times New Roman" w:eastAsia="Times New Roman" w:hAnsi="Times New Roman"/>
-          <w:b w:val="0"/>
-          <w:bCs w:val="0"/>
-          <w:i w:val="0"/>
-          <w:iCs w:val="0"/>
-          <w:smallCaps w:val="0"/>
-          <w:strike w:val="0"/>
-          <w:color w:val="000000"/>
-          <w:sz w:val="24"/>
-          <w:szCs w:val="24"/>
-          <w:u w:val="none"/>
-          <w:shd w:fill="auto" w:val="clear"/>
-          <w:vertAlign w:val="baseline"/>
-        </w:rPr>
-      </w:pPr>
-      <w:r>
-        <w:rPr>
-          <w:rFonts w:ascii="Times New Roman" w:hAnsi="Times New Roman" w:cs="Times New Roman" w:eastAsia="Times New Roman"/>
-          <w:sz w:val="24"/>
-        </w:rPr>
-        <w:t xml:space="preserve">TVERSKY, A.; KAHNEMAN, D. Judgment under uncertainty: heuristics and biases. </w:t>
-      </w:r>
-      <w:r>
-        <w:rPr>
-          <w:rFonts w:ascii="Times New Roman" w:hAnsi="Times New Roman" w:cs="Times New Roman" w:eastAsia="Times New Roman"/>
-          <w:b/>
-          <w:sz w:val="24"/>
-        </w:rPr>
-        <w:t xml:space="preserve">Science</w:t>
-      </w:r>
-      <w:r>
-        <w:rPr>
-          <w:rFonts w:ascii="Times New Roman" w:hAnsi="Times New Roman" w:cs="Times New Roman" w:eastAsia="Times New Roman"/>
-          <w:sz w:val="24"/>
-        </w:rPr>
-        <w:t xml:space="preserve">, v. 185, n. 4157, p. 1124-1131, 1974. DOI: https://doi.org/10.1126/science.185.4157.1124.</w:t>
+        <w:t xml:space="preserve">TVERSKY, A.; KAHNEMAN, D. Judgment under uncertainty: heuristics and biases. Science, v. 185, n. 4157, p. 1124-1131, 1974. DOI: https://doi.org/10.1126/science.185.4157.1124.</w:t>
       </w:r>
     </w:p>
     <w:sectPr>
-      <w:headerReference w:type="default" r:id="rId16"/>
-      <w:footerReference w:type="default" r:id="rId17"/>
+      <w:headerReference w:type="default" r:id="rId17"/>
+      <w:footerReference w:type="default" r:id="rId18"/>
       <w:footnotePr>
         <w:numRestart w:val="eachSect"/>
       </w:footnotePr>

</xml_diff>

<commit_message>
docs: fonte das figuras como elaborado pelos autores na versão 8
- o artigo tem dois autores (aluno e orientador); as quatro figuras diziam
  'elaborado pelo autor'
</commit_message>
<xml_diff>
--- a/Docs/Artigo_SIMPOS_2026_v8_2026-10-15.docx
+++ b/Docs/Artigo_SIMPOS_2026_v8_2026-10-15.docx
@@ -7061,7 +7061,7 @@
           <w:rFonts w:ascii="Times New Roman" w:hAnsi="Times New Roman" w:cs="Times New Roman" w:eastAsia="Times New Roman"/>
           <w:sz w:val="24"/>
         </w:rPr>
-        <w:t xml:space="preserve">Fonte: elaborado pelo autor (2026).</w:t>
+        <w:t xml:space="preserve">Fonte: elaborado pelos autores (2026).</w:t>
       </w:r>
     </w:p>
     <w:p>
@@ -7339,7 +7339,7 @@
           <w:rFonts w:ascii="Times New Roman" w:hAnsi="Times New Roman" w:cs="Times New Roman" w:eastAsia="Times New Roman"/>
           <w:sz w:val="24"/>
         </w:rPr>
-        <w:t xml:space="preserve">Fonte: elaborado pelo autor (2026).</w:t>
+        <w:t xml:space="preserve">Fonte: elaborado pelos autores (2026).</w:t>
       </w:r>
     </w:p>
     <w:p>
@@ -11965,7 +11965,7 @@
           <w:rFonts w:ascii="Times New Roman" w:hAnsi="Times New Roman" w:cs="Times New Roman" w:eastAsia="Times New Roman"/>
           <w:sz w:val="24"/>
         </w:rPr>
-        <w:t xml:space="preserve">Fonte: elaborado pelo autor (2026).</w:t>
+        <w:t xml:space="preserve">Fonte: elaborado pelos autores (2026).</w:t>
       </w:r>
     </w:p>
     <w:p>
@@ -12201,7 +12201,7 @@
           <w:rFonts w:ascii="Times New Roman" w:hAnsi="Times New Roman" w:cs="Times New Roman" w:eastAsia="Times New Roman"/>
           <w:sz w:val="24"/>
         </w:rPr>
-        <w:t xml:space="preserve">Fonte: elaborado pelo autor (2026).</w:t>
+        <w:t xml:space="preserve">Fonte: elaborado pelos autores (2026).</w:t>
       </w:r>
     </w:p>
     <w:p>

</xml_diff>

<commit_message>
docs: ajusta na versão 8 o peso do modelo final, do MATERNAL e do SUPER_CAR
- modelo final: a diferença de AIC para o Modelo 6 (menos de 2 pontos) não
  permite preferir um ao outro; a EAO entrou pela regra da Etapa 1, não por
  efeito significativo
- validação aninhada: IFERT selecionado nas 50 partições e MATERNAL em 15
- resumo: SUPER_CAR descrito como análise exploratória e conclusão centrada no
  selo de fertilidade (297 palavras)
- conclusão: MATERNAL no limite da significância e instável fora da amostra
</commit_message>
<xml_diff>
--- a/Docs/Artigo_SIMPOS_2026_v8_2026-10-15.docx
+++ b/Docs/Artigo_SIMPOS_2026_v8_2026-10-15.docx
@@ -361,7 +361,7 @@
           <w:rFonts w:ascii="Times New Roman" w:hAnsi="Times New Roman" w:cs="Times New Roman" w:eastAsia="Times New Roman"/>
           <w:sz w:val="24"/>
         </w:rPr>
-        <w:t xml:space="preserve">: Este trabalho, vinculado ao curso de Especialização em Ciência de Dados do IFTM, na linha de pesquisa Aprendizado de Máquina, insere-se na aplicação da ciência de dados ao agronegócio. Não se sabe quanto o preço do sêmen reflete as provas genéticas dos catálogos. O objetivo geral foi analisar a relação entre as Diferenças Esperadas na Progênie (DEPs), os selos comerciais e as linhagens e o preço da dose de sêmen convencional de touros Nelore. Os objetivos específicos foram ranquear esses atributos pelo Random Forest, estimar seus preços implícitos por regressão hedônica e comparar as três dimensões. A pergunta norteadora foi: em que medida as DEPs influenciam o preço da dose, e qual a contribuição dos selos e das linhagens? Partiu-se da hipótese de que touros com melhores DEPs têm doses mais caras. A pesquisa, quantitativa e documental, utilizou dados coletados por web scraping do catálogo da CRV Lagoa em setembro de 2026: 115 touros com avaliação da ANCP e preço válido. O quadro teórico baseou-se na Teoria dos Preços Hedônicos (ROSEN, 1974) e no Random Forest (BREIMAN, 2001). A análise combinou Random Forest, regressões hedônicas com erros-padrão robustos, critério de Akaike e validação cruzada. As 18 DEPs explicaram pouco do preço; a única significativa em conjunto, o consumo alimentar residual, perdeu significância na forma linear diante dos selos, mas o ágio dos 3% melhores nessa característica persistiu. No modelo final (R² = 28,6% na amostra), foram significativos o selo de fertilidade (+R$ 5,21) e, no limite da significância, o de habilidade materna (+R$ 2,32), e nenhuma linhagem apresentou efeito robusto; fora da amostra, o poder preditivo foi baixo. Conclui-se que a sinalização comercial pesa mais que as provas genéticas no preço do sêmen. Por utilizar apenas dados públicos, a pesquisa não foi submetida ao Comitê de Ética em Pesquisa.</w:t>
+        <w:t xml:space="preserve">: Este trabalho, vinculado ao curso de Especialização em Ciência de Dados do IFTM, na linha de pesquisa Aprendizado de Máquina, insere-se na aplicação da ciência de dados ao agronegócio. Não se sabe quanto o preço do sêmen reflete as provas genéticas. O objetivo geral foi analisar a relação entre as Diferenças Esperadas na Progênie (DEPs), os selos comerciais e as linhagens e o preço da dose de sêmen convencional de touros Nelore. Os objetivos específicos foram ranquear esses atributos pelo Random Forest, estimar seus preços implícitos por regressão hedônica e comparar as três dimensões. A pergunta norteadora foi: em que medida as DEPs influenciam o preço da dose, e qual a contribuição dos selos e das linhagens? Partiu-se da hipótese de que touros com melhores DEPs têm doses mais caras. A pesquisa, quantitativa e documental, utilizou dados coletados por web scraping do catálogo da CRV Lagoa em setembro de 2026: 115 touros com avaliação da ANCP e preço válido. O quadro teórico baseou-se na Teoria dos Preços Hedônicos (ROSEN, 1974) e no Random Forest (BREIMAN, 2001). A análise combinou Random Forest, regressões hedônicas com erros-padrão robustos, critério de Akaike e validação cruzada. As 18 DEPs explicaram pouco do preço; a única significativa em conjunto, o consumo alimentar residual, perdeu significância na forma linear diante dos selos, mas, em análise exploratória, o ágio dos 3% melhores persistiu. No modelo final (R² = 28,6% na amostra), foram significativos o selo de fertilidade (+R$ 5,21) e, no limite da significância, o de habilidade materna (+R$ 2,32), e nenhuma linhagem apresentou efeito robusto; fora da amostra, o poder preditivo foi baixo. Conclui-se que o selo de fertilidade pesa mais que as provas genéticas no preço. Por utilizar apenas dados públicos, a pesquisa não foi submetida ao Comitê de Ética em Pesquisa.</w:t>
       </w:r>
     </w:p>
     <w:p>
@@ -11813,7 +11813,7 @@
           <w:sz w:val="24"/>
           <w:lang w:val="pt-BR"/>
         </w:rPr>
-        <w:t xml:space="preserve">Esse modelo obteve o menor AIC entre as sete especificações (R² = 28,6%; R² ajustado = 26,0%; AIC = 737,0), embora com diferença inferior a dois pontos em relação ao modelo com selos e linhagem (Modelo 6; AIC = 738,7). Com erros-padrão robustos (HC3), apenas os selos mantiveram significância: o SELO_IFERT agregou +R$ 5,21 por dose (p &lt; 0,001) e o SELO_MATERNAL, +R$ 2,32 (p = 0,049), este no limite da significância (p = 0,052 com a distribuição t) (Figura 3). O CAR_TOP (β = -0,035; p = 0,130) e o TRONCO_EAO (+R$ 7,48; p = 0,253) não foram significativos na presença dos selos. Os VIFs foram inferiores a 1,05, descartando multicolinearidade. Os resíduos, porém, não apresentaram distribuição normal (Jarque-Bera, p &lt; 0,001) e mostraram heterocedasticidade (Breusch-Pagan na versão de Koenker, p = 0,040), o que justificou o uso de erros-padrão robustos. Na análise de sensibilidade com o logaritmo do preço (R² = 29,5%), os resíduos foram homocedásticos (Breusch-Pagan, p = 0,211) e as conclusões se mantiveram: o SELO_IFERT associou-se a um preço 18,1% maior (p &lt; 0,001) e o SELO_MATERNAL a um preço 7,2% maior (p = 0,055), sem efeito significativo do CAR_TOP (p = 0,080) ou do TRONCO_EAO (p = 0,230). Mesmo o modelo completo explica menos de 30% da variação dos preços na própria amostra, indicando que fatores não incluídos nos modelos respondem pela maior parte da variabilidade.</w:t>
+        <w:t xml:space="preserve">Esse modelo obteve o menor AIC entre as sete especificações (R² = 28,6%; R² ajustado = 26,0%; AIC = 737,0), embora com diferença inferior a dois pontos em relação ao modelo com selos e linhagem (Modelo 6; AIC = 738,7), pequena demais para preferir um ao outro; por isso, os resultados mais confiáveis são os que se repetem nos diferentes modelos, e não a especificação final em si. Com erros-padrão robustos (HC3), apenas os selos mantiveram significância: o SELO_IFERT agregou +R$ 5,21 por dose (p &lt; 0,001) e o SELO_MATERNAL, +R$ 2,32 (p = 0,049), este no limite da significância (p = 0,052 com a distribuição t) (Figura 3). O CAR_TOP (β = -0,035; p = 0,130) e o TRONCO_EAO (+R$ 7,48; p = 0,253) não foram significativos na presença dos selos; a EAO entrou no modelo por representar a dimensão das linhagens (Etapa 1), e não por efeito significativo. Os VIFs foram inferiores a 1,05, descartando multicolinearidade. Os resíduos, porém, não apresentaram distribuição normal (Jarque-Bera, p &lt; 0,001) e mostraram heterocedasticidade (Breusch-Pagan na versão de Koenker, p = 0,040), o que justificou o uso de erros-padrão robustos. Na análise de sensibilidade com o logaritmo do preço (R² = 29,5%), os resíduos foram homocedásticos (Breusch-Pagan, p = 0,211) e as conclusões se mantiveram: o SELO_IFERT associou-se a um preço 18,1% maior (p &lt; 0,001) e o SELO_MATERNAL a um preço 7,2% maior (p = 0,055), sem efeito significativo do CAR_TOP (p = 0,080) ou do TRONCO_EAO (p = 0,230). Mesmo o modelo completo explica menos de 30% da variação dos preços na própria amostra, indicando que fatores não incluídos nos modelos respondem pela maior parte da variabilidade.</w:t>
       </w:r>
     </w:p>
     <w:p>
@@ -12049,7 +12049,7 @@
           <w:sz w:val="24"/>
           <w:lang w:val="pt-BR"/>
         </w:rPr>
-        <w:t xml:space="preserve">Os valores de R² acima foram calculados na mesma amostra usada no ajuste. Fora dela, o poder preditivo foi baixo (Tabela 5): o Random Forest com as 31 variáveis, que explicou 88,1% da variação no treinamento, obteve R² out-of-bag de 8,5% e R² médio de -3,7% na validação cruzada, sinal de sobreajuste à amostra de 115 touros, e o modelo hedônico final passou de 28,6% para 4,1%, com erro médio de previsão (RMSE) de R$ 6,17 por dose, contra R$ 6,72 do modelo sem preditores. A especificação com o CAR na forma de indicador de Super Elite obteve R² de 10,1% (RMSE de R$ 5,95), mas, como o corte em 3% foi escolhido a partir dos próprios dados, esse valor não constitui validação independente. Os valores dos modelos hedônicos são, ainda, otimistas, porque suas variáveis foram selecionadas com a amostra completa: refazendo a seleção dentro de cada partição de treino (validação cruzada aninhada), o R² fora da amostra foi de -5,2% (RMSE de R$ 6,47), pouco melhor que o do modelo sem preditores (-10,4%; RMSE de R$ 6,72), e o conjunto do modelo final foi selecionado em apenas 2 das 50 partições. Na importância por permutação (Figura 4b), o SELO_IFERT foi o atributo mais relevante (queda de 0,15 no R² quando embaralhado), seguido, a grande distância, do CAR_TOP (0,03), como nos modelos econométricos; o SELO_MATERNAL, significativo nas regressões, praticamente não contribuiu para a previsão, assim como 3P_TOP e MP210_TOP, segunda e quarta variáveis pela redução de impureza no Random Forest com as 31 variáveis (Figura 4a).</w:t>
+        <w:t xml:space="preserve">Os valores de R² acima foram calculados na mesma amostra usada no ajuste. Fora dela, o poder preditivo foi baixo (Tabela 5): o Random Forest com as 31 variáveis, que explicou 88,1% da variação no treinamento, obteve R² out-of-bag de 8,5% e R² médio de -3,7% na validação cruzada, sinal de sobreajuste à amostra de 115 touros, e o modelo hedônico final passou de 28,6% para 4,1%, com erro médio de previsão (RMSE) de R$ 6,17 por dose, contra R$ 6,72 do modelo sem preditores. A especificação com o CAR na forma de indicador de Super Elite obteve R² de 10,1% (RMSE de R$ 5,95), mas, como o corte em 3% foi escolhido a partir dos próprios dados, esse valor não constitui validação independente. Os valores dos modelos hedônicos são, ainda, otimistas, porque suas variáveis foram selecionadas com a amostra completa: refazendo a seleção dentro de cada partição de treino (validação cruzada aninhada), o R² fora da amostra foi de -5,2% (RMSE de R$ 6,47), pouco melhor que o do modelo sem preditores (-10,4%; RMSE de R$ 6,72), e o conjunto do modelo final foi selecionado em apenas 2 das 50 partições; o SELO_IFERT foi selecionado em todas, e o SELO_MATERNAL, em 15. Na importância por permutação (Figura 4b), o SELO_IFERT foi o atributo mais relevante (queda de 0,15 no R² quando embaralhado), seguido, a grande distância, do CAR_TOP (0,03), como nos modelos econométricos; o SELO_MATERNAL, significativo nas regressões, praticamente não contribuiu para a previsão, assim como 3P_TOP e MP210_TOP, segunda e quarta variáveis pela redução de impureza no Random Forest com as 31 variáveis (Figura 4a).</w:t>
       </w:r>
     </w:p>
     <w:p>
@@ -13693,7 +13693,7 @@
           <w:rFonts w:ascii="Times New Roman" w:hAnsi="Times New Roman" w:cs="Times New Roman" w:eastAsia="Times New Roman"/>
           <w:sz w:val="24"/>
         </w:rPr>
-        <w:t xml:space="preserve">O selo de fertilidade é o atributo do catálogo mais consistentemente associado ao preço da dose, seguido do selo de habilidade materna, cujo efeito fica no limite da significância.</w:t>
+        <w:t xml:space="preserve">O selo de fertilidade é o atributo do catálogo associado ao preço da dose de forma mais robusta, significativo em todos os modelos em que foi incluído e selecionado em todas as partições da validação cruzada; o efeito do selo de habilidade materna fica no limite da significância e é instável fora da amostra.</w:t>
       </w:r>
     </w:p>
     <w:p>

</xml_diff>

<commit_message>
fix: exclui da validação aninhada selos e linhagens com menos de 3 touros no treino
- 13: com 1 touro na partição de treino o erro-padrão HC3 dividia por zero e,
  com 2, o p-valor ficava instável (Naviraí, com 3 touros, era selecionada em
  9 de 50 partições); mínimo de 3 touros, o mesmo da Tabela 3
- resultado: R² aninhado de -5,2% para -7,1% e RMSE de R$ 6,47 para R$ 6,51,
  ainda pouco melhor que o modelo sem preditores; IFERT em 50 partições,
  MATERNAL em 15 e o conjunto do modelo final em 2 (sem mudança); demais
  saídas do caderno idênticas
- 04 e 13 reexecutados no Windows: as 4 figuras passam a usar Times New Roman,
  a fonte do template (antes Liberation Serif), sem mudança de conteúdo
- artigo v8 atualizado (métodos, texto da validação e Tabela 5)
</commit_message>
<xml_diff>
--- a/Docs/Artigo_SIMPOS_2026_v8_2026-10-15.docx
+++ b/Docs/Artigo_SIMPOS_2026_v8_2026-10-15.docx
@@ -3428,7 +3428,7 @@
           <w:sz w:val="24"/>
           <w:lang w:val="pt-BR"/>
         </w:rPr>
-        <w:t xml:space="preserve">Como o coeficiente de determinação calculado na própria amostra de ajuste tende a superestimar o poder explicativo, o desempenho preditivo foi avaliado também fora da amostra: pelo R² out-of-bag do Random Forest, em que cada touro é previsto apenas pelas árvores que não o utilizaram no treinamento (BREIMAN, 2001), e por validação cruzada com cinco partições repetida dez vezes, comparando o Random Forest com as 31 variáveis das três dimensões (18 DEPs, 6 selos e 7 linhagens), o modelo hedônico final e sua especificação com o CAR como indicador de Super Elite, um modelo de regressão com as mesmas variáveis do Random Forest e um modelo sem preditores (média do preço), pelo R² e pela raiz do erro quadrático médio (RMSE). Como as variáveis do modelo final foram selecionadas com a amostra completa, sua validação cruzada foi repetida de forma aninhada, refazendo a seleção das variáveis, pela mesma regra das Etapas 1 a 3, dentro de cada partição de treino. A importância das variáveis foi estimada ainda por permutação, que mede a perda de desempenho quando os valores de uma variável são embaralhados nos dados não usados no ajuste (BREIMAN, 2001), em uma validação cruzada própria, com cinco partições e quatro repetições.</w:t>
+        <w:t xml:space="preserve">Como o coeficiente de determinação calculado na própria amostra de ajuste tende a superestimar o poder explicativo, o desempenho preditivo foi avaliado também fora da amostra: pelo R² out-of-bag do Random Forest, em que cada touro é previsto apenas pelas árvores que não o utilizaram no treinamento (BREIMAN, 2001), e por validação cruzada com cinco partições repetida dez vezes, comparando o Random Forest com as 31 variáveis das três dimensões (18 DEPs, 6 selos e 7 linhagens), o modelo hedônico final e sua especificação com o CAR como indicador de Super Elite, um modelo de regressão com as mesmas variáveis do Random Forest e um modelo sem preditores (média do preço), pelo R² e pela raiz do erro quadrático médio (RMSE). Como as variáveis do modelo final foram selecionadas com a amostra completa, sua validação cruzada foi repetida de forma aninhada, refazendo a seleção das variáveis, pela mesma regra das Etapas 1 a 3, dentro de cada partição de treino, desconsiderando os selos e as linhagens com menos de três touros na partição. A importância das variáveis foi estimada ainda por permutação, que mede a perda de desempenho quando os valores de uma variável são embaralhados nos dados não usados no ajuste (BREIMAN, 2001), em uma validação cruzada própria, com cinco partições e quatro repetições.</w:t>
       </w:r>
     </w:p>
     <w:p>
@@ -12049,7 +12049,7 @@
           <w:sz w:val="24"/>
           <w:lang w:val="pt-BR"/>
         </w:rPr>
-        <w:t xml:space="preserve">Os valores de R² acima foram calculados na mesma amostra usada no ajuste. Fora dela, o poder preditivo foi baixo (Tabela 5): o Random Forest com as 31 variáveis, que explicou 88,1% da variação no treinamento, obteve R² out-of-bag de 8,5% e R² médio de -3,7% na validação cruzada, sinal de sobreajuste à amostra de 115 touros, e o modelo hedônico final passou de 28,6% para 4,1%, com erro médio de previsão (RMSE) de R$ 6,17 por dose, contra R$ 6,72 do modelo sem preditores. A especificação com o CAR na forma de indicador de Super Elite obteve R² de 10,1% (RMSE de R$ 5,95), mas, como o corte em 3% foi escolhido a partir dos próprios dados, esse valor não constitui validação independente. Os valores dos modelos hedônicos são, ainda, otimistas, porque suas variáveis foram selecionadas com a amostra completa: refazendo a seleção dentro de cada partição de treino (validação cruzada aninhada), o R² fora da amostra foi de -5,2% (RMSE de R$ 6,47), pouco melhor que o do modelo sem preditores (-10,4%; RMSE de R$ 6,72), e o conjunto do modelo final foi selecionado em apenas 2 das 50 partições; o SELO_IFERT foi selecionado em todas, e o SELO_MATERNAL, em 15. Na importância por permutação (Figura 4b), o SELO_IFERT foi o atributo mais relevante (queda de 0,15 no R² quando embaralhado), seguido, a grande distância, do CAR_TOP (0,03), como nos modelos econométricos; o SELO_MATERNAL, significativo nas regressões, praticamente não contribuiu para a previsão, assim como 3P_TOP e MP210_TOP, segunda e quarta variáveis pela redução de impureza no Random Forest com as 31 variáveis (Figura 4a).</w:t>
+        <w:t xml:space="preserve">Os valores de R² acima foram calculados na mesma amostra usada no ajuste. Fora dela, o poder preditivo foi baixo (Tabela 5): o Random Forest com as 31 variáveis, que explicou 88,1% da variação no treinamento, obteve R² out-of-bag de 8,5% e R² médio de -3,7% na validação cruzada, sinal de sobreajuste à amostra de 115 touros, e o modelo hedônico final passou de 28,6% para 4,1%, com erro médio de previsão (RMSE) de R$ 6,17 por dose, contra R$ 6,72 do modelo sem preditores. A especificação com o CAR na forma de indicador de Super Elite obteve R² de 10,1% (RMSE de R$ 5,95), mas, como o corte em 3% foi escolhido a partir dos próprios dados, esse valor não constitui validação independente. Os valores dos modelos hedônicos são, ainda, otimistas, porque suas variáveis foram selecionadas com a amostra completa: refazendo a seleção dentro de cada partição de treino (validação cruzada aninhada), o R² fora da amostra foi de -7,1% (RMSE de R$ 6,51), pouco melhor que o do modelo sem preditores (-10,4%; RMSE de R$ 6,72), e o conjunto do modelo final foi selecionado em apenas 2 das 50 partições; o SELO_IFERT foi selecionado em todas, e o SELO_MATERNAL, em 15. Na importância por permutação (Figura 4b), o SELO_IFERT foi o atributo mais relevante (queda de 0,15 no R² quando embaralhado), seguido, a grande distância, do CAR_TOP (0,03), como nos modelos econométricos; o SELO_MATERNAL, significativo nas regressões, praticamente não contribuiu para a previsão, assim como 3P_TOP e MP210_TOP, segunda e quarta variáveis pela redução de impureza no Random Forest com as 31 variáveis (Figura 4a).</w:t>
       </w:r>
     </w:p>
     <w:p>
@@ -12916,7 +12916,7 @@
                 <w:szCs w:val="20"/>
                 <w:lang w:val="pt-BR" w:eastAsia="pt-BR"/>
               </w:rPr>
-              <w:t xml:space="preserve">-5,2</w:t>
+              <w:t xml:space="preserve">-7,1</w:t>
             </w:r>
           </w:p>
         </w:tc>
@@ -12948,7 +12948,7 @@
                 <w:szCs w:val="20"/>
                 <w:lang w:val="pt-BR" w:eastAsia="pt-BR"/>
               </w:rPr>
-              <w:t xml:space="preserve">6,47</w:t>
+              <w:t xml:space="preserve">6,51</w:t>
             </w:r>
           </w:p>
         </w:tc>

</xml_diff>

<commit_message>
docs: reescreve a conclusão da versão 8 no formato do template
- frases sucintas, no presente, sem comentários adicionais e sem repetir os
  resultados, como pede o template do Trabalho Completo
- números, ressalvas e o resultado exploratório do SUPER_CAR ficam nos
  Resultados e nas Limitações
</commit_message>
<xml_diff>
--- a/Docs/Artigo_SIMPOS_2026_v8_2026-10-15.docx
+++ b/Docs/Artigo_SIMPOS_2026_v8_2026-10-15.docx
@@ -13611,7 +13611,7 @@
           <w:rFonts w:ascii="Times New Roman" w:hAnsi="Times New Roman" w:cs="Times New Roman" w:eastAsia="Times New Roman"/>
           <w:sz w:val="24"/>
         </w:rPr>
-        <w:t xml:space="preserve">As provas genéticas, expressas pelas DEPs, explicam pequena parte do preço da dose de sêmen de touros Nelore na central analisada; entre elas, o consumo alimentar residual é a que se associa ao preço de forma mais consistente, com ágio concentrado nos touros entre os 3% melhores nessa característica.</w:t>
+        <w:t xml:space="preserve">As provas genéticas, expressas pelas DEPs, têm pequena influência sobre o preço da dose de sêmen de touros Nelore na central analisada.</w:t>
       </w:r>
     </w:p>
     <w:p>
@@ -13652,7 +13652,7 @@
           <w:rFonts w:ascii="Times New Roman" w:hAnsi="Times New Roman" w:cs="Times New Roman" w:eastAsia="Times New Roman"/>
           <w:sz w:val="24"/>
         </w:rPr>
-        <w:t xml:space="preserve">Na presença dos selos comerciais, o efeito linear do consumo alimentar residual deixa de ser significativo, mas o ágio dos touros no topo dessa característica se mantém, resultado exploratório que requer confirmação em outras amostras.</w:t>
+        <w:t xml:space="preserve">Entre as DEPs, o consumo alimentar residual é a que mais se associa ao preço da dose.</w:t>
       </w:r>
     </w:p>
     <w:p>
@@ -13693,7 +13693,7 @@
           <w:rFonts w:ascii="Times New Roman" w:hAnsi="Times New Roman" w:cs="Times New Roman" w:eastAsia="Times New Roman"/>
           <w:sz w:val="24"/>
         </w:rPr>
-        <w:t xml:space="preserve">O selo de fertilidade é o atributo do catálogo associado ao preço da dose de forma mais robusta, significativo em todos os modelos em que foi incluído e selecionado em todas as partições da validação cruzada; o efeito do selo de habilidade materna fica no limite da significância e é instável fora da amostra.</w:t>
+        <w:t xml:space="preserve">Os selos comerciais, em especial o de fertilidade, pesam mais no preço da dose do que as DEPs e as linhagens.</w:t>
       </w:r>
     </w:p>
     <w:p>
@@ -13734,7 +13734,7 @@
           <w:rFonts w:ascii="Times New Roman" w:hAnsi="Times New Roman" w:cs="Times New Roman" w:eastAsia="Times New Roman"/>
           <w:sz w:val="24"/>
         </w:rPr>
-        <w:t xml:space="preserve">As linhagens não apresentam efeito estatisticamente robusto sobre o preço.</w:t>
+        <w:t xml:space="preserve">As linhagens não influenciam o preço da dose de forma robusta.</w:t>
       </w:r>
     </w:p>
     <w:p>
@@ -13775,7 +13775,7 @@
           <w:rFonts w:ascii="Times New Roman" w:hAnsi="Times New Roman" w:cs="Times New Roman" w:eastAsia="Times New Roman"/>
           <w:sz w:val="24"/>
         </w:rPr>
-        <w:t xml:space="preserve">A maior parte da variação do preço depende de fatores não descritos no catálogo, e o poder preditivo dos modelos fora da amostra é baixo.</w:t>
+        <w:t xml:space="preserve">O preço da dose depende, em sua maior parte, de fatores não descritos no catálogo.</w:t>
       </w:r>
     </w:p>
     <w:p>
@@ -13816,7 +13816,7 @@
           <w:rFonts w:ascii="Times New Roman" w:hAnsi="Times New Roman" w:cs="Times New Roman" w:eastAsia="Times New Roman"/>
           <w:sz w:val="24"/>
         </w:rPr>
-        <w:t xml:space="preserve">A combinação do algoritmo Random Forest com a regressão hedônica permite identificar e quantificar os atributos associados ao preço e constitui uma abordagem de ciência de dados replicável para outras centrais e raças.</w:t>
+        <w:t xml:space="preserve">A combinação do algoritmo Random Forest com a regressão hedônica identifica e quantifica os atributos associados ao preço do sêmen e pode ser replicada em outras centrais e raças.</w:t>
       </w:r>
     </w:p>
     <w:p>

</xml_diff>

<commit_message>
docs: corrige o coeficiente de variação e a versão do Python na versão 8
- conferência automática dos 403 números do resumo, métodos, resultados e
  conclusão contra as saídas dos cadernos 02 a 13: só o coeficiente de variação
  divergia (20,96% vinha de 6,79 / 32,40; com média e desvio sem arredondar,
  20,95%); os demais não encontrados literalmente (8,28, 30,2% e medianas do
  selo Novilhas) foram recalculados e estão corretos
- ambiente: análises em Python 3.13 e 3.14 (cadernos 04 e 13 reexecutados em
  3.14, mesmas bibliotecas e saídas idênticas)
</commit_message>
<xml_diff>
--- a/Docs/Artigo_SIMPOS_2026_v8_2026-10-15.docx
+++ b/Docs/Artigo_SIMPOS_2026_v8_2026-10-15.docx
@@ -4553,7 +4553,7 @@
           <w:sz w:val="24"/>
           <w:lang w:val="pt-BR"/>
         </w:rPr>
-        <w:t xml:space="preserve">Todos os scripts, manipulações de dados, modelos econométricos e visualizações gráficas foram codificados em Jupyter Notebooks. A coleta foi executada em Python 3.11, com requests (2.34.2) e beautifulsoup4 (4.15.0), e as análises em Python 3.13, com pandas (3.0.6), numpy (2.5.3), scikit-learn (1.9.1), statsmodels (0.15.0), scipy (1.18.1), matplotlib (3.11.2) e seaborn (0.13.2).</w:t>
+        <w:t xml:space="preserve">Todos os scripts, manipulações de dados, modelos econométricos e visualizações gráficas foram codificados em Jupyter Notebooks. A coleta foi executada em Python 3.11, com requests (2.34.2) e beautifulsoup4 (4.15.0), e as análises em Python 3.13 e 3.14, com resultados idênticos nas duas versões, com pandas (3.0.6), numpy (2.5.3), scikit-learn (1.9.1), statsmodels (0.15.0), scipy (1.18.1), matplotlib (3.11.2) e seaborn (0.13.2).</w:t>
       </w:r>
       <w:proofErr w:type="spellStart"/>
       <w:proofErr w:type="spellEnd"/>
@@ -5218,7 +5218,7 @@
                 <w:szCs w:val="22"/>
                 <w:lang w:val="pt-BR" w:eastAsia="pt-BR"/>
               </w:rPr>
-              <w:t>20,96</w:t>
+              <w:t xml:space="preserve">20,95</w:t>
             </w:r>
           </w:p>
         </w:tc>
@@ -5263,7 +5263,7 @@
           <w:sz w:val="24"/>
           <w:lang w:val="pt-BR"/>
         </w:rPr>
-        <w:t xml:space="preserve">A proximidade entre a média (R$ 32,40) e a mediana (R$ 31,20), aliada ao coeficiente de variação de 20,96%, indica dispersão moderada dos preços, que se concentram em poucos patamares comerciais: metade dos touros tem a dose cotada em até R$ 31,20 e 75% em até R$ 33,90. A assimetria à direita decorre de uma cauda estreita de touros de maior cotação — apenas oito touros (7,0%) têm a dose acima de R$ 38,90 e quatro (3,5%) acima de R$ 45,40 —, chegando ao máximo de R$ 60,00. É essa variação de preço entre touros da mesma raça e da mesma central que a abordagem hedônica procura relacionar aos atributos de cada animal (ROSEN, 1974).</w:t>
+        <w:t xml:space="preserve">A proximidade entre a média (R$ 32,40) e a mediana (R$ 31,20), aliada ao coeficiente de variação de 20,95%, indica dispersão moderada dos preços, que se concentram em poucos patamares comerciais: metade dos touros tem a dose cotada em até R$ 31,20 e 75% em até R$ 33,90. A assimetria à direita decorre de uma cauda estreita de touros de maior cotação — apenas oito touros (7,0%) têm a dose acima de R$ 38,90 e quatro (3,5%) acima de R$ 45,40 —, chegando ao máximo de R$ 60,00. É essa variação de preço entre touros da mesma raça e da mesma central que a abordagem hedônica procura relacionar aos atributos de cada animal (ROSEN, 1974).</w:t>
       </w:r>
     </w:p>
     <w:p>

</xml_diff>

<commit_message>
docs: corrige os nomes de FPP e FRAME na versão 8
- FPP = Facilidade de Parto de Primíparas e FRAME = escore de estrutura corporal
  (frame), DEPs da ANCP posteriores ao agrupamento de 2021 citado de Silveira
  (2022); antes 'Facilidade de Parto' e 'tamanho corporal', apresentados como
  se fossem só do catálogo
- Figura 1 depois dos parágrafos do MGTe e Figura 3 depois do parágrafo do
  SUPER_CAR, para não deixar meia página em branco
</commit_message>
<xml_diff>
--- a/Docs/Artigo_SIMPOS_2026_v8_2026-10-15.docx
+++ b/Docs/Artigo_SIMPOS_2026_v8_2026-10-15.docx
@@ -1820,7 +1820,7 @@
           <w:sz w:val="24"/>
           <w:lang w:val="pt-BR"/>
         </w:rPr>
-        <w:t xml:space="preserve">As 18 características cujos percentis das DEPs foram considerados neste estudo, agrupadas, em sua maioria, conforme a ANCP (SILVEIRA, 2022), foram: de Reprodução e Fertilidade, Probabilidade de Parto Precoce (3P_TOP), Idade ao Primeiro Parto (IPP_TOP), Perímetro Escrotal aos 450 dias (PE450_TOP), Produtividade Acumulada (PAC_TOP) e Probabilidade de Permanência no Rebanho, ou stayability (STAY_TOP); de Crescimento, Peso ao Nascer (PN_TOP), Peso aos 210, 365 e 450 dias (P210_TOP, P365_TOP e P450_TOP) e Habilidade Maternal para peso aos 120 e 210 dias (MP120_TOP e MP210_TOP); de Produtividade e Qualidade da Carne, Área de Olho de Lombo (AOL_TOP), Acabamento de Carcaça (ACAB_TOP) e Marmoreio (MARM_TOP); de Eficiência Alimentar, Consumo Alimentar Residual (CAR_TOP); além da Facilidade de Parto (FPP_TOP) e do tamanho corporal (FRAME_TOP), também apresentados no catálogo, e do índice Mérito Genético Total Econômico (MGTe_TOP).</w:t>
+        <w:t xml:space="preserve">As 18 características cujos percentis das DEPs foram considerados neste estudo, agrupadas, em sua maioria, conforme a ANCP (SILVEIRA, 2022), foram: de Reprodução e Fertilidade, Probabilidade de Parto Precoce (3P_TOP), Idade ao Primeiro Parto (IPP_TOP), Perímetro Escrotal aos 450 dias (PE450_TOP), Produtividade Acumulada (PAC_TOP) e Probabilidade de Permanência no Rebanho, ou stayability (STAY_TOP); de Crescimento, Peso ao Nascer (PN_TOP), Peso aos 210, 365 e 450 dias (P210_TOP, P365_TOP e P450_TOP) e Habilidade Maternal para peso aos 120 e 210 dias (MP120_TOP e MP210_TOP); de Produtividade e Qualidade da Carne, Área de Olho de Lombo (AOL_TOP), Acabamento de Carcaça (ACAB_TOP) e Marmoreio (MARM_TOP); de Eficiência Alimentar, Consumo Alimentar Residual (CAR_TOP); além da Facilidade de Parto de Primíparas (FPP_TOP) e do escore de estrutura corporal, ou frame (FRAME_TOP), DEPs da ANCP posteriores a esse agrupamento, e do índice Mérito Genético Total Econômico (MGTe_TOP).</w:t>
       </w:r>
     </w:p>
     <w:p>
@@ -2372,7 +2372,7 @@
           <w:sz w:val="24"/>
           <w:lang w:val="pt-BR"/>
         </w:rPr>
-        <w:t>O SELO_NOVILHAS, que indicava os touros recomendados para uso em novilhas. Na amostra, os 29 touros com esse selo apresentaram mediana de TOP 13% para Peso ao Nascer e 7% para Facilidade de Parto, contra 88% e 79,5% nos demais touros.</w:t>
+        <w:t xml:space="preserve">O SELO_NOVILHAS, que indicava os touros recomendados para uso em novilhas. Na amostra, os 29 touros com esse selo apresentaram mediana de TOP 13% para Peso ao Nascer e 7% para Facilidade de Parto de Primíparas, contra 88% e 79,5% nos demais touros.</w:t>
       </w:r>
     </w:p>
     <w:p>
@@ -6760,7 +6760,7 @@
           <w:sz w:val="20"/>
           <w:lang w:val="pt-BR"/>
         </w:rPr>
-        <w:t xml:space="preserve">CAR = Consumo Alimentar Residual, STAY = Probabilidade de permanência no rebanho (stayability), FRAME = Tamanho corporal, MP210 = Habilidade maternal para peso aos 210 dias, MGTe = Mérito Genético Total Econômico, AOL = Área de Olho de Lombo. Ágio calculado entre as classes TOP ≤3% e TOP &gt;20%.</w:t>
+        <w:t xml:space="preserve">CAR = Consumo Alimentar Residual, STAY = Probabilidade de permanência no rebanho (stayability), FRAME = Escore de estrutura corporal (frame), MP210 = Habilidade maternal para peso aos 210 dias, MGTe = Mérito Genético Total Econômico, AOL = Área de Olho de Lombo. Ágio calculado entre as classes TOP ≤3% e TOP &gt;20%.</w:t>
       </w:r>
     </w:p>
     <w:p>
@@ -6910,6 +6910,90 @@
           <w:lang w:val="pt-BR"/>
         </w:rPr>
         <w:t/>
+      </w:r>
+    </w:p>
+    <w:p>
+      <w:pPr>
+        <w:keepNext w:val="0"/>
+        <w:keepLines w:val="0"/>
+        <w:pageBreakBefore w:val="0"/>
+        <w:widowControl w:val="1"/>
+        <w:pBdr>
+          <w:top w:space="0" w:sz="0" w:val="nil"/>
+          <w:left w:space="0" w:sz="0" w:val="nil"/>
+          <w:bottom w:space="0" w:sz="0" w:val="nil"/>
+          <w:right w:space="0" w:sz="0" w:val="nil"/>
+          <w:between w:space="0" w:sz="0" w:val="nil"/>
+        </w:pBdr>
+        <w:shd w:fill="auto" w:val="clear"/>
+        <w:spacing w:after="0" w:before="0" w:line="360" w:lineRule="auto"/>
+        <w:ind w:left="0" w:right="0" w:firstLine="709"/>
+        <w:jc w:val="both"/>
+        <w:rPr>
+          <w:rFonts w:ascii="Times New Roman" w:cs="Times New Roman" w:eastAsia="Times New Roman" w:hAnsi="Times New Roman"/>
+          <w:b w:val="0"/>
+          <w:bCs w:val="0"/>
+          <w:i w:val="0"/>
+          <w:iCs w:val="0"/>
+          <w:smallCaps w:val="0"/>
+          <w:strike w:val="0"/>
+          <w:color w:val="000000"/>
+          <w:sz w:val="24"/>
+          <w:szCs w:val="24"/>
+          <w:u w:val="none"/>
+          <w:shd w:fill="auto" w:val="clear"/>
+          <w:vertAlign w:val="baseline"/>
+        </w:rPr>
+      </w:pPr>
+      <w:r>
+        <w:rPr>
+          <w:rFonts w:ascii="Times New Roman" w:hAnsi="Times New Roman" w:cs="Times New Roman" w:eastAsia="Times New Roman"/>
+          <w:sz w:val="24"/>
+          <w:lang w:val="pt-BR"/>
+        </w:rPr>
+        <w:t xml:space="preserve">Para o Mérito Genético Total Econômico (MGTe), os preços médios aumentaram a partir da classe Elite. Reprodutores nas faixas Comercial (&gt;20%) e Superior (11 a 20%) registraram preços médios semelhantes (R$ 30,85 e R$ 30,62), que subiram para R$ 33,08 na classe Elite (4 a 10%) e R$ 34,01 na classe Super Elite (≤3%), gerando um ágio de +R$ 3,16 por dose (+10,2%) entre os extremos.</w:t>
+      </w:r>
+    </w:p>
+    <w:p>
+      <w:pPr>
+        <w:keepNext w:val="0"/>
+        <w:keepLines w:val="0"/>
+        <w:pageBreakBefore w:val="0"/>
+        <w:widowControl w:val="1"/>
+        <w:pBdr>
+          <w:top w:space="0" w:sz="0" w:val="nil"/>
+          <w:left w:space="0" w:sz="0" w:val="nil"/>
+          <w:bottom w:space="0" w:sz="0" w:val="nil"/>
+          <w:right w:space="0" w:sz="0" w:val="nil"/>
+          <w:between w:space="0" w:sz="0" w:val="nil"/>
+        </w:pBdr>
+        <w:shd w:fill="auto" w:val="clear"/>
+        <w:spacing w:after="0" w:before="0" w:line="360" w:lineRule="auto"/>
+        <w:ind w:left="0" w:right="0" w:firstLine="709"/>
+        <w:jc w:val="both"/>
+        <w:rPr>
+          <w:rFonts w:ascii="Times New Roman" w:cs="Times New Roman" w:eastAsia="Times New Roman" w:hAnsi="Times New Roman"/>
+          <w:b w:val="0"/>
+          <w:bCs w:val="0"/>
+          <w:i w:val="0"/>
+          <w:iCs w:val="0"/>
+          <w:smallCaps w:val="0"/>
+          <w:strike w:val="0"/>
+          <w:color w:val="000000"/>
+          <w:sz w:val="24"/>
+          <w:szCs w:val="24"/>
+          <w:u w:val="none"/>
+          <w:shd w:fill="auto" w:val="clear"/>
+          <w:vertAlign w:val="baseline"/>
+        </w:rPr>
+      </w:pPr>
+      <w:r>
+        <w:rPr>
+          <w:rFonts w:ascii="Times New Roman" w:hAnsi="Times New Roman" w:cs="Times New Roman" w:eastAsia="Times New Roman"/>
+          <w:sz w:val="24"/>
+          <w:lang w:val="pt-BR"/>
+        </w:rPr>
+        <w:t xml:space="preserve">O MGTe reúne características ponderais, de fertilidade e de carcaça em um único valor econômico (SILVEIRA, 2022), e os índices de seleção permitem selecionar para lucratividade a partir de um único valor (ROWAN, 2022). Seria de esperar, portanto, que o índice fosse valorizado; o ágio observado, porém, foi modesto (+10,2%) e não se distinguiu da variação casual (Figura 1). Uma explicação possível é que a amostra já é composta majoritariamente por touros de alto mérito: metade dos reprodutores estava entre os 7% melhores da raça para o MGTe.</w:t>
       </w:r>
     </w:p>
     <w:p>
@@ -7062,90 +7146,6 @@
           <w:sz w:val="24"/>
         </w:rPr>
         <w:t xml:space="preserve">Fonte: elaborado pelos autores (2026).</w:t>
-      </w:r>
-    </w:p>
-    <w:p>
-      <w:pPr>
-        <w:keepNext w:val="0"/>
-        <w:keepLines w:val="0"/>
-        <w:pageBreakBefore w:val="0"/>
-        <w:widowControl w:val="1"/>
-        <w:pBdr>
-          <w:top w:space="0" w:sz="0" w:val="nil"/>
-          <w:left w:space="0" w:sz="0" w:val="nil"/>
-          <w:bottom w:space="0" w:sz="0" w:val="nil"/>
-          <w:right w:space="0" w:sz="0" w:val="nil"/>
-          <w:between w:space="0" w:sz="0" w:val="nil"/>
-        </w:pBdr>
-        <w:shd w:fill="auto" w:val="clear"/>
-        <w:spacing w:after="0" w:before="0" w:line="360" w:lineRule="auto"/>
-        <w:ind w:left="0" w:right="0" w:firstLine="709"/>
-        <w:jc w:val="both"/>
-        <w:rPr>
-          <w:rFonts w:ascii="Times New Roman" w:cs="Times New Roman" w:eastAsia="Times New Roman" w:hAnsi="Times New Roman"/>
-          <w:b w:val="0"/>
-          <w:bCs w:val="0"/>
-          <w:i w:val="0"/>
-          <w:iCs w:val="0"/>
-          <w:smallCaps w:val="0"/>
-          <w:strike w:val="0"/>
-          <w:color w:val="000000"/>
-          <w:sz w:val="24"/>
-          <w:szCs w:val="24"/>
-          <w:u w:val="none"/>
-          <w:shd w:fill="auto" w:val="clear"/>
-          <w:vertAlign w:val="baseline"/>
-        </w:rPr>
-      </w:pPr>
-      <w:r>
-        <w:rPr>
-          <w:rFonts w:ascii="Times New Roman" w:hAnsi="Times New Roman" w:cs="Times New Roman" w:eastAsia="Times New Roman"/>
-          <w:sz w:val="24"/>
-          <w:lang w:val="pt-BR"/>
-        </w:rPr>
-        <w:t xml:space="preserve">Para o Mérito Genético Total Econômico (MGTe), os preços médios aumentaram a partir da classe Elite. Reprodutores nas faixas Comercial (&gt;20%) e Superior (11 a 20%) registraram preços médios semelhantes (R$ 30,85 e R$ 30,62), que subiram para R$ 33,08 na classe Elite (4 a 10%) e R$ 34,01 na classe Super Elite (≤3%), gerando um ágio de +R$ 3,16 por dose (+10,2%) entre os extremos.</w:t>
-      </w:r>
-    </w:p>
-    <w:p>
-      <w:pPr>
-        <w:keepNext w:val="0"/>
-        <w:keepLines w:val="0"/>
-        <w:pageBreakBefore w:val="0"/>
-        <w:widowControl w:val="1"/>
-        <w:pBdr>
-          <w:top w:space="0" w:sz="0" w:val="nil"/>
-          <w:left w:space="0" w:sz="0" w:val="nil"/>
-          <w:bottom w:space="0" w:sz="0" w:val="nil"/>
-          <w:right w:space="0" w:sz="0" w:val="nil"/>
-          <w:between w:space="0" w:sz="0" w:val="nil"/>
-        </w:pBdr>
-        <w:shd w:fill="auto" w:val="clear"/>
-        <w:spacing w:after="0" w:before="0" w:line="360" w:lineRule="auto"/>
-        <w:ind w:left="0" w:right="0" w:firstLine="709"/>
-        <w:jc w:val="both"/>
-        <w:rPr>
-          <w:rFonts w:ascii="Times New Roman" w:cs="Times New Roman" w:eastAsia="Times New Roman" w:hAnsi="Times New Roman"/>
-          <w:b w:val="0"/>
-          <w:bCs w:val="0"/>
-          <w:i w:val="0"/>
-          <w:iCs w:val="0"/>
-          <w:smallCaps w:val="0"/>
-          <w:strike w:val="0"/>
-          <w:color w:val="000000"/>
-          <w:sz w:val="24"/>
-          <w:szCs w:val="24"/>
-          <w:u w:val="none"/>
-          <w:shd w:fill="auto" w:val="clear"/>
-          <w:vertAlign w:val="baseline"/>
-        </w:rPr>
-      </w:pPr>
-      <w:r>
-        <w:rPr>
-          <w:rFonts w:ascii="Times New Roman" w:hAnsi="Times New Roman" w:cs="Times New Roman" w:eastAsia="Times New Roman"/>
-          <w:sz w:val="24"/>
-          <w:lang w:val="pt-BR"/>
-        </w:rPr>
-        <w:t xml:space="preserve">O MGTe reúne características ponderais, de fertilidade e de carcaça em um único valor econômico (SILVEIRA, 2022), e os índices de seleção permitem selecionar para lucratividade a partir de um único valor (ROWAN, 2022). Seria de esperar, portanto, que o índice fosse valorizado; o ágio observado, porém, foi modesto (+10,2%) e não se distinguiu da variação casual (Figura 1). Uma explicação possível é que a amostra já é composta majoritariamente por touros de alto mérito: metade dos reprodutores estava entre os 7% melhores da raça para o MGTe.</w:t>
       </w:r>
     </w:p>
     <w:p>
@@ -11818,6 +11818,48 @@
     </w:p>
     <w:p>
       <w:pPr>
+        <w:keepNext w:val="0"/>
+        <w:keepLines w:val="0"/>
+        <w:pageBreakBefore w:val="0"/>
+        <w:widowControl w:val="1"/>
+        <w:pBdr>
+          <w:top w:space="0" w:sz="0" w:val="nil"/>
+          <w:left w:space="0" w:sz="0" w:val="nil"/>
+          <w:bottom w:space="0" w:sz="0" w:val="nil"/>
+          <w:right w:space="0" w:sz="0" w:val="nil"/>
+          <w:between w:space="0" w:sz="0" w:val="nil"/>
+        </w:pBdr>
+        <w:shd w:fill="auto" w:val="clear"/>
+        <w:spacing w:after="0" w:before="0" w:line="360" w:lineRule="auto"/>
+        <w:ind w:left="0" w:right="0" w:firstLine="709"/>
+        <w:jc w:val="both"/>
+        <w:rPr>
+          <w:rFonts w:ascii="Times New Roman" w:cs="Times New Roman" w:eastAsia="Times New Roman" w:hAnsi="Times New Roman"/>
+          <w:b w:val="0"/>
+          <w:bCs w:val="0"/>
+          <w:i w:val="0"/>
+          <w:iCs w:val="0"/>
+          <w:smallCaps w:val="0"/>
+          <w:strike w:val="0"/>
+          <w:color w:val="000000"/>
+          <w:sz w:val="24"/>
+          <w:szCs w:val="24"/>
+          <w:u w:val="none"/>
+          <w:shd w:fill="auto" w:val="clear"/>
+          <w:vertAlign w:val="baseline"/>
+        </w:rPr>
+      </w:pPr>
+      <w:r>
+        <w:rPr>
+          <w:rFonts w:ascii="Times New Roman" w:hAnsi="Times New Roman" w:cs="Times New Roman" w:eastAsia="Times New Roman"/>
+          <w:sz w:val="24"/>
+          <w:lang w:val="pt-BR"/>
+        </w:rPr>
+        <w:t xml:space="preserve">Como o ágio do CAR concentrou-se no estrato Super Elite, o modelo final foi reestimado com o CAR representado pelo indicador dessa classe (SUPER_CAR: TOP ≤ 3%; N = 18) no lugar do TOP contínuo. Nessa especificação, exploratória por ter sido sugerida pelos próprios dados, o ágio dos touros Super Elite para CAR manteve significância na presença dos selos (+R$ 4,77; p = 0,019), assim como o SELO_IFERT (+R$ 5,14; p &lt; 0,001) e o SELO_MATERNAL (+R$ 2,34; p = 0,043), com AIC menor (730,3; R² = 32,7%). Assim, a perda de significância do CAR na presença dos selos refere-se ao efeito linear do TOP, e não ao ágio dos touros no topo da distribuição.</w:t>
+      </w:r>
+    </w:p>
+    <w:p>
+      <w:pPr>
         <w:keepNext w:val="1"/>
         <w:keepLines w:val="0"/>
         <w:pageBreakBefore w:val="0"/>
@@ -11966,48 +12008,6 @@
           <w:sz w:val="24"/>
         </w:rPr>
         <w:t xml:space="preserve">Fonte: elaborado pelos autores (2026).</w:t>
-      </w:r>
-    </w:p>
-    <w:p>
-      <w:pPr>
-        <w:keepNext w:val="0"/>
-        <w:keepLines w:val="0"/>
-        <w:pageBreakBefore w:val="0"/>
-        <w:widowControl w:val="1"/>
-        <w:pBdr>
-          <w:top w:space="0" w:sz="0" w:val="nil"/>
-          <w:left w:space="0" w:sz="0" w:val="nil"/>
-          <w:bottom w:space="0" w:sz="0" w:val="nil"/>
-          <w:right w:space="0" w:sz="0" w:val="nil"/>
-          <w:between w:space="0" w:sz="0" w:val="nil"/>
-        </w:pBdr>
-        <w:shd w:fill="auto" w:val="clear"/>
-        <w:spacing w:after="0" w:before="0" w:line="360" w:lineRule="auto"/>
-        <w:ind w:left="0" w:right="0" w:firstLine="709"/>
-        <w:jc w:val="both"/>
-        <w:rPr>
-          <w:rFonts w:ascii="Times New Roman" w:cs="Times New Roman" w:eastAsia="Times New Roman" w:hAnsi="Times New Roman"/>
-          <w:b w:val="0"/>
-          <w:bCs w:val="0"/>
-          <w:i w:val="0"/>
-          <w:iCs w:val="0"/>
-          <w:smallCaps w:val="0"/>
-          <w:strike w:val="0"/>
-          <w:color w:val="000000"/>
-          <w:sz w:val="24"/>
-          <w:szCs w:val="24"/>
-          <w:u w:val="none"/>
-          <w:shd w:fill="auto" w:val="clear"/>
-          <w:vertAlign w:val="baseline"/>
-        </w:rPr>
-      </w:pPr>
-      <w:r>
-        <w:rPr>
-          <w:rFonts w:ascii="Times New Roman" w:hAnsi="Times New Roman" w:cs="Times New Roman" w:eastAsia="Times New Roman"/>
-          <w:sz w:val="24"/>
-          <w:lang w:val="pt-BR"/>
-        </w:rPr>
-        <w:t xml:space="preserve">Como o ágio do CAR concentrou-se no estrato Super Elite, o modelo final foi reestimado com o CAR representado pelo indicador dessa classe (SUPER_CAR: TOP ≤ 3%; N = 18) no lugar do TOP contínuo. Nessa especificação, exploratória por ter sido sugerida pelos próprios dados, o ágio dos touros Super Elite para CAR manteve significância na presença dos selos (+R$ 4,77; p = 0,019), assim como o SELO_IFERT (+R$ 5,14; p &lt; 0,001) e o SELO_MATERNAL (+R$ 2,34; p = 0,043), com AIC menor (730,3; R² = 32,7%). Assim, a perda de significância do CAR na presença dos selos refere-se ao efeito linear do TOP, e não ao ágio dos touros no topo da distribuição.</w:t>
       </w:r>
     </w:p>
     <w:p>

</xml_diff>

<commit_message>
docs: mantém a equação do modelo final na página da frase que a apresenta
- a página terminava em 'foi especificado como:' e a equação ficava na página
  seguinte; frases terminadas em dois-pontos agora ficam junto do que vem depois
</commit_message>
<xml_diff>
--- a/Docs/Artigo_SIMPOS_2026_v8_2026-10-15.docx
+++ b/Docs/Artigo_SIMPOS_2026_v8_2026-10-15.docx
@@ -1013,7 +1013,7 @@
     </w:p>
     <w:p>
       <w:pPr>
-        <w:keepNext w:val="0"/>
+        <w:keepNext w:val="1"/>
         <w:keepLines w:val="0"/>
         <w:pageBreakBefore w:val="0"/>
         <w:widowControl w:val="1"/>
@@ -1226,6 +1226,563 @@
     </w:p>
     <w:p>
       <w:pPr>
+        <w:keepNext w:val="1"/>
+        <w:keepLines w:val="0"/>
+        <w:pageBreakBefore w:val="0"/>
+        <w:widowControl w:val="1"/>
+        <w:pBdr>
+          <w:top w:space="0" w:sz="0" w:val="nil"/>
+          <w:left w:space="0" w:sz="0" w:val="nil"/>
+          <w:bottom w:space="0" w:sz="0" w:val="nil"/>
+          <w:right w:space="0" w:sz="0" w:val="nil"/>
+          <w:between w:space="0" w:sz="0" w:val="nil"/>
+        </w:pBdr>
+        <w:shd w:fill="auto" w:val="clear"/>
+        <w:spacing w:after="0" w:before="0" w:line="360" w:lineRule="auto"/>
+        <w:ind w:left="0" w:right="0" w:firstLine="709"/>
+        <w:jc w:val="both"/>
+        <w:rPr>
+          <w:rFonts w:ascii="Times New Roman" w:cs="Times New Roman" w:eastAsia="Times New Roman" w:hAnsi="Times New Roman"/>
+          <w:b w:val="0"/>
+          <w:bCs w:val="0"/>
+          <w:i w:val="0"/>
+          <w:iCs w:val="0"/>
+          <w:smallCaps w:val="0"/>
+          <w:strike w:val="0"/>
+          <w:color w:val="000000"/>
+          <w:sz w:val="24"/>
+          <w:szCs w:val="24"/>
+          <w:u w:val="none"/>
+          <w:shd w:fill="auto" w:val="clear"/>
+          <w:vertAlign w:val="baseline"/>
+        </w:rPr>
+      </w:pPr>
+      <w:r>
+        <w:rPr>
+          <w:rFonts w:ascii="Times New Roman" w:hAnsi="Times New Roman" w:cs="Times New Roman" w:eastAsia="Times New Roman"/>
+          <w:sz w:val="24"/>
+          <w:lang w:val="pt-BR"/>
+        </w:rPr>
+        <w:t xml:space="preserve">em que:</w:t>
+      </w:r>
+    </w:p>
+    <w:p>
+      <w:pPr>
+        <w:pStyle w:val="PargrafodaLista"/>
+        <w:numPr>
+          <w:ilvl w:val="0"/>
+          <w:numId w:val="6"/>
+        </w:numPr>
+        <w:rPr>
+          <w:lang w:val="pt-BR"/>
+        </w:rPr>
+        <w:spacing w:line="360" w:lineRule="auto" w:after="0"/>
+      </w:pPr>
+      <w:r>
+        <w:rPr>
+          <w:rFonts w:ascii="Times New Roman" w:hAnsi="Times New Roman" w:cs="Times New Roman" w:eastAsia="Times New Roman"/>
+          <w:sz w:val="24"/>
+          <w:lang w:val="pt-BR"/>
+        </w:rPr>
+        <w:t>P</w:t>
+      </w:r>
+      <w:r>
+        <w:rPr>
+          <w:rFonts w:ascii="Times New Roman" w:hAnsi="Times New Roman" w:cs="Times New Roman" w:eastAsia="Times New Roman"/>
+          <w:sz w:val="24"/>
+          <w:lang w:val="pt-BR"/>
+        </w:rPr>
+        <w:t xml:space="preserve"> </w:t>
+      </w:r>
+      <w:r>
+        <w:rPr>
+          <w:rFonts w:ascii="Times New Roman" w:hAnsi="Times New Roman" w:cs="Times New Roman" w:eastAsia="Times New Roman"/>
+          <w:sz w:val="24"/>
+          <w:lang w:val="pt-BR"/>
+        </w:rPr>
+        <w:t>é</w:t>
+      </w:r>
+      <w:r>
+        <w:rPr>
+          <w:rFonts w:ascii="Times New Roman" w:hAnsi="Times New Roman" w:cs="Times New Roman" w:eastAsia="Times New Roman"/>
+          <w:sz w:val="24"/>
+          <w:lang w:val="pt-BR"/>
+        </w:rPr>
+        <w:t xml:space="preserve"> </w:t>
+      </w:r>
+      <w:r>
+        <w:rPr>
+          <w:rFonts w:ascii="Times New Roman" w:hAnsi="Times New Roman" w:cs="Times New Roman" w:eastAsia="Times New Roman"/>
+          <w:sz w:val="24"/>
+          <w:lang w:val="pt-BR"/>
+        </w:rPr>
+        <w:t>v</w:t>
+      </w:r>
+      <w:r>
+        <w:rPr>
+          <w:rFonts w:ascii="Times New Roman" w:hAnsi="Times New Roman" w:cs="Times New Roman" w:eastAsia="Times New Roman"/>
+          <w:sz w:val="24"/>
+          <w:lang w:val="pt-BR"/>
+        </w:rPr>
+        <w:t>etor d</w:t>
+      </w:r>
+      <w:r>
+        <w:rPr>
+          <w:rFonts w:ascii="Times New Roman" w:hAnsi="Times New Roman" w:cs="Times New Roman" w:eastAsia="Times New Roman"/>
+          <w:sz w:val="24"/>
+          <w:lang w:val="pt-BR"/>
+        </w:rPr>
+        <w:t>os</w:t>
+      </w:r>
+      <w:r>
+        <w:rPr>
+          <w:rFonts w:ascii="Times New Roman" w:hAnsi="Times New Roman" w:cs="Times New Roman" w:eastAsia="Times New Roman"/>
+          <w:sz w:val="24"/>
+          <w:lang w:val="pt-BR"/>
+        </w:rPr>
+        <w:t xml:space="preserve"> p</w:t>
+      </w:r>
+      <w:r>
+        <w:rPr>
+          <w:rFonts w:ascii="Times New Roman" w:hAnsi="Times New Roman" w:cs="Times New Roman" w:eastAsia="Times New Roman"/>
+          <w:sz w:val="24"/>
+          <w:lang w:val="pt-BR"/>
+        </w:rPr>
+        <w:t>reço</w:t>
+      </w:r>
+      <w:r>
+        <w:rPr>
+          <w:rFonts w:ascii="Times New Roman" w:hAnsi="Times New Roman" w:cs="Times New Roman" w:eastAsia="Times New Roman"/>
+          <w:sz w:val="24"/>
+          <w:lang w:val="pt-BR"/>
+        </w:rPr>
+        <w:t>s</w:t>
+      </w:r>
+      <w:r>
+        <w:rPr>
+          <w:rFonts w:ascii="Times New Roman" w:hAnsi="Times New Roman" w:cs="Times New Roman" w:eastAsia="Times New Roman"/>
+          <w:sz w:val="24"/>
+          <w:lang w:val="pt-BR"/>
+        </w:rPr>
+        <w:t xml:space="preserve"> da</w:t>
+      </w:r>
+      <w:r>
+        <w:rPr>
+          <w:rFonts w:ascii="Times New Roman" w:hAnsi="Times New Roman" w:cs="Times New Roman" w:eastAsia="Times New Roman"/>
+          <w:sz w:val="24"/>
+          <w:lang w:val="pt-BR"/>
+        </w:rPr>
+        <w:t>s</w:t>
+      </w:r>
+      <w:r>
+        <w:rPr>
+          <w:rFonts w:ascii="Times New Roman" w:hAnsi="Times New Roman" w:cs="Times New Roman" w:eastAsia="Times New Roman"/>
+          <w:sz w:val="24"/>
+          <w:lang w:val="pt-BR"/>
+        </w:rPr>
+        <w:t xml:space="preserve"> dose</w:t>
+      </w:r>
+      <w:r>
+        <w:rPr>
+          <w:rFonts w:ascii="Times New Roman" w:hAnsi="Times New Roman" w:cs="Times New Roman" w:eastAsia="Times New Roman"/>
+          <w:sz w:val="24"/>
+          <w:lang w:val="pt-BR"/>
+        </w:rPr>
+        <w:t>s</w:t>
+      </w:r>
+      <w:r>
+        <w:rPr>
+          <w:rFonts w:ascii="Times New Roman" w:hAnsi="Times New Roman" w:cs="Times New Roman" w:eastAsia="Times New Roman"/>
+          <w:sz w:val="24"/>
+          <w:lang w:val="pt-BR"/>
+        </w:rPr>
+        <w:t xml:space="preserve"> de sêmen convencional</w:t>
+      </w:r>
+      <w:r>
+        <w:rPr>
+          <w:rFonts w:ascii="Times New Roman" w:hAnsi="Times New Roman" w:cs="Times New Roman" w:eastAsia="Times New Roman"/>
+          <w:sz w:val="24"/>
+          <w:lang w:val="pt-BR"/>
+        </w:rPr>
+        <w:t xml:space="preserve"> </w:t>
+      </w:r>
+      <w:r>
+        <w:rPr>
+          <w:rFonts w:ascii="Times New Roman" w:hAnsi="Times New Roman" w:cs="Times New Roman" w:eastAsia="Times New Roman"/>
+          <w:sz w:val="24"/>
+          <w:lang w:val="pt-BR"/>
+        </w:rPr>
+        <w:t xml:space="preserve">dos touros em reais</w:t>
+      </w:r>
+      <w:r>
+        <w:rPr>
+          <w:rFonts w:ascii="Times New Roman" w:hAnsi="Times New Roman" w:cs="Times New Roman" w:eastAsia="Times New Roman"/>
+          <w:sz w:val="24"/>
+          <w:lang w:val="pt-BR"/>
+        </w:rPr>
+        <w:t xml:space="preserve"/>
+      </w:r>
+      <w:r>
+        <w:rPr>
+          <w:rFonts w:ascii="Times New Roman" w:hAnsi="Times New Roman" w:cs="Times New Roman" w:eastAsia="Times New Roman"/>
+          <w:sz w:val="24"/>
+          <w:lang w:val="pt-BR"/>
+        </w:rPr>
+        <w:t xml:space="preserve"/>
+      </w:r>
+      <w:r>
+        <w:rPr>
+          <w:rFonts w:ascii="Times New Roman" w:hAnsi="Times New Roman" w:cs="Times New Roman" w:eastAsia="Times New Roman"/>
+          <w:sz w:val="24"/>
+          <w:lang w:val="pt-BR"/>
+        </w:rPr>
+        <w:t xml:space="preserve"> (R$)</w:t>
+      </w:r>
+    </w:p>
+    <w:p>
+      <w:pPr>
+        <w:pStyle w:val="PargrafodaLista"/>
+        <w:numPr>
+          <w:ilvl w:val="0"/>
+          <w:numId w:val="6"/>
+        </w:numPr>
+        <w:rPr>
+          <w:lang w:val="pt-BR"/>
+        </w:rPr>
+        <w:spacing w:line="360" w:lineRule="auto" w:after="0"/>
+      </w:pPr>
+      <m:oMath>
+        <m:sSub>
+          <m:sSubPr>
+            <m:ctrlPr>
+              <w:rPr>
+                <w:rFonts w:ascii="Cambria Math" w:hAnsi="Cambria Math"/>
+                <w:sz w:val="28"/>
+                <w:szCs w:val="28"/>
+              </w:rPr>
+            </m:ctrlPr>
+          </m:sSubPr>
+          <m:e>
+            <m:r>
+              <w:rPr>
+                <w:rFonts w:ascii="Cambria Math" w:hAnsi="Cambria Math"/>
+                <w:sz w:val="28"/>
+                <w:szCs w:val="28"/>
+              </w:rPr>
+              <m:t>Z</m:t>
+            </m:r>
+          </m:e>
+          <m:sub>
+            <m:r>
+              <w:rPr>
+                <w:rFonts w:ascii="Cambria Math" w:hAnsi="Cambria Math"/>
+                <w:sz w:val="28"/>
+                <w:szCs w:val="28"/>
+              </w:rPr>
+              <m:t>gen</m:t>
+            </m:r>
+          </m:sub>
+        </m:sSub>
+      </m:oMath>
+      <w:r>
+        <w:rPr>
+          <w:rFonts w:ascii="Times New Roman" w:hAnsi="Times New Roman" w:cs="Times New Roman" w:eastAsia="Times New Roman"/>
+          <w:sz w:val="24"/>
+          <w:szCs w:val="28"/>
+          <w:lang w:val="pt-BR"/>
+        </w:rPr>
+        <w:t xml:space="preserve"> </w:t>
+      </w:r>
+      <w:r>
+        <w:rPr>
+          <w:rFonts w:ascii="Times New Roman" w:hAnsi="Times New Roman" w:cs="Times New Roman" w:eastAsia="Times New Roman"/>
+          <w:sz w:val="24"/>
+          <w:lang w:val="pt-BR"/>
+        </w:rPr>
+        <w:t xml:space="preserve">é a matriz </w:t>
+      </w:r>
+      <w:r>
+        <w:rPr>
+          <w:rFonts w:ascii="Times New Roman" w:hAnsi="Times New Roman" w:cs="Times New Roman" w:eastAsia="Times New Roman"/>
+          <w:sz w:val="24"/>
+          <w:lang w:val="pt-BR"/>
+        </w:rPr>
+        <w:t>d</w:t>
+      </w:r>
+      <w:r>
+        <w:rPr>
+          <w:rFonts w:ascii="Times New Roman" w:hAnsi="Times New Roman" w:cs="Times New Roman" w:eastAsia="Times New Roman"/>
+          <w:sz w:val="24"/>
+          <w:lang w:val="pt-BR"/>
+        </w:rPr>
+        <w:t>os</w:t>
+      </w:r>
+      <w:r>
+        <w:rPr>
+          <w:rFonts w:ascii="Times New Roman" w:hAnsi="Times New Roman" w:cs="Times New Roman" w:eastAsia="Times New Roman"/>
+          <w:sz w:val="24"/>
+          <w:lang w:val="pt-BR"/>
+        </w:rPr>
+        <w:t xml:space="preserve"> valor</w:t>
+      </w:r>
+      <w:r>
+        <w:rPr>
+          <w:rFonts w:ascii="Times New Roman" w:hAnsi="Times New Roman" w:cs="Times New Roman" w:eastAsia="Times New Roman"/>
+          <w:sz w:val="24"/>
+          <w:lang w:val="pt-BR"/>
+        </w:rPr>
+        <w:t xml:space="preserve">es </w:t>
+      </w:r>
+      <w:r>
+        <w:rPr>
+          <w:rFonts w:ascii="Times New Roman" w:hAnsi="Times New Roman" w:cs="Times New Roman" w:eastAsia="Times New Roman"/>
+          <w:sz w:val="24"/>
+          <w:lang w:val="pt-BR"/>
+        </w:rPr>
+        <w:t>de ranque d</w:t>
+      </w:r>
+      <w:r>
+        <w:rPr>
+          <w:rFonts w:ascii="Times New Roman" w:hAnsi="Times New Roman" w:cs="Times New Roman" w:eastAsia="Times New Roman"/>
+          <w:sz w:val="24"/>
+          <w:lang w:val="pt-BR"/>
+        </w:rPr>
+        <w:t xml:space="preserve">as DEP </w:t>
+      </w:r>
+      <w:r>
+        <w:rPr>
+          <w:rFonts w:ascii="Times New Roman" w:hAnsi="Times New Roman" w:cs="Times New Roman" w:eastAsia="Times New Roman"/>
+          <w:sz w:val="24"/>
+          <w:lang w:val="pt-BR"/>
+        </w:rPr>
+        <w:t>dos</w:t>
+      </w:r>
+      <w:r>
+        <w:rPr>
+          <w:rFonts w:ascii="Times New Roman" w:hAnsi="Times New Roman" w:cs="Times New Roman" w:eastAsia="Times New Roman"/>
+          <w:sz w:val="24"/>
+          <w:lang w:val="pt-BR"/>
+        </w:rPr>
+        <w:t xml:space="preserve"> touro</w:t>
+      </w:r>
+      <w:r>
+        <w:rPr>
+          <w:rFonts w:ascii="Times New Roman" w:hAnsi="Times New Roman" w:cs="Times New Roman" w:eastAsia="Times New Roman"/>
+          <w:sz w:val="24"/>
+          <w:lang w:val="pt-BR"/>
+        </w:rPr>
+        <w:t>s</w:t>
+      </w:r>
+      <w:r>
+        <w:rPr>
+          <w:rFonts w:ascii="Times New Roman" w:hAnsi="Times New Roman" w:cs="Times New Roman" w:eastAsia="Times New Roman"/>
+          <w:sz w:val="24"/>
+          <w:lang w:val="pt-BR"/>
+        </w:rPr>
+        <w:t xml:space="preserve"> para</w:t>
+      </w:r>
+      <w:r>
+        <w:rPr>
+          <w:rFonts w:ascii="Times New Roman" w:hAnsi="Times New Roman" w:cs="Times New Roman" w:eastAsia="Times New Roman"/>
+          <w:sz w:val="24"/>
+          <w:lang w:val="pt-BR"/>
+        </w:rPr>
+        <w:t xml:space="preserve"> a</w:t>
+      </w:r>
+      <w:r>
+        <w:rPr>
+          <w:rFonts w:ascii="Times New Roman" w:hAnsi="Times New Roman" w:cs="Times New Roman" w:eastAsia="Times New Roman"/>
+          <w:sz w:val="24"/>
+          <w:lang w:val="pt-BR"/>
+        </w:rPr>
+        <w:t>s 18 características consideradas no estudo,</w:t>
+      </w:r>
+      <w:r>
+        <w:rPr>
+          <w:rFonts w:ascii="Times New Roman" w:hAnsi="Times New Roman" w:cs="Times New Roman" w:eastAsia="Times New Roman"/>
+          <w:sz w:val="24"/>
+          <w:lang w:val="pt-BR"/>
+        </w:rPr>
+        <w:t xml:space="preserve"> expressos em percentis (%)</w:t>
+      </w:r>
+      <w:r>
+        <w:rPr>
+          <w:rFonts w:ascii="Times New Roman" w:hAnsi="Times New Roman" w:cs="Times New Roman" w:eastAsia="Times New Roman"/>
+          <w:sz w:val="24"/>
+          <w:lang w:val="pt-BR"/>
+        </w:rPr>
+        <w:t>.</w:t>
+      </w:r>
+    </w:p>
+    <w:p>
+      <w:pPr>
+        <w:pStyle w:val="PargrafodaLista"/>
+        <w:numPr>
+          <w:ilvl w:val="0"/>
+          <w:numId w:val="6"/>
+        </w:numPr>
+        <w:rPr>
+          <w:lang w:val="pt-BR"/>
+        </w:rPr>
+        <w:spacing w:line="360" w:lineRule="auto" w:after="0"/>
+      </w:pPr>
+      <m:oMath>
+        <m:sSub>
+          <m:sSubPr>
+            <m:ctrlPr>
+              <w:rPr>
+                <w:rFonts w:ascii="Cambria Math" w:hAnsi="Cambria Math"/>
+              </w:rPr>
+            </m:ctrlPr>
+          </m:sSubPr>
+          <m:e>
+            <m:r>
+              <w:rPr>
+                <w:rFonts w:ascii="Cambria Math" w:hAnsi="Cambria Math"/>
+              </w:rPr>
+              <m:t>Z</m:t>
+            </m:r>
+          </m:e>
+          <m:sub>
+            <m:r>
+              <w:rPr>
+                <w:rFonts w:ascii="Cambria Math" w:hAnsi="Cambria Math"/>
+              </w:rPr>
+              <m:t>mkt</m:t>
+            </m:r>
+          </m:sub>
+        </m:sSub>
+      </m:oMath>
+      <w:r>
+        <w:rPr>
+          <w:rFonts w:ascii="Times New Roman" w:hAnsi="Times New Roman" w:cs="Times New Roman" w:eastAsia="Times New Roman"/>
+          <w:sz w:val="24"/>
+          <w:lang w:val="pt-BR"/>
+        </w:rPr>
+        <w:t xml:space="preserve"> é a matriz de incidência</w:t>
+      </w:r>
+      <w:r>
+        <w:rPr>
+          <w:rFonts w:ascii="Times New Roman" w:hAnsi="Times New Roman" w:cs="Times New Roman" w:eastAsia="Times New Roman"/>
+          <w:sz w:val="24"/>
+          <w:lang w:val="pt-BR"/>
+        </w:rPr>
+        <w:t xml:space="preserve"> </w:t>
+      </w:r>
+      <w:r>
+        <w:rPr>
+          <w:rFonts w:ascii="Times New Roman" w:hAnsi="Times New Roman" w:cs="Times New Roman" w:eastAsia="Times New Roman"/>
+          <w:sz w:val="24"/>
+          <w:lang w:val="pt-BR"/>
+        </w:rPr>
+        <w:t xml:space="preserve">dos touros </w:t>
+      </w:r>
+      <w:r>
+        <w:rPr>
+          <w:rFonts w:ascii="Times New Roman" w:hAnsi="Times New Roman" w:cs="Times New Roman" w:eastAsia="Times New Roman"/>
+          <w:sz w:val="24"/>
+          <w:lang w:val="pt-BR"/>
+        </w:rPr>
+        <w:t>para os 6 selos</w:t>
+      </w:r>
+      <w:r>
+        <w:rPr>
+          <w:rFonts w:ascii="Times New Roman" w:hAnsi="Times New Roman" w:cs="Times New Roman" w:eastAsia="Times New Roman"/>
+          <w:sz w:val="24"/>
+          <w:lang w:val="pt-BR"/>
+        </w:rPr>
+        <w:t xml:space="preserve"> considerados no estudo</w:t>
+      </w:r>
+    </w:p>
+    <w:p>
+      <w:pPr>
+        <w:pStyle w:val="PargrafodaLista"/>
+        <w:numPr>
+          <w:ilvl w:val="0"/>
+          <w:numId w:val="6"/>
+        </w:numPr>
+        <w:rPr>
+          <w:lang w:val="pt-BR"/>
+        </w:rPr>
+        <w:spacing w:line="360" w:lineRule="auto" w:after="0"/>
+      </w:pPr>
+      <m:oMath>
+        <m:sSub>
+          <m:sSubPr>
+            <m:ctrlPr>
+              <w:rPr>
+                <w:rFonts w:ascii="Cambria Math" w:hAnsi="Cambria Math"/>
+                <w:sz w:val="28"/>
+                <w:szCs w:val="28"/>
+              </w:rPr>
+            </m:ctrlPr>
+          </m:sSubPr>
+          <m:e>
+            <m:r>
+              <w:rPr>
+                <w:rFonts w:ascii="Cambria Math" w:hAnsi="Cambria Math"/>
+                <w:sz w:val="28"/>
+                <w:szCs w:val="28"/>
+              </w:rPr>
+              <m:t>Z</m:t>
+            </m:r>
+          </m:e>
+          <m:sub>
+            <m:r>
+              <w:rPr>
+                <w:rFonts w:ascii="Cambria Math" w:hAnsi="Cambria Math"/>
+                <w:sz w:val="28"/>
+                <w:szCs w:val="28"/>
+              </w:rPr>
+              <m:t>lin</m:t>
+            </m:r>
+          </m:sub>
+        </m:sSub>
+      </m:oMath>
+      <w:r>
+        <w:rPr>
+          <w:rFonts w:ascii="Times New Roman" w:hAnsi="Times New Roman" w:cs="Times New Roman" w:eastAsia="Times New Roman"/>
+          <w:sz w:val="24"/>
+          <w:szCs w:val="28"/>
+          <w:lang w:val="pt-BR"/>
+        </w:rPr>
+        <w:t xml:space="preserve"> </w:t>
+      </w:r>
+      <w:r>
+        <w:rPr>
+          <w:rFonts w:ascii="Times New Roman" w:hAnsi="Times New Roman" w:cs="Times New Roman" w:eastAsia="Times New Roman"/>
+          <w:sz w:val="24"/>
+          <w:lang w:val="pt-BR"/>
+        </w:rPr>
+        <w:t>é a matriz de incidência</w:t>
+      </w:r>
+      <w:r>
+        <w:rPr>
+          <w:rFonts w:ascii="Times New Roman" w:hAnsi="Times New Roman" w:cs="Times New Roman" w:eastAsia="Times New Roman"/>
+          <w:sz w:val="24"/>
+          <w:lang w:val="pt-BR"/>
+        </w:rPr>
+        <w:t xml:space="preserve"> </w:t>
+      </w:r>
+      <w:r>
+        <w:rPr>
+          <w:rFonts w:ascii="Times New Roman" w:hAnsi="Times New Roman" w:cs="Times New Roman" w:eastAsia="Times New Roman"/>
+          <w:sz w:val="24"/>
+          <w:lang w:val="pt-BR"/>
+        </w:rPr>
+        <w:t>dos touros</w:t>
+      </w:r>
+      <w:r>
+        <w:rPr>
+          <w:rFonts w:ascii="Times New Roman" w:hAnsi="Times New Roman" w:cs="Times New Roman" w:eastAsia="Times New Roman"/>
+          <w:sz w:val="24"/>
+          <w:lang w:val="pt-BR"/>
+        </w:rPr>
+        <w:t xml:space="preserve"> para as 7 linhagens consideradas no estudo.</w:t>
+      </w:r>
+    </w:p>
+    <w:p>
+      <w:pPr>
         <w:keepNext w:val="0"/>
         <w:keepLines w:val="0"/>
         <w:pageBreakBefore w:val="0"/>
@@ -1263,522 +1820,7 @@
           <w:sz w:val="24"/>
           <w:lang w:val="pt-BR"/>
         </w:rPr>
-        <w:t xml:space="preserve">em que:</w:t>
-      </w:r>
-    </w:p>
-    <w:p>
-      <w:pPr>
-        <w:pStyle w:val="PargrafodaLista"/>
-        <w:numPr>
-          <w:ilvl w:val="0"/>
-          <w:numId w:val="6"/>
-        </w:numPr>
-        <w:rPr>
-          <w:lang w:val="pt-BR"/>
-        </w:rPr>
-        <w:spacing w:line="360" w:lineRule="auto" w:after="0"/>
-      </w:pPr>
-      <w:r>
-        <w:rPr>
-          <w:rFonts w:ascii="Times New Roman" w:hAnsi="Times New Roman" w:cs="Times New Roman" w:eastAsia="Times New Roman"/>
-          <w:sz w:val="24"/>
-          <w:lang w:val="pt-BR"/>
-        </w:rPr>
-        <w:t>P</w:t>
-      </w:r>
-      <w:r>
-        <w:rPr>
-          <w:rFonts w:ascii="Times New Roman" w:hAnsi="Times New Roman" w:cs="Times New Roman" w:eastAsia="Times New Roman"/>
-          <w:sz w:val="24"/>
-          <w:lang w:val="pt-BR"/>
-        </w:rPr>
-        <w:t xml:space="preserve"> </w:t>
-      </w:r>
-      <w:r>
-        <w:rPr>
-          <w:rFonts w:ascii="Times New Roman" w:hAnsi="Times New Roman" w:cs="Times New Roman" w:eastAsia="Times New Roman"/>
-          <w:sz w:val="24"/>
-          <w:lang w:val="pt-BR"/>
-        </w:rPr>
-        <w:t>é</w:t>
-      </w:r>
-      <w:r>
-        <w:rPr>
-          <w:rFonts w:ascii="Times New Roman" w:hAnsi="Times New Roman" w:cs="Times New Roman" w:eastAsia="Times New Roman"/>
-          <w:sz w:val="24"/>
-          <w:lang w:val="pt-BR"/>
-        </w:rPr>
-        <w:t xml:space="preserve"> </w:t>
-      </w:r>
-      <w:r>
-        <w:rPr>
-          <w:rFonts w:ascii="Times New Roman" w:hAnsi="Times New Roman" w:cs="Times New Roman" w:eastAsia="Times New Roman"/>
-          <w:sz w:val="24"/>
-          <w:lang w:val="pt-BR"/>
-        </w:rPr>
-        <w:t>v</w:t>
-      </w:r>
-      <w:r>
-        <w:rPr>
-          <w:rFonts w:ascii="Times New Roman" w:hAnsi="Times New Roman" w:cs="Times New Roman" w:eastAsia="Times New Roman"/>
-          <w:sz w:val="24"/>
-          <w:lang w:val="pt-BR"/>
-        </w:rPr>
-        <w:t>etor d</w:t>
-      </w:r>
-      <w:r>
-        <w:rPr>
-          <w:rFonts w:ascii="Times New Roman" w:hAnsi="Times New Roman" w:cs="Times New Roman" w:eastAsia="Times New Roman"/>
-          <w:sz w:val="24"/>
-          <w:lang w:val="pt-BR"/>
-        </w:rPr>
-        <w:t>os</w:t>
-      </w:r>
-      <w:r>
-        <w:rPr>
-          <w:rFonts w:ascii="Times New Roman" w:hAnsi="Times New Roman" w:cs="Times New Roman" w:eastAsia="Times New Roman"/>
-          <w:sz w:val="24"/>
-          <w:lang w:val="pt-BR"/>
-        </w:rPr>
-        <w:t xml:space="preserve"> p</w:t>
-      </w:r>
-      <w:r>
-        <w:rPr>
-          <w:rFonts w:ascii="Times New Roman" w:hAnsi="Times New Roman" w:cs="Times New Roman" w:eastAsia="Times New Roman"/>
-          <w:sz w:val="24"/>
-          <w:lang w:val="pt-BR"/>
-        </w:rPr>
-        <w:t>reço</w:t>
-      </w:r>
-      <w:r>
-        <w:rPr>
-          <w:rFonts w:ascii="Times New Roman" w:hAnsi="Times New Roman" w:cs="Times New Roman" w:eastAsia="Times New Roman"/>
-          <w:sz w:val="24"/>
-          <w:lang w:val="pt-BR"/>
-        </w:rPr>
-        <w:t>s</w:t>
-      </w:r>
-      <w:r>
-        <w:rPr>
-          <w:rFonts w:ascii="Times New Roman" w:hAnsi="Times New Roman" w:cs="Times New Roman" w:eastAsia="Times New Roman"/>
-          <w:sz w:val="24"/>
-          <w:lang w:val="pt-BR"/>
-        </w:rPr>
-        <w:t xml:space="preserve"> da</w:t>
-      </w:r>
-      <w:r>
-        <w:rPr>
-          <w:rFonts w:ascii="Times New Roman" w:hAnsi="Times New Roman" w:cs="Times New Roman" w:eastAsia="Times New Roman"/>
-          <w:sz w:val="24"/>
-          <w:lang w:val="pt-BR"/>
-        </w:rPr>
-        <w:t>s</w:t>
-      </w:r>
-      <w:r>
-        <w:rPr>
-          <w:rFonts w:ascii="Times New Roman" w:hAnsi="Times New Roman" w:cs="Times New Roman" w:eastAsia="Times New Roman"/>
-          <w:sz w:val="24"/>
-          <w:lang w:val="pt-BR"/>
-        </w:rPr>
-        <w:t xml:space="preserve"> dose</w:t>
-      </w:r>
-      <w:r>
-        <w:rPr>
-          <w:rFonts w:ascii="Times New Roman" w:hAnsi="Times New Roman" w:cs="Times New Roman" w:eastAsia="Times New Roman"/>
-          <w:sz w:val="24"/>
-          <w:lang w:val="pt-BR"/>
-        </w:rPr>
-        <w:t>s</w:t>
-      </w:r>
-      <w:r>
-        <w:rPr>
-          <w:rFonts w:ascii="Times New Roman" w:hAnsi="Times New Roman" w:cs="Times New Roman" w:eastAsia="Times New Roman"/>
-          <w:sz w:val="24"/>
-          <w:lang w:val="pt-BR"/>
-        </w:rPr>
-        <w:t xml:space="preserve"> de sêmen convencional</w:t>
-      </w:r>
-      <w:r>
-        <w:rPr>
-          <w:rFonts w:ascii="Times New Roman" w:hAnsi="Times New Roman" w:cs="Times New Roman" w:eastAsia="Times New Roman"/>
-          <w:sz w:val="24"/>
-          <w:lang w:val="pt-BR"/>
-        </w:rPr>
-        <w:t xml:space="preserve"> </w:t>
-      </w:r>
-      <w:r>
-        <w:rPr>
-          <w:rFonts w:ascii="Times New Roman" w:hAnsi="Times New Roman" w:cs="Times New Roman" w:eastAsia="Times New Roman"/>
-          <w:sz w:val="24"/>
-          <w:lang w:val="pt-BR"/>
-        </w:rPr>
-        <w:t xml:space="preserve">dos touros em reais</w:t>
-      </w:r>
-      <w:r>
-        <w:rPr>
-          <w:rFonts w:ascii="Times New Roman" w:hAnsi="Times New Roman" w:cs="Times New Roman" w:eastAsia="Times New Roman"/>
-          <w:sz w:val="24"/>
-          <w:lang w:val="pt-BR"/>
-        </w:rPr>
-        <w:t xml:space="preserve"/>
-      </w:r>
-      <w:r>
-        <w:rPr>
-          <w:rFonts w:ascii="Times New Roman" w:hAnsi="Times New Roman" w:cs="Times New Roman" w:eastAsia="Times New Roman"/>
-          <w:sz w:val="24"/>
-          <w:lang w:val="pt-BR"/>
-        </w:rPr>
-        <w:t xml:space="preserve"/>
-      </w:r>
-      <w:r>
-        <w:rPr>
-          <w:rFonts w:ascii="Times New Roman" w:hAnsi="Times New Roman" w:cs="Times New Roman" w:eastAsia="Times New Roman"/>
-          <w:sz w:val="24"/>
-          <w:lang w:val="pt-BR"/>
-        </w:rPr>
-        <w:t xml:space="preserve"> (R$)</w:t>
-      </w:r>
-    </w:p>
-    <w:p>
-      <w:pPr>
-        <w:pStyle w:val="PargrafodaLista"/>
-        <w:numPr>
-          <w:ilvl w:val="0"/>
-          <w:numId w:val="6"/>
-        </w:numPr>
-        <w:rPr>
-          <w:lang w:val="pt-BR"/>
-        </w:rPr>
-        <w:spacing w:line="360" w:lineRule="auto" w:after="0"/>
-      </w:pPr>
-      <m:oMath>
-        <m:sSub>
-          <m:sSubPr>
-            <m:ctrlPr>
-              <w:rPr>
-                <w:rFonts w:ascii="Cambria Math" w:hAnsi="Cambria Math"/>
-                <w:sz w:val="28"/>
-                <w:szCs w:val="28"/>
-              </w:rPr>
-            </m:ctrlPr>
-          </m:sSubPr>
-          <m:e>
-            <m:r>
-              <w:rPr>
-                <w:rFonts w:ascii="Cambria Math" w:hAnsi="Cambria Math"/>
-                <w:sz w:val="28"/>
-                <w:szCs w:val="28"/>
-              </w:rPr>
-              <m:t>Z</m:t>
-            </m:r>
-          </m:e>
-          <m:sub>
-            <m:r>
-              <w:rPr>
-                <w:rFonts w:ascii="Cambria Math" w:hAnsi="Cambria Math"/>
-                <w:sz w:val="28"/>
-                <w:szCs w:val="28"/>
-              </w:rPr>
-              <m:t>gen</m:t>
-            </m:r>
-          </m:sub>
-        </m:sSub>
-      </m:oMath>
-      <w:r>
-        <w:rPr>
-          <w:rFonts w:ascii="Times New Roman" w:hAnsi="Times New Roman" w:cs="Times New Roman" w:eastAsia="Times New Roman"/>
-          <w:sz w:val="24"/>
-          <w:szCs w:val="28"/>
-          <w:lang w:val="pt-BR"/>
-        </w:rPr>
-        <w:t xml:space="preserve"> </w:t>
-      </w:r>
-      <w:r>
-        <w:rPr>
-          <w:rFonts w:ascii="Times New Roman" w:hAnsi="Times New Roman" w:cs="Times New Roman" w:eastAsia="Times New Roman"/>
-          <w:sz w:val="24"/>
-          <w:lang w:val="pt-BR"/>
-        </w:rPr>
-        <w:t xml:space="preserve">é a matriz </w:t>
-      </w:r>
-      <w:r>
-        <w:rPr>
-          <w:rFonts w:ascii="Times New Roman" w:hAnsi="Times New Roman" w:cs="Times New Roman" w:eastAsia="Times New Roman"/>
-          <w:sz w:val="24"/>
-          <w:lang w:val="pt-BR"/>
-        </w:rPr>
-        <w:t>d</w:t>
-      </w:r>
-      <w:r>
-        <w:rPr>
-          <w:rFonts w:ascii="Times New Roman" w:hAnsi="Times New Roman" w:cs="Times New Roman" w:eastAsia="Times New Roman"/>
-          <w:sz w:val="24"/>
-          <w:lang w:val="pt-BR"/>
-        </w:rPr>
-        <w:t>os</w:t>
-      </w:r>
-      <w:r>
-        <w:rPr>
-          <w:rFonts w:ascii="Times New Roman" w:hAnsi="Times New Roman" w:cs="Times New Roman" w:eastAsia="Times New Roman"/>
-          <w:sz w:val="24"/>
-          <w:lang w:val="pt-BR"/>
-        </w:rPr>
-        <w:t xml:space="preserve"> valor</w:t>
-      </w:r>
-      <w:r>
-        <w:rPr>
-          <w:rFonts w:ascii="Times New Roman" w:hAnsi="Times New Roman" w:cs="Times New Roman" w:eastAsia="Times New Roman"/>
-          <w:sz w:val="24"/>
-          <w:lang w:val="pt-BR"/>
-        </w:rPr>
-        <w:t xml:space="preserve">es </w:t>
-      </w:r>
-      <w:r>
-        <w:rPr>
-          <w:rFonts w:ascii="Times New Roman" w:hAnsi="Times New Roman" w:cs="Times New Roman" w:eastAsia="Times New Roman"/>
-          <w:sz w:val="24"/>
-          <w:lang w:val="pt-BR"/>
-        </w:rPr>
-        <w:t>de ranque d</w:t>
-      </w:r>
-      <w:r>
-        <w:rPr>
-          <w:rFonts w:ascii="Times New Roman" w:hAnsi="Times New Roman" w:cs="Times New Roman" w:eastAsia="Times New Roman"/>
-          <w:sz w:val="24"/>
-          <w:lang w:val="pt-BR"/>
-        </w:rPr>
-        <w:t xml:space="preserve">as DEP </w:t>
-      </w:r>
-      <w:r>
-        <w:rPr>
-          <w:rFonts w:ascii="Times New Roman" w:hAnsi="Times New Roman" w:cs="Times New Roman" w:eastAsia="Times New Roman"/>
-          <w:sz w:val="24"/>
-          <w:lang w:val="pt-BR"/>
-        </w:rPr>
-        <w:t>dos</w:t>
-      </w:r>
-      <w:r>
-        <w:rPr>
-          <w:rFonts w:ascii="Times New Roman" w:hAnsi="Times New Roman" w:cs="Times New Roman" w:eastAsia="Times New Roman"/>
-          <w:sz w:val="24"/>
-          <w:lang w:val="pt-BR"/>
-        </w:rPr>
-        <w:t xml:space="preserve"> touro</w:t>
-      </w:r>
-      <w:r>
-        <w:rPr>
-          <w:rFonts w:ascii="Times New Roman" w:hAnsi="Times New Roman" w:cs="Times New Roman" w:eastAsia="Times New Roman"/>
-          <w:sz w:val="24"/>
-          <w:lang w:val="pt-BR"/>
-        </w:rPr>
-        <w:t>s</w:t>
-      </w:r>
-      <w:r>
-        <w:rPr>
-          <w:rFonts w:ascii="Times New Roman" w:hAnsi="Times New Roman" w:cs="Times New Roman" w:eastAsia="Times New Roman"/>
-          <w:sz w:val="24"/>
-          <w:lang w:val="pt-BR"/>
-        </w:rPr>
-        <w:t xml:space="preserve"> para</w:t>
-      </w:r>
-      <w:r>
-        <w:rPr>
-          <w:rFonts w:ascii="Times New Roman" w:hAnsi="Times New Roman" w:cs="Times New Roman" w:eastAsia="Times New Roman"/>
-          <w:sz w:val="24"/>
-          <w:lang w:val="pt-BR"/>
-        </w:rPr>
-        <w:t xml:space="preserve"> a</w:t>
-      </w:r>
-      <w:r>
-        <w:rPr>
-          <w:rFonts w:ascii="Times New Roman" w:hAnsi="Times New Roman" w:cs="Times New Roman" w:eastAsia="Times New Roman"/>
-          <w:sz w:val="24"/>
-          <w:lang w:val="pt-BR"/>
-        </w:rPr>
-        <w:t>s 18 características consideradas no estudo,</w:t>
-      </w:r>
-      <w:r>
-        <w:rPr>
-          <w:rFonts w:ascii="Times New Roman" w:hAnsi="Times New Roman" w:cs="Times New Roman" w:eastAsia="Times New Roman"/>
-          <w:sz w:val="24"/>
-          <w:lang w:val="pt-BR"/>
-        </w:rPr>
-        <w:t xml:space="preserve"> expressos em percentis (%)</w:t>
-      </w:r>
-      <w:r>
-        <w:rPr>
-          <w:rFonts w:ascii="Times New Roman" w:hAnsi="Times New Roman" w:cs="Times New Roman" w:eastAsia="Times New Roman"/>
-          <w:sz w:val="24"/>
-          <w:lang w:val="pt-BR"/>
-        </w:rPr>
-        <w:t>.</w:t>
-      </w:r>
-    </w:p>
-    <w:p>
-      <w:pPr>
-        <w:pStyle w:val="PargrafodaLista"/>
-        <w:numPr>
-          <w:ilvl w:val="0"/>
-          <w:numId w:val="6"/>
-        </w:numPr>
-        <w:rPr>
-          <w:lang w:val="pt-BR"/>
-        </w:rPr>
-        <w:spacing w:line="360" w:lineRule="auto" w:after="0"/>
-      </w:pPr>
-      <m:oMath>
-        <m:sSub>
-          <m:sSubPr>
-            <m:ctrlPr>
-              <w:rPr>
-                <w:rFonts w:ascii="Cambria Math" w:hAnsi="Cambria Math"/>
-              </w:rPr>
-            </m:ctrlPr>
-          </m:sSubPr>
-          <m:e>
-            <m:r>
-              <w:rPr>
-                <w:rFonts w:ascii="Cambria Math" w:hAnsi="Cambria Math"/>
-              </w:rPr>
-              <m:t>Z</m:t>
-            </m:r>
-          </m:e>
-          <m:sub>
-            <m:r>
-              <w:rPr>
-                <w:rFonts w:ascii="Cambria Math" w:hAnsi="Cambria Math"/>
-              </w:rPr>
-              <m:t>mkt</m:t>
-            </m:r>
-          </m:sub>
-        </m:sSub>
-      </m:oMath>
-      <w:r>
-        <w:rPr>
-          <w:rFonts w:ascii="Times New Roman" w:hAnsi="Times New Roman" w:cs="Times New Roman" w:eastAsia="Times New Roman"/>
-          <w:sz w:val="24"/>
-          <w:lang w:val="pt-BR"/>
-        </w:rPr>
-        <w:t xml:space="preserve"> é a matriz de incidência</w:t>
-      </w:r>
-      <w:r>
-        <w:rPr>
-          <w:rFonts w:ascii="Times New Roman" w:hAnsi="Times New Roman" w:cs="Times New Roman" w:eastAsia="Times New Roman"/>
-          <w:sz w:val="24"/>
-          <w:lang w:val="pt-BR"/>
-        </w:rPr>
-        <w:t xml:space="preserve"> </w:t>
-      </w:r>
-      <w:r>
-        <w:rPr>
-          <w:rFonts w:ascii="Times New Roman" w:hAnsi="Times New Roman" w:cs="Times New Roman" w:eastAsia="Times New Roman"/>
-          <w:sz w:val="24"/>
-          <w:lang w:val="pt-BR"/>
-        </w:rPr>
-        <w:t xml:space="preserve">dos touros </w:t>
-      </w:r>
-      <w:r>
-        <w:rPr>
-          <w:rFonts w:ascii="Times New Roman" w:hAnsi="Times New Roman" w:cs="Times New Roman" w:eastAsia="Times New Roman"/>
-          <w:sz w:val="24"/>
-          <w:lang w:val="pt-BR"/>
-        </w:rPr>
-        <w:t>para os 6 selos</w:t>
-      </w:r>
-      <w:r>
-        <w:rPr>
-          <w:rFonts w:ascii="Times New Roman" w:hAnsi="Times New Roman" w:cs="Times New Roman" w:eastAsia="Times New Roman"/>
-          <w:sz w:val="24"/>
-          <w:lang w:val="pt-BR"/>
-        </w:rPr>
-        <w:t xml:space="preserve"> considerados no estudo</w:t>
-      </w:r>
-    </w:p>
-    <w:p>
-      <w:pPr>
-        <w:pStyle w:val="PargrafodaLista"/>
-        <w:numPr>
-          <w:ilvl w:val="0"/>
-          <w:numId w:val="6"/>
-        </w:numPr>
-        <w:rPr>
-          <w:lang w:val="pt-BR"/>
-        </w:rPr>
-        <w:spacing w:line="360" w:lineRule="auto" w:after="0"/>
-      </w:pPr>
-      <m:oMath>
-        <m:sSub>
-          <m:sSubPr>
-            <m:ctrlPr>
-              <w:rPr>
-                <w:rFonts w:ascii="Cambria Math" w:hAnsi="Cambria Math"/>
-                <w:sz w:val="28"/>
-                <w:szCs w:val="28"/>
-              </w:rPr>
-            </m:ctrlPr>
-          </m:sSubPr>
-          <m:e>
-            <m:r>
-              <w:rPr>
-                <w:rFonts w:ascii="Cambria Math" w:hAnsi="Cambria Math"/>
-                <w:sz w:val="28"/>
-                <w:szCs w:val="28"/>
-              </w:rPr>
-              <m:t>Z</m:t>
-            </m:r>
-          </m:e>
-          <m:sub>
-            <m:r>
-              <w:rPr>
-                <w:rFonts w:ascii="Cambria Math" w:hAnsi="Cambria Math"/>
-                <w:sz w:val="28"/>
-                <w:szCs w:val="28"/>
-              </w:rPr>
-              <m:t>lin</m:t>
-            </m:r>
-          </m:sub>
-        </m:sSub>
-      </m:oMath>
-      <w:r>
-        <w:rPr>
-          <w:rFonts w:ascii="Times New Roman" w:hAnsi="Times New Roman" w:cs="Times New Roman" w:eastAsia="Times New Roman"/>
-          <w:sz w:val="24"/>
-          <w:szCs w:val="28"/>
-          <w:lang w:val="pt-BR"/>
-        </w:rPr>
-        <w:t xml:space="preserve"> </w:t>
-      </w:r>
-      <w:r>
-        <w:rPr>
-          <w:rFonts w:ascii="Times New Roman" w:hAnsi="Times New Roman" w:cs="Times New Roman" w:eastAsia="Times New Roman"/>
-          <w:sz w:val="24"/>
-          <w:lang w:val="pt-BR"/>
-        </w:rPr>
-        <w:t>é a matriz de incidência</w:t>
-      </w:r>
-      <w:r>
-        <w:rPr>
-          <w:rFonts w:ascii="Times New Roman" w:hAnsi="Times New Roman" w:cs="Times New Roman" w:eastAsia="Times New Roman"/>
-          <w:sz w:val="24"/>
-          <w:lang w:val="pt-BR"/>
-        </w:rPr>
-        <w:t xml:space="preserve"> </w:t>
-      </w:r>
-      <w:r>
-        <w:rPr>
-          <w:rFonts w:ascii="Times New Roman" w:hAnsi="Times New Roman" w:cs="Times New Roman" w:eastAsia="Times New Roman"/>
-          <w:sz w:val="24"/>
-          <w:lang w:val="pt-BR"/>
-        </w:rPr>
-        <w:t>dos touros</w:t>
-      </w:r>
-      <w:r>
-        <w:rPr>
-          <w:rFonts w:ascii="Times New Roman" w:hAnsi="Times New Roman" w:cs="Times New Roman" w:eastAsia="Times New Roman"/>
-          <w:sz w:val="24"/>
-          <w:lang w:val="pt-BR"/>
-        </w:rPr>
-        <w:t xml:space="preserve"> para as 7 linhagens consideradas no estudo.</w:t>
+        <w:t xml:space="preserve">As 18 características cujos percentis das DEPs foram considerados neste estudo, agrupadas, em sua maioria, conforme a ANCP (SILVEIRA, 2022), foram: de Reprodução e Fertilidade, Probabilidade de Parto Precoce (3P_TOP), Idade ao Primeiro Parto (IPP_TOP), Perímetro Escrotal aos 450 dias (PE450_TOP), Produtividade Acumulada (PAC_TOP) e Probabilidade de Permanência no Rebanho, ou stayability (STAY_TOP); de Crescimento, Peso ao Nascer (PN_TOP), Peso aos 210, 365 e 450 dias (P210_TOP, P365_TOP e P450_TOP) e Habilidade Maternal para peso aos 120 e 210 dias (MP120_TOP e MP210_TOP); de Produtividade e Qualidade da Carne, Área de Olho de Lombo (AOL_TOP), Acabamento de Carcaça (ACAB_TOP) e Marmoreio (MARM_TOP); de Eficiência Alimentar, Consumo Alimentar Residual (CAR_TOP); além da Facilidade de Parto de Primíparas (FPP_TOP) e do escore de estrutura corporal, ou frame (FRAME_TOP), DEPs da ANCP posteriores a esse agrupamento, e do índice Mérito Genético Total Econômico (MGTe_TOP).</w:t>
       </w:r>
     </w:p>
     <w:p>
@@ -1820,7 +1862,24 @@
           <w:sz w:val="24"/>
           <w:lang w:val="pt-BR"/>
         </w:rPr>
-        <w:t xml:space="preserve">As 18 características cujos percentis das DEPs foram considerados neste estudo, agrupadas, em sua maioria, conforme a ANCP (SILVEIRA, 2022), foram: de Reprodução e Fertilidade, Probabilidade de Parto Precoce (3P_TOP), Idade ao Primeiro Parto (IPP_TOP), Perímetro Escrotal aos 450 dias (PE450_TOP), Produtividade Acumulada (PAC_TOP) e Probabilidade de Permanência no Rebanho, ou stayability (STAY_TOP); de Crescimento, Peso ao Nascer (PN_TOP), Peso aos 210, 365 e 450 dias (P210_TOP, P365_TOP e P450_TOP) e Habilidade Maternal para peso aos 120 e 210 dias (MP120_TOP e MP210_TOP); de Produtividade e Qualidade da Carne, Área de Olho de Lombo (AOL_TOP), Acabamento de Carcaça (ACAB_TOP) e Marmoreio (MARM_TOP); de Eficiência Alimentar, Consumo Alimentar Residual (CAR_TOP); além da Facilidade de Parto de Primíparas (FPP_TOP) e do escore de estrutura corporal, ou frame (FRAME_TOP), DEPs da ANCP posteriores a esse agrupamento, e do índice Mérito Genético Total Econômico (MGTe_TOP).</w:t>
+        <w:lastRenderedPageBreak/>
+        <w:t>O uso do ranking percentil (TOP</w:t>
+      </w:r>
+      <w:r>
+        <w:rPr>
+          <w:rFonts w:ascii="Times New Roman" w:hAnsi="Times New Roman" w:cs="Times New Roman" w:eastAsia="Times New Roman"/>
+          <w:sz w:val="24"/>
+          <w:lang w:val="pt-BR"/>
+        </w:rPr>
+        <w:t xml:space="preserve"> </w:t>
+      </w:r>
+      <w:r>
+        <w:rPr>
+          <w:rFonts w:ascii="Times New Roman" w:hAnsi="Times New Roman" w:cs="Times New Roman" w:eastAsia="Times New Roman"/>
+          <w:sz w:val="24"/>
+          <w:lang w:val="pt-BR"/>
+        </w:rPr>
+        <w:t>%) permitiu a padronização dimensional das variáveis em escala comparável de 0,1% a 100%, em que valores menores indicam superioridade genética no catálogo.</w:t>
       </w:r>
     </w:p>
     <w:p>
@@ -1862,8 +1921,23 @@
           <w:sz w:val="24"/>
           <w:lang w:val="pt-BR"/>
         </w:rPr>
-        <w:lastRenderedPageBreak/>
-        <w:t>O uso do ranking percentil (TOP</w:t>
+        <w:t xml:space="preserve">Na avaliação da influência das certificações no valor do sêmen, </w:t>
+      </w:r>
+      <w:r>
+        <w:rPr>
+          <w:rFonts w:ascii="Times New Roman" w:hAnsi="Times New Roman" w:cs="Times New Roman" w:eastAsia="Times New Roman"/>
+          <w:sz w:val="24"/>
+          <w:lang w:val="pt-BR"/>
+        </w:rPr>
+        <w:t xml:space="preserve">foram empregados selos</w:t>
+      </w:r>
+      <w:r>
+        <w:rPr>
+          <w:rFonts w:ascii="Times New Roman" w:hAnsi="Times New Roman" w:cs="Times New Roman" w:eastAsia="Times New Roman"/>
+          <w:sz w:val="24"/>
+          <w:lang w:val="pt-BR"/>
+        </w:rPr>
+        <w:t xml:space="preserve"> de certificação</w:t>
       </w:r>
       <w:r>
         <w:rPr>
@@ -1879,7 +1953,447 @@
           <w:sz w:val="24"/>
           <w:lang w:val="pt-BR"/>
         </w:rPr>
-        <w:t>%) permitiu a padronização dimensional das variáveis em escala comparável de 0,1% a 100%, em que valores menores indicam superioridade genética no catálogo.</w:t>
+        <w:t>concedidos pela central e programas parceiros</w:t>
+      </w:r>
+      <w:r>
+        <w:rPr>
+          <w:rFonts w:ascii="Times New Roman" w:hAnsi="Times New Roman" w:cs="Times New Roman" w:eastAsia="Times New Roman"/>
+          <w:sz w:val="24"/>
+          <w:lang w:val="pt-BR"/>
+        </w:rPr>
+        <w:t xml:space="preserve"> </w:t>
+      </w:r>
+      <w:r>
+        <w:rPr>
+          <w:rFonts w:ascii="Times New Roman" w:hAnsi="Times New Roman" w:cs="Times New Roman" w:eastAsia="Times New Roman"/>
+          <w:sz w:val="24"/>
+          <w:lang w:val="pt-BR"/>
+        </w:rPr>
+        <w:t>à medida que os touros possuíam o</w:t>
+      </w:r>
+      <w:r>
+        <w:rPr>
+          <w:rFonts w:ascii="Times New Roman" w:hAnsi="Times New Roman" w:cs="Times New Roman" w:eastAsia="Times New Roman"/>
+          <w:sz w:val="24"/>
+          <w:lang w:val="pt-BR"/>
+        </w:rPr>
+        <w:t xml:space="preserve"> respectivo</w:t>
+      </w:r>
+      <w:r>
+        <w:rPr>
+          <w:rFonts w:ascii="Times New Roman" w:hAnsi="Times New Roman" w:cs="Times New Roman" w:eastAsia="Times New Roman"/>
+          <w:sz w:val="24"/>
+          <w:lang w:val="pt-BR"/>
+        </w:rPr>
+        <w:t xml:space="preserve"> mérito genético. </w:t>
+      </w:r>
+    </w:p>
+    <w:p>
+      <w:pPr>
+        <w:keepNext w:val="1"/>
+        <w:keepLines w:val="0"/>
+        <w:pageBreakBefore w:val="0"/>
+        <w:widowControl w:val="1"/>
+        <w:pBdr>
+          <w:top w:space="0" w:sz="0" w:val="nil"/>
+          <w:left w:space="0" w:sz="0" w:val="nil"/>
+          <w:bottom w:space="0" w:sz="0" w:val="nil"/>
+          <w:right w:space="0" w:sz="0" w:val="nil"/>
+          <w:between w:space="0" w:sz="0" w:val="nil"/>
+        </w:pBdr>
+        <w:shd w:fill="auto" w:val="clear"/>
+        <w:spacing w:after="0" w:before="0" w:line="360" w:lineRule="auto"/>
+        <w:ind w:left="0" w:right="0" w:firstLine="709"/>
+        <w:jc w:val="both"/>
+        <w:rPr>
+          <w:rFonts w:ascii="Times New Roman" w:cs="Times New Roman" w:eastAsia="Times New Roman" w:hAnsi="Times New Roman"/>
+          <w:b w:val="0"/>
+          <w:bCs w:val="0"/>
+          <w:i w:val="0"/>
+          <w:iCs w:val="0"/>
+          <w:smallCaps w:val="0"/>
+          <w:strike w:val="0"/>
+          <w:color w:val="000000"/>
+          <w:sz w:val="24"/>
+          <w:szCs w:val="24"/>
+          <w:u w:val="none"/>
+          <w:shd w:fill="auto" w:val="clear"/>
+          <w:vertAlign w:val="baseline"/>
+        </w:rPr>
+      </w:pPr>
+      <w:r>
+        <w:rPr>
+          <w:rFonts w:ascii="Times New Roman" w:hAnsi="Times New Roman" w:cs="Times New Roman" w:eastAsia="Times New Roman"/>
+          <w:sz w:val="24"/>
+          <w:lang w:val="pt-BR"/>
+        </w:rPr>
+        <w:t xml:space="preserve">Para fins de análise, os selos foram tratados como variáveis binárias, com valor 1 quando o touro possuía o selo e 0 caso contrário, identificado pela correspondência exata do nome do selo no catálogo. Assim, os animais foram classificados com base em 6 selos:</w:t>
+      </w:r>
+    </w:p>
+    <w:p>
+      <w:pPr>
+        <w:pStyle w:val="PargrafodaLista"/>
+        <w:numPr>
+          <w:ilvl w:val="0"/>
+          <w:numId w:val="7"/>
+        </w:numPr>
+        <w:rPr>
+          <w:lang w:val="pt-BR"/>
+        </w:rPr>
+        <w:spacing w:line="360" w:lineRule="auto" w:after="0"/>
+      </w:pPr>
+      <w:r>
+        <w:rPr>
+          <w:rFonts w:ascii="Times New Roman" w:hAnsi="Times New Roman" w:cs="Times New Roman" w:eastAsia="Times New Roman"/>
+          <w:sz w:val="24"/>
+          <w:lang w:val="pt-BR"/>
+        </w:rPr>
+        <w:t xml:space="preserve">O SELO_IFERT, que certificava</w:t>
+      </w:r>
+      <w:r>
+        <w:rPr>
+          <w:rFonts w:ascii="Times New Roman" w:hAnsi="Times New Roman" w:cs="Times New Roman" w:eastAsia="Times New Roman"/>
+          <w:sz w:val="24"/>
+          <w:lang w:val="pt-BR"/>
+        </w:rPr>
+        <w:t xml:space="preserve"/>
+      </w:r>
+      <w:r>
+        <w:rPr>
+          <w:rFonts w:ascii="Times New Roman" w:hAnsi="Times New Roman" w:cs="Times New Roman" w:eastAsia="Times New Roman"/>
+          <w:sz w:val="24"/>
+          <w:lang w:val="pt-BR"/>
+        </w:rPr>
+        <w:t xml:space="preserve"/>
+      </w:r>
+      <w:r>
+        <w:rPr>
+          <w:rFonts w:ascii="Times New Roman" w:hAnsi="Times New Roman" w:cs="Times New Roman" w:eastAsia="Times New Roman"/>
+          <w:sz w:val="24"/>
+          <w:lang w:val="pt-BR"/>
+        </w:rPr>
+        <w:t xml:space="preserve"/>
+      </w:r>
+      <w:r>
+        <w:rPr>
+          <w:rFonts w:ascii="Times New Roman" w:hAnsi="Times New Roman" w:cs="Times New Roman" w:eastAsia="Times New Roman"/>
+          <w:sz w:val="24"/>
+          <w:lang w:val="pt-BR"/>
+        </w:rPr>
+        <w:t xml:space="preserve"> os touros </w:t>
+      </w:r>
+      <w:r>
+        <w:rPr>
+          <w:rFonts w:ascii="Times New Roman" w:hAnsi="Times New Roman" w:cs="Times New Roman" w:eastAsia="Times New Roman"/>
+          <w:sz w:val="24"/>
+          <w:lang w:val="pt-BR"/>
+        </w:rPr>
+        <w:t>como</w:t>
+      </w:r>
+      <w:r>
+        <w:rPr>
+          <w:rFonts w:ascii="Times New Roman" w:hAnsi="Times New Roman" w:cs="Times New Roman" w:eastAsia="Times New Roman"/>
+          <w:sz w:val="24"/>
+          <w:lang w:val="pt-BR"/>
+        </w:rPr>
+        <w:t xml:space="preserve"> superiores </w:t>
+      </w:r>
+      <w:r>
+        <w:rPr>
+          <w:rFonts w:ascii="Times New Roman" w:hAnsi="Times New Roman" w:cs="Times New Roman" w:eastAsia="Times New Roman"/>
+          <w:sz w:val="24"/>
+          <w:lang w:val="pt-BR"/>
+        </w:rPr>
+        <w:t xml:space="preserve">para </w:t>
+      </w:r>
+      <w:r>
+        <w:rPr>
+          <w:rFonts w:ascii="Times New Roman" w:hAnsi="Times New Roman" w:cs="Times New Roman" w:eastAsia="Times New Roman"/>
+          <w:sz w:val="24"/>
+          <w:lang w:val="pt-BR"/>
+        </w:rPr>
+        <w:t>o</w:t>
+      </w:r>
+      <w:r>
+        <w:rPr>
+          <w:rFonts w:ascii="Times New Roman" w:hAnsi="Times New Roman" w:cs="Times New Roman" w:eastAsia="Times New Roman"/>
+          <w:sz w:val="24"/>
+          <w:lang w:val="pt-BR"/>
+        </w:rPr>
+        <w:t xml:space="preserve"> </w:t>
+      </w:r>
+      <w:r>
+        <w:rPr>
+          <w:rFonts w:ascii="Times New Roman" w:hAnsi="Times New Roman" w:cs="Times New Roman" w:eastAsia="Times New Roman"/>
+          <w:sz w:val="24"/>
+          <w:lang w:val="pt-BR"/>
+        </w:rPr>
+        <w:t>Índice de Fertilidade</w:t>
+      </w:r>
+      <w:r>
+        <w:rPr>
+          <w:rFonts w:ascii="Times New Roman" w:hAnsi="Times New Roman" w:cs="Times New Roman" w:eastAsia="Times New Roman"/>
+          <w:sz w:val="24"/>
+          <w:lang w:val="pt-BR"/>
+        </w:rPr>
+        <w:t xml:space="preserve">.</w:t>
+      </w:r>
+    </w:p>
+    <w:p>
+      <w:pPr>
+        <w:pStyle w:val="PargrafodaLista"/>
+        <w:numPr>
+          <w:ilvl w:val="0"/>
+          <w:numId w:val="7"/>
+        </w:numPr>
+        <w:rPr>
+          <w:lang w:val="pt-BR"/>
+        </w:rPr>
+        <w:spacing w:line="360" w:lineRule="auto" w:after="0"/>
+      </w:pPr>
+      <w:r>
+        <w:rPr>
+          <w:rFonts w:ascii="Times New Roman" w:hAnsi="Times New Roman" w:cs="Times New Roman" w:eastAsia="Times New Roman"/>
+          <w:sz w:val="24"/>
+          <w:lang w:val="pt-BR"/>
+        </w:rPr>
+        <w:t>O</w:t>
+      </w:r>
+      <w:r>
+        <w:rPr>
+          <w:rFonts w:ascii="Times New Roman" w:hAnsi="Times New Roman" w:cs="Times New Roman" w:eastAsia="Times New Roman"/>
+          <w:sz w:val="24"/>
+          <w:lang w:val="pt-BR"/>
+        </w:rPr>
+        <w:t xml:space="preserve"> SELO_MATERNAL</w:t>
+      </w:r>
+      <w:r>
+        <w:rPr>
+          <w:rFonts w:ascii="Times New Roman" w:hAnsi="Times New Roman" w:cs="Times New Roman" w:eastAsia="Times New Roman"/>
+          <w:sz w:val="24"/>
+          <w:lang w:val="pt-BR"/>
+        </w:rPr>
+        <w:t>, que</w:t>
+      </w:r>
+      <w:r>
+        <w:rPr>
+          <w:rFonts w:ascii="Times New Roman" w:hAnsi="Times New Roman" w:cs="Times New Roman" w:eastAsia="Times New Roman"/>
+          <w:sz w:val="24"/>
+          <w:lang w:val="pt-BR"/>
+        </w:rPr>
+        <w:t xml:space="preserve"> </w:t>
+      </w:r>
+      <w:r>
+        <w:rPr>
+          <w:rFonts w:ascii="Times New Roman" w:hAnsi="Times New Roman" w:cs="Times New Roman" w:eastAsia="Times New Roman"/>
+          <w:sz w:val="24"/>
+          <w:lang w:val="pt-BR"/>
+        </w:rPr>
+        <w:t>certificava</w:t>
+      </w:r>
+      <w:r>
+        <w:rPr>
+          <w:rFonts w:ascii="Times New Roman" w:hAnsi="Times New Roman" w:cs="Times New Roman" w:eastAsia="Times New Roman"/>
+          <w:sz w:val="24"/>
+          <w:lang w:val="pt-BR"/>
+        </w:rPr>
+        <w:t xml:space="preserve"> quanto a a</w:t>
+      </w:r>
+      <w:r>
+        <w:rPr>
+          <w:rFonts w:ascii="Times New Roman" w:hAnsi="Times New Roman" w:cs="Times New Roman" w:eastAsia="Times New Roman"/>
+          <w:sz w:val="24"/>
+          <w:lang w:val="pt-BR"/>
+        </w:rPr>
+        <w:t>ptidão para produção de fêmeas de reposição</w:t>
+      </w:r>
+      <w:r>
+        <w:rPr>
+          <w:rFonts w:ascii="Times New Roman" w:hAnsi="Times New Roman" w:cs="Times New Roman" w:eastAsia="Times New Roman"/>
+          <w:sz w:val="24"/>
+          <w:lang w:val="pt-BR"/>
+        </w:rPr>
+        <w:t xml:space="preserve">.</w:t>
+      </w:r>
+      <w:r>
+        <w:rPr>
+          <w:rFonts w:ascii="Times New Roman" w:hAnsi="Times New Roman" w:cs="Times New Roman" w:eastAsia="Times New Roman"/>
+          <w:sz w:val="24"/>
+          <w:lang w:val="pt-BR"/>
+        </w:rPr>
+        <w:t xml:space="preserve"/>
+      </w:r>
+    </w:p>
+    <w:p>
+      <w:pPr>
+        <w:pStyle w:val="PargrafodaLista"/>
+        <w:numPr>
+          <w:ilvl w:val="0"/>
+          <w:numId w:val="7"/>
+        </w:numPr>
+        <w:rPr>
+          <w:lang w:val="pt-BR"/>
+        </w:rPr>
+        <w:spacing w:line="360" w:lineRule="auto" w:after="0"/>
+      </w:pPr>
+      <w:r>
+        <w:rPr>
+          <w:rFonts w:ascii="Times New Roman" w:hAnsi="Times New Roman" w:cs="Times New Roman" w:eastAsia="Times New Roman"/>
+          <w:sz w:val="24"/>
+          <w:lang w:val="pt-BR"/>
+        </w:rPr>
+        <w:t xml:space="preserve">O SELO_CAR, que certificava</w:t>
+      </w:r>
+      <w:r>
+        <w:rPr>
+          <w:rFonts w:ascii="Times New Roman" w:hAnsi="Times New Roman" w:cs="Times New Roman" w:eastAsia="Times New Roman"/>
+          <w:sz w:val="24"/>
+          <w:lang w:val="pt-BR"/>
+        </w:rPr>
+        <w:t xml:space="preserve"/>
+      </w:r>
+      <w:r>
+        <w:rPr>
+          <w:rFonts w:ascii="Times New Roman" w:hAnsi="Times New Roman" w:cs="Times New Roman" w:eastAsia="Times New Roman"/>
+          <w:sz w:val="24"/>
+          <w:lang w:val="pt-BR"/>
+        </w:rPr>
+        <w:t xml:space="preserve"/>
+      </w:r>
+      <w:r>
+        <w:rPr>
+          <w:rFonts w:ascii="Times New Roman" w:hAnsi="Times New Roman" w:cs="Times New Roman" w:eastAsia="Times New Roman"/>
+          <w:sz w:val="24"/>
+          <w:lang w:val="pt-BR"/>
+        </w:rPr>
+        <w:t xml:space="preserve"/>
+      </w:r>
+      <w:r>
+        <w:rPr>
+          <w:rFonts w:ascii="Times New Roman" w:hAnsi="Times New Roman" w:cs="Times New Roman" w:eastAsia="Times New Roman"/>
+          <w:sz w:val="24"/>
+          <w:lang w:val="pt-BR"/>
+        </w:rPr>
+        <w:t xml:space="preserve"/>
+      </w:r>
+      <w:r>
+        <w:rPr>
+          <w:rFonts w:ascii="Times New Roman" w:hAnsi="Times New Roman" w:cs="Times New Roman" w:eastAsia="Times New Roman"/>
+          <w:sz w:val="24"/>
+          <w:lang w:val="pt-BR"/>
+        </w:rPr>
+        <w:t xml:space="preserve"> quanto a</w:t>
+      </w:r>
+      <w:r>
+        <w:rPr>
+          <w:rFonts w:ascii="Times New Roman" w:hAnsi="Times New Roman" w:cs="Times New Roman" w:eastAsia="Times New Roman"/>
+          <w:sz w:val="24"/>
+          <w:lang w:val="pt-BR"/>
+        </w:rPr>
+        <w:t xml:space="preserve"> eficiência alimentar </w:t>
+      </w:r>
+      <w:r>
+        <w:rPr>
+          <w:rFonts w:ascii="Times New Roman" w:hAnsi="Times New Roman" w:cs="Times New Roman" w:eastAsia="Times New Roman"/>
+          <w:sz w:val="24"/>
+          <w:lang w:val="pt-BR"/>
+        </w:rPr>
+        <w:t>p</w:t>
+      </w:r>
+      <w:r>
+        <w:rPr>
+          <w:rFonts w:ascii="Times New Roman" w:hAnsi="Times New Roman" w:cs="Times New Roman" w:eastAsia="Times New Roman"/>
+          <w:sz w:val="24"/>
+          <w:lang w:val="pt-BR"/>
+        </w:rPr>
+        <w:t>or meio do critério do</w:t>
+      </w:r>
+      <w:r>
+        <w:rPr>
+          <w:rFonts w:ascii="Times New Roman" w:hAnsi="Times New Roman" w:cs="Times New Roman" w:eastAsia="Times New Roman"/>
+          <w:sz w:val="24"/>
+          <w:lang w:val="pt-BR"/>
+        </w:rPr>
+        <w:t xml:space="preserve"> Consumo Alimentar R</w:t>
+      </w:r>
+      <w:r>
+        <w:rPr>
+          <w:rFonts w:ascii="Times New Roman" w:hAnsi="Times New Roman" w:cs="Times New Roman" w:eastAsia="Times New Roman"/>
+          <w:sz w:val="24"/>
+          <w:lang w:val="pt-BR"/>
+        </w:rPr>
+        <w:t>esidual</w:t>
+      </w:r>
+      <w:r>
+        <w:rPr>
+          <w:rFonts w:ascii="Times New Roman" w:hAnsi="Times New Roman" w:cs="Times New Roman" w:eastAsia="Times New Roman"/>
+          <w:sz w:val="24"/>
+          <w:lang w:val="pt-BR"/>
+        </w:rPr>
+        <w:t xml:space="preserve">.</w:t>
+      </w:r>
+    </w:p>
+    <w:p>
+      <w:pPr>
+        <w:pStyle w:val="PargrafodaLista"/>
+        <w:numPr>
+          <w:ilvl w:val="0"/>
+          <w:numId w:val="7"/>
+        </w:numPr>
+        <w:rPr>
+          <w:lang w:val="pt-BR"/>
+        </w:rPr>
+        <w:spacing w:line="360" w:lineRule="auto" w:after="0"/>
+      </w:pPr>
+      <w:r>
+        <w:rPr>
+          <w:rFonts w:ascii="Times New Roman" w:hAnsi="Times New Roman" w:cs="Times New Roman" w:eastAsia="Times New Roman"/>
+          <w:sz w:val="24"/>
+          <w:lang w:val="pt-BR"/>
+        </w:rPr>
+        <w:t>O SELO_CARCACA_5_ESTRELAS, que certificava os touros com classificação máxima (cinco estrelas) quanto à qualidade e ao rendimento de carcaça.</w:t>
+      </w:r>
+    </w:p>
+    <w:p>
+      <w:pPr>
+        <w:pStyle w:val="PargrafodaLista"/>
+        <w:numPr>
+          <w:ilvl w:val="0"/>
+          <w:numId w:val="7"/>
+        </w:numPr>
+        <w:rPr>
+          <w:lang w:val="pt-BR"/>
+        </w:rPr>
+        <w:spacing w:line="360" w:lineRule="auto" w:after="0"/>
+      </w:pPr>
+      <w:r>
+        <w:rPr>
+          <w:rFonts w:ascii="Times New Roman" w:hAnsi="Times New Roman" w:cs="Times New Roman" w:eastAsia="Times New Roman"/>
+          <w:sz w:val="24"/>
+          <w:lang w:val="pt-BR"/>
+        </w:rPr>
+        <w:t xml:space="preserve">O SELO_NOVILHAS, que indicava os touros recomendados para uso em novilhas. Na amostra, os 29 touros com esse selo apresentaram mediana de TOP 13% para Peso ao Nascer e 7% para Facilidade de Parto de Primíparas, contra 88% e 79,5% nos demais touros.</w:t>
+      </w:r>
+    </w:p>
+    <w:p>
+      <w:pPr>
+        <w:pStyle w:val="PargrafodaLista"/>
+        <w:numPr>
+          <w:ilvl w:val="0"/>
+          <w:numId w:val="7"/>
+        </w:numPr>
+        <w:rPr>
+          <w:lang w:val="pt-BR"/>
+        </w:rPr>
+        <w:spacing w:line="360" w:lineRule="auto" w:after="0"/>
+      </w:pPr>
+      <w:r>
+        <w:rPr>
+          <w:rFonts w:ascii="Times New Roman" w:hAnsi="Times New Roman" w:cs="Times New Roman" w:eastAsia="Times New Roman"/>
+          <w:sz w:val="24"/>
+          <w:lang w:val="pt-BR"/>
+        </w:rPr>
+        <w:t xml:space="preserve">O SELO_RP_ANCP, que identificava os touros aprovados no Programa de Reprodução Programada (RP) da ANCP, teste de progênie criado em 1995 no qual os touros jovens passam por avaliação genética e vistoria técnica (REPRODUÇÃO [...], 2025).</w:t>
       </w:r>
     </w:p>
     <w:p>
@@ -1921,71 +2435,7 @@
           <w:sz w:val="24"/>
           <w:lang w:val="pt-BR"/>
         </w:rPr>
-        <w:t xml:space="preserve">Na avaliação da influência das certificações no valor do sêmen, </w:t>
-      </w:r>
-      <w:r>
-        <w:rPr>
-          <w:rFonts w:ascii="Times New Roman" w:hAnsi="Times New Roman" w:cs="Times New Roman" w:eastAsia="Times New Roman"/>
-          <w:sz w:val="24"/>
-          <w:lang w:val="pt-BR"/>
-        </w:rPr>
-        <w:t xml:space="preserve">foram empregados selos</w:t>
-      </w:r>
-      <w:r>
-        <w:rPr>
-          <w:rFonts w:ascii="Times New Roman" w:hAnsi="Times New Roman" w:cs="Times New Roman" w:eastAsia="Times New Roman"/>
-          <w:sz w:val="24"/>
-          <w:lang w:val="pt-BR"/>
-        </w:rPr>
-        <w:t xml:space="preserve"> de certificação</w:t>
-      </w:r>
-      <w:r>
-        <w:rPr>
-          <w:rFonts w:ascii="Times New Roman" w:hAnsi="Times New Roman" w:cs="Times New Roman" w:eastAsia="Times New Roman"/>
-          <w:sz w:val="24"/>
-          <w:lang w:val="pt-BR"/>
-        </w:rPr>
-        <w:t xml:space="preserve"> </w:t>
-      </w:r>
-      <w:r>
-        <w:rPr>
-          <w:rFonts w:ascii="Times New Roman" w:hAnsi="Times New Roman" w:cs="Times New Roman" w:eastAsia="Times New Roman"/>
-          <w:sz w:val="24"/>
-          <w:lang w:val="pt-BR"/>
-        </w:rPr>
-        <w:t>concedidos pela central e programas parceiros</w:t>
-      </w:r>
-      <w:r>
-        <w:rPr>
-          <w:rFonts w:ascii="Times New Roman" w:hAnsi="Times New Roman" w:cs="Times New Roman" w:eastAsia="Times New Roman"/>
-          <w:sz w:val="24"/>
-          <w:lang w:val="pt-BR"/>
-        </w:rPr>
-        <w:t xml:space="preserve"> </w:t>
-      </w:r>
-      <w:r>
-        <w:rPr>
-          <w:rFonts w:ascii="Times New Roman" w:hAnsi="Times New Roman" w:cs="Times New Roman" w:eastAsia="Times New Roman"/>
-          <w:sz w:val="24"/>
-          <w:lang w:val="pt-BR"/>
-        </w:rPr>
-        <w:t>à medida que os touros possuíam o</w:t>
-      </w:r>
-      <w:r>
-        <w:rPr>
-          <w:rFonts w:ascii="Times New Roman" w:hAnsi="Times New Roman" w:cs="Times New Roman" w:eastAsia="Times New Roman"/>
-          <w:sz w:val="24"/>
-          <w:lang w:val="pt-BR"/>
-        </w:rPr>
-        <w:t xml:space="preserve"> respectivo</w:t>
-      </w:r>
-      <w:r>
-        <w:rPr>
-          <w:rFonts w:ascii="Times New Roman" w:hAnsi="Times New Roman" w:cs="Times New Roman" w:eastAsia="Times New Roman"/>
-          <w:sz w:val="24"/>
-          <w:lang w:val="pt-BR"/>
-        </w:rPr>
-        <w:t xml:space="preserve"> mérito genético. </w:t>
+        <w:t xml:space="preserve">Adicionalmente, para avaliar a relação entre o número de certificações e o preço da dose, foi criada e analisada a variável TOTAL_SELOS, que consistia na quantidade total de certificações por touro. Essa contagem considerou os 16 selos presentes no catálogo, inclusive os genéricos (como PO, PESO e REPRODUTIVO) e os de sistema de produção (EXTENSIVO, SEMIEXTENSIVO e SEMI-INTENSIVO), e variou de 3 a 9 certificações por touro.</w:t>
       </w:r>
     </w:p>
     <w:p>
@@ -2027,7 +2477,7 @@
           <w:sz w:val="24"/>
           <w:lang w:val="pt-BR"/>
         </w:rPr>
-        <w:t xml:space="preserve">Para fins de análise, os selos foram tratados como variáveis binárias, com valor 1 quando o touro possuía o selo e 0 caso contrário, identificado pela correspondência exata do nome do selo no catálogo. Assim, os animais foram classificados com base em 6 selos:</w:t>
+        <w:t xml:space="preserve">A variável linhagem, assim como a anterior, também foi designada como binária no estudo. Essa variável foi criada com base na genealogia (pai, avô paterno e avô materno), na linhagem declarada e no afixo do criador. O touro recebia valor 1 em cada linhagem cujo afixo ou nome (por exemplo, EAO, REM, COL, MAT, MN ou IZ) constasse, como palavra inteira, em seu nome ou no nome do pai ou dos avôs, e 0 caso contrário. A variável indica, portanto, a presença do criatório na genealogia próxima, e não necessariamente a origem do próprio touro; um mesmo animal podia pertencer a mais de uma linhagem (42 touros) ou a nenhuma (10 touros). Neste estudo, foram consideradas 7 linhagens (Troncos), com o número de touros da amostra entre parênteses:</w:t>
       </w:r>
     </w:p>
     <w:p>
@@ -2035,7 +2485,7 @@
         <w:pStyle w:val="PargrafodaLista"/>
         <w:numPr>
           <w:ilvl w:val="0"/>
-          <w:numId w:val="7"/>
+          <w:numId w:val="8"/>
         </w:numPr>
         <w:rPr>
           <w:lang w:val="pt-BR"/>
@@ -2048,95 +2498,7 @@
           <w:sz w:val="24"/>
           <w:lang w:val="pt-BR"/>
         </w:rPr>
-        <w:t xml:space="preserve">O SELO_IFERT, que certificava</w:t>
-      </w:r>
-      <w:r>
-        <w:rPr>
-          <w:rFonts w:ascii="Times New Roman" w:hAnsi="Times New Roman" w:cs="Times New Roman" w:eastAsia="Times New Roman"/>
-          <w:sz w:val="24"/>
-          <w:lang w:val="pt-BR"/>
-        </w:rPr>
-        <w:t xml:space="preserve"/>
-      </w:r>
-      <w:r>
-        <w:rPr>
-          <w:rFonts w:ascii="Times New Roman" w:hAnsi="Times New Roman" w:cs="Times New Roman" w:eastAsia="Times New Roman"/>
-          <w:sz w:val="24"/>
-          <w:lang w:val="pt-BR"/>
-        </w:rPr>
-        <w:t xml:space="preserve"/>
-      </w:r>
-      <w:r>
-        <w:rPr>
-          <w:rFonts w:ascii="Times New Roman" w:hAnsi="Times New Roman" w:cs="Times New Roman" w:eastAsia="Times New Roman"/>
-          <w:sz w:val="24"/>
-          <w:lang w:val="pt-BR"/>
-        </w:rPr>
-        <w:t xml:space="preserve"/>
-      </w:r>
-      <w:r>
-        <w:rPr>
-          <w:rFonts w:ascii="Times New Roman" w:hAnsi="Times New Roman" w:cs="Times New Roman" w:eastAsia="Times New Roman"/>
-          <w:sz w:val="24"/>
-          <w:lang w:val="pt-BR"/>
-        </w:rPr>
-        <w:t xml:space="preserve"> os touros </w:t>
-      </w:r>
-      <w:r>
-        <w:rPr>
-          <w:rFonts w:ascii="Times New Roman" w:hAnsi="Times New Roman" w:cs="Times New Roman" w:eastAsia="Times New Roman"/>
-          <w:sz w:val="24"/>
-          <w:lang w:val="pt-BR"/>
-        </w:rPr>
-        <w:t>como</w:t>
-      </w:r>
-      <w:r>
-        <w:rPr>
-          <w:rFonts w:ascii="Times New Roman" w:hAnsi="Times New Roman" w:cs="Times New Roman" w:eastAsia="Times New Roman"/>
-          <w:sz w:val="24"/>
-          <w:lang w:val="pt-BR"/>
-        </w:rPr>
-        <w:t xml:space="preserve"> superiores </w:t>
-      </w:r>
-      <w:r>
-        <w:rPr>
-          <w:rFonts w:ascii="Times New Roman" w:hAnsi="Times New Roman" w:cs="Times New Roman" w:eastAsia="Times New Roman"/>
-          <w:sz w:val="24"/>
-          <w:lang w:val="pt-BR"/>
-        </w:rPr>
-        <w:t xml:space="preserve">para </w:t>
-      </w:r>
-      <w:r>
-        <w:rPr>
-          <w:rFonts w:ascii="Times New Roman" w:hAnsi="Times New Roman" w:cs="Times New Roman" w:eastAsia="Times New Roman"/>
-          <w:sz w:val="24"/>
-          <w:lang w:val="pt-BR"/>
-        </w:rPr>
-        <w:t>o</w:t>
-      </w:r>
-      <w:r>
-        <w:rPr>
-          <w:rFonts w:ascii="Times New Roman" w:hAnsi="Times New Roman" w:cs="Times New Roman" w:eastAsia="Times New Roman"/>
-          <w:sz w:val="24"/>
-          <w:lang w:val="pt-BR"/>
-        </w:rPr>
-        <w:t xml:space="preserve"> </w:t>
-      </w:r>
-      <w:r>
-        <w:rPr>
-          <w:rFonts w:ascii="Times New Roman" w:hAnsi="Times New Roman" w:cs="Times New Roman" w:eastAsia="Times New Roman"/>
-          <w:sz w:val="24"/>
-          <w:lang w:val="pt-BR"/>
-        </w:rPr>
-        <w:t>Índice de Fertilidade</w:t>
-      </w:r>
-      <w:r>
-        <w:rPr>
-          <w:rFonts w:ascii="Times New Roman" w:hAnsi="Times New Roman" w:cs="Times New Roman" w:eastAsia="Times New Roman"/>
-          <w:sz w:val="24"/>
-          <w:lang w:val="pt-BR"/>
-        </w:rPr>
-        <w:t xml:space="preserve">.</w:t>
+        <w:t xml:space="preserve">TRONCO_EAO – Agropecuária EAO (5).</w:t>
       </w:r>
     </w:p>
     <w:p>
@@ -2144,7 +2506,7 @@
         <w:pStyle w:val="PargrafodaLista"/>
         <w:numPr>
           <w:ilvl w:val="0"/>
-          <w:numId w:val="7"/>
+          <w:numId w:val="8"/>
         </w:numPr>
         <w:rPr>
           <w:lang w:val="pt-BR"/>
@@ -2157,71 +2519,7 @@
           <w:sz w:val="24"/>
           <w:lang w:val="pt-BR"/>
         </w:rPr>
-        <w:t>O</w:t>
-      </w:r>
-      <w:r>
-        <w:rPr>
-          <w:rFonts w:ascii="Times New Roman" w:hAnsi="Times New Roman" w:cs="Times New Roman" w:eastAsia="Times New Roman"/>
-          <w:sz w:val="24"/>
-          <w:lang w:val="pt-BR"/>
-        </w:rPr>
-        <w:t xml:space="preserve"> SELO_MATERNAL</w:t>
-      </w:r>
-      <w:r>
-        <w:rPr>
-          <w:rFonts w:ascii="Times New Roman" w:hAnsi="Times New Roman" w:cs="Times New Roman" w:eastAsia="Times New Roman"/>
-          <w:sz w:val="24"/>
-          <w:lang w:val="pt-BR"/>
-        </w:rPr>
-        <w:t>, que</w:t>
-      </w:r>
-      <w:r>
-        <w:rPr>
-          <w:rFonts w:ascii="Times New Roman" w:hAnsi="Times New Roman" w:cs="Times New Roman" w:eastAsia="Times New Roman"/>
-          <w:sz w:val="24"/>
-          <w:lang w:val="pt-BR"/>
-        </w:rPr>
-        <w:t xml:space="preserve"> </w:t>
-      </w:r>
-      <w:r>
-        <w:rPr>
-          <w:rFonts w:ascii="Times New Roman" w:hAnsi="Times New Roman" w:cs="Times New Roman" w:eastAsia="Times New Roman"/>
-          <w:sz w:val="24"/>
-          <w:lang w:val="pt-BR"/>
-        </w:rPr>
-        <w:t>certificava</w:t>
-      </w:r>
-      <w:r>
-        <w:rPr>
-          <w:rFonts w:ascii="Times New Roman" w:hAnsi="Times New Roman" w:cs="Times New Roman" w:eastAsia="Times New Roman"/>
-          <w:sz w:val="24"/>
-          <w:lang w:val="pt-BR"/>
-        </w:rPr>
-        <w:t xml:space="preserve"> quanto a a</w:t>
-      </w:r>
-      <w:r>
-        <w:rPr>
-          <w:rFonts w:ascii="Times New Roman" w:hAnsi="Times New Roman" w:cs="Times New Roman" w:eastAsia="Times New Roman"/>
-          <w:sz w:val="24"/>
-          <w:lang w:val="pt-BR"/>
-        </w:rPr>
-        <w:t>ptidão para produção de fêmeas de reposição</w:t>
-      </w:r>
-      <w:r>
-        <w:rPr>
-          <w:rFonts w:ascii="Times New Roman" w:hAnsi="Times New Roman" w:cs="Times New Roman" w:eastAsia="Times New Roman"/>
-          <w:sz w:val="24"/>
-          <w:lang w:val="pt-BR"/>
-        </w:rPr>
-        <w:t xml:space="preserve">.</w:t>
-      </w:r>
-      <w:r>
-        <w:rPr>
-          <w:rFonts w:ascii="Times New Roman" w:hAnsi="Times New Roman" w:cs="Times New Roman" w:eastAsia="Times New Roman"/>
-          <w:sz w:val="24"/>
-          <w:lang w:val="pt-BR"/>
-        </w:rPr>
-        <w:t xml:space="preserve"/>
+        <w:t xml:space="preserve">TRONCO_REM – Genética Aditiva, afixo REM (67).</w:t>
       </w:r>
     </w:p>
     <w:p>
@@ -2229,7 +2527,7 @@
         <w:pStyle w:val="PargrafodaLista"/>
         <w:numPr>
           <w:ilvl w:val="0"/>
-          <w:numId w:val="7"/>
+          <w:numId w:val="8"/>
         </w:numPr>
         <w:rPr>
           <w:lang w:val="pt-BR"/>
@@ -2242,95 +2540,7 @@
           <w:sz w:val="24"/>
           <w:lang w:val="pt-BR"/>
         </w:rPr>
-        <w:t xml:space="preserve">O SELO_CAR, que certificava</w:t>
-      </w:r>
-      <w:r>
-        <w:rPr>
-          <w:rFonts w:ascii="Times New Roman" w:hAnsi="Times New Roman" w:cs="Times New Roman" w:eastAsia="Times New Roman"/>
-          <w:sz w:val="24"/>
-          <w:lang w:val="pt-BR"/>
-        </w:rPr>
-        <w:t xml:space="preserve"/>
-      </w:r>
-      <w:r>
-        <w:rPr>
-          <w:rFonts w:ascii="Times New Roman" w:hAnsi="Times New Roman" w:cs="Times New Roman" w:eastAsia="Times New Roman"/>
-          <w:sz w:val="24"/>
-          <w:lang w:val="pt-BR"/>
-        </w:rPr>
-        <w:t xml:space="preserve"/>
-      </w:r>
-      <w:r>
-        <w:rPr>
-          <w:rFonts w:ascii="Times New Roman" w:hAnsi="Times New Roman" w:cs="Times New Roman" w:eastAsia="Times New Roman"/>
-          <w:sz w:val="24"/>
-          <w:lang w:val="pt-BR"/>
-        </w:rPr>
-        <w:t xml:space="preserve"/>
-      </w:r>
-      <w:r>
-        <w:rPr>
-          <w:rFonts w:ascii="Times New Roman" w:hAnsi="Times New Roman" w:cs="Times New Roman" w:eastAsia="Times New Roman"/>
-          <w:sz w:val="24"/>
-          <w:lang w:val="pt-BR"/>
-        </w:rPr>
-        <w:t xml:space="preserve"/>
-      </w:r>
-      <w:r>
-        <w:rPr>
-          <w:rFonts w:ascii="Times New Roman" w:hAnsi="Times New Roman" w:cs="Times New Roman" w:eastAsia="Times New Roman"/>
-          <w:sz w:val="24"/>
-          <w:lang w:val="pt-BR"/>
-        </w:rPr>
-        <w:t xml:space="preserve"> quanto a</w:t>
-      </w:r>
-      <w:r>
-        <w:rPr>
-          <w:rFonts w:ascii="Times New Roman" w:hAnsi="Times New Roman" w:cs="Times New Roman" w:eastAsia="Times New Roman"/>
-          <w:sz w:val="24"/>
-          <w:lang w:val="pt-BR"/>
-        </w:rPr>
-        <w:t xml:space="preserve"> eficiência alimentar </w:t>
-      </w:r>
-      <w:r>
-        <w:rPr>
-          <w:rFonts w:ascii="Times New Roman" w:hAnsi="Times New Roman" w:cs="Times New Roman" w:eastAsia="Times New Roman"/>
-          <w:sz w:val="24"/>
-          <w:lang w:val="pt-BR"/>
-        </w:rPr>
-        <w:t>p</w:t>
-      </w:r>
-      <w:r>
-        <w:rPr>
-          <w:rFonts w:ascii="Times New Roman" w:hAnsi="Times New Roman" w:cs="Times New Roman" w:eastAsia="Times New Roman"/>
-          <w:sz w:val="24"/>
-          <w:lang w:val="pt-BR"/>
-        </w:rPr>
-        <w:t>or meio do critério do</w:t>
-      </w:r>
-      <w:r>
-        <w:rPr>
-          <w:rFonts w:ascii="Times New Roman" w:hAnsi="Times New Roman" w:cs="Times New Roman" w:eastAsia="Times New Roman"/>
-          <w:sz w:val="24"/>
-          <w:lang w:val="pt-BR"/>
-        </w:rPr>
-        <w:t xml:space="preserve"> Consumo Alimentar R</w:t>
-      </w:r>
-      <w:r>
-        <w:rPr>
-          <w:rFonts w:ascii="Times New Roman" w:hAnsi="Times New Roman" w:cs="Times New Roman" w:eastAsia="Times New Roman"/>
-          <w:sz w:val="24"/>
-          <w:lang w:val="pt-BR"/>
-        </w:rPr>
-        <w:t>esidual</w:t>
-      </w:r>
-      <w:r>
-        <w:rPr>
-          <w:rFonts w:ascii="Times New Roman" w:hAnsi="Times New Roman" w:cs="Times New Roman" w:eastAsia="Times New Roman"/>
-          <w:sz w:val="24"/>
-          <w:lang w:val="pt-BR"/>
-        </w:rPr>
-        <w:t xml:space="preserve">.</w:t>
+        <w:t xml:space="preserve">TRONCO_NAVIRAI – Fazenda Chupim / Agropecuária Naviraí (3).</w:t>
       </w:r>
     </w:p>
     <w:p>
@@ -2338,7 +2548,7 @@
         <w:pStyle w:val="PargrafodaLista"/>
         <w:numPr>
           <w:ilvl w:val="0"/>
-          <w:numId w:val="7"/>
+          <w:numId w:val="8"/>
         </w:numPr>
         <w:rPr>
           <w:lang w:val="pt-BR"/>
@@ -2351,7 +2561,7 @@
           <w:sz w:val="24"/>
           <w:lang w:val="pt-BR"/>
         </w:rPr>
-        <w:t>O SELO_CARCACA_5_ESTRELAS, que certificava os touros com classificação máxima (cinco estrelas) quanto à qualidade e ao rendimento de carcaça.</w:t>
+        <w:t xml:space="preserve">TRONCO_MATINHA – Rancho da Matinha, afixo MAT (13).</w:t>
       </w:r>
     </w:p>
     <w:p>
@@ -2359,7 +2569,7 @@
         <w:pStyle w:val="PargrafodaLista"/>
         <w:numPr>
           <w:ilvl w:val="0"/>
-          <w:numId w:val="7"/>
+          <w:numId w:val="8"/>
         </w:numPr>
         <w:rPr>
           <w:lang w:val="pt-BR"/>
@@ -2372,7 +2582,7 @@
           <w:sz w:val="24"/>
           <w:lang w:val="pt-BR"/>
         </w:rPr>
-        <w:t xml:space="preserve">O SELO_NOVILHAS, que indicava os touros recomendados para uso em novilhas. Na amostra, os 29 touros com esse selo apresentaram mediana de TOP 13% para Peso ao Nascer e 7% para Facilidade de Parto de Primíparas, contra 88% e 79,5% nos demais touros.</w:t>
+        <w:t xml:space="preserve">TRONCO_COLONIAL – Fazenda Colonial, afixo COL (29).</w:t>
       </w:r>
     </w:p>
     <w:p>
@@ -2380,7 +2590,7 @@
         <w:pStyle w:val="PargrafodaLista"/>
         <w:numPr>
           <w:ilvl w:val="0"/>
-          <w:numId w:val="7"/>
+          <w:numId w:val="8"/>
         </w:numPr>
         <w:rPr>
           <w:lang w:val="pt-BR"/>
@@ -2393,7 +2603,113 @@
           <w:sz w:val="24"/>
           <w:lang w:val="pt-BR"/>
         </w:rPr>
-        <w:t xml:space="preserve">O SELO_RP_ANCP, que identificava os touros aprovados no Programa de Reprodução Programada (RP) da ANCP, teste de progênie criado em 1995 no qual os touros jovens passam por avaliação genética e vistoria técnica (REPRODUÇÃO [...], 2025).</w:t>
+        <w:t xml:space="preserve">TRONCO_LEMGRUBER_MN – Fazenda Mundo Novo (afixo MN) ou linhagem Lemgruber (22).</w:t>
+      </w:r>
+    </w:p>
+    <w:p>
+      <w:pPr>
+        <w:pStyle w:val="PargrafodaLista"/>
+        <w:numPr>
+          <w:ilvl w:val="0"/>
+          <w:numId w:val="8"/>
+        </w:numPr>
+        <w:rPr>
+          <w:lang w:val="pt-BR"/>
+        </w:rPr>
+        <w:spacing w:line="360" w:lineRule="auto" w:after="0"/>
+      </w:pPr>
+      <w:r>
+        <w:rPr>
+          <w:rFonts w:ascii="Times New Roman" w:hAnsi="Times New Roman" w:cs="Times New Roman" w:eastAsia="Times New Roman"/>
+          <w:sz w:val="24"/>
+          <w:lang w:val="pt-BR"/>
+        </w:rPr>
+        <w:t xml:space="preserve">TRONCO_IZ – Instituto de Zootecnia de Sertãozinho, afixo IZ (13).</w:t>
+      </w:r>
+    </w:p>
+    <w:p>
+      <w:pPr>
+        <w:keepNext w:val="1"/>
+        <w:keepLines w:val="0"/>
+        <w:pageBreakBefore w:val="0"/>
+        <w:widowControl w:val="1"/>
+        <w:pBdr>
+          <w:top w:space="0" w:sz="0" w:val="nil"/>
+          <w:left w:space="0" w:sz="0" w:val="nil"/>
+          <w:bottom w:space="0" w:sz="0" w:val="nil"/>
+          <w:right w:space="0" w:sz="0" w:val="nil"/>
+          <w:between w:space="0" w:sz="0" w:val="nil"/>
+        </w:pBdr>
+        <w:shd w:fill="auto" w:val="clear"/>
+        <w:spacing w:after="120" w:before="120" w:line="360" w:lineRule="auto"/>
+        <w:ind w:left="0" w:right="0" w:firstLine="0"/>
+        <w:jc w:val="both"/>
+        <w:rPr>
+          <w:rFonts w:ascii="Times New Roman" w:cs="Times New Roman" w:eastAsia="Times New Roman" w:hAnsi="Times New Roman"/>
+          <w:b w:val="0"/>
+          <w:bCs w:val="0"/>
+          <w:i w:val="0"/>
+          <w:iCs w:val="0"/>
+          <w:smallCaps w:val="0"/>
+          <w:strike w:val="0"/>
+          <w:color w:val="000000"/>
+          <w:sz w:val="24"/>
+          <w:szCs w:val="24"/>
+          <w:u w:val="none"/>
+          <w:shd w:fill="auto" w:val="clear"/>
+          <w:vertAlign w:val="baseline"/>
+        </w:rPr>
+      </w:pPr>
+      <w:r>
+        <w:rPr>
+          <w:rFonts w:ascii="Times New Roman" w:hAnsi="Times New Roman" w:cs="Times New Roman" w:eastAsia="Times New Roman"/>
+          <w:b/>
+          <w:i w:val="0"/>
+          <w:sz w:val="24"/>
+        </w:rPr>
+        <w:t xml:space="preserve">Etapas da Análise</w:t>
+      </w:r>
+    </w:p>
+    <w:p>
+      <w:pPr>
+        <w:keepNext w:val="1"/>
+        <w:keepLines w:val="0"/>
+        <w:pageBreakBefore w:val="0"/>
+        <w:widowControl w:val="1"/>
+        <w:pBdr>
+          <w:top w:space="0" w:sz="0" w:val="nil"/>
+          <w:left w:space="0" w:sz="0" w:val="nil"/>
+          <w:bottom w:space="0" w:sz="0" w:val="nil"/>
+          <w:right w:space="0" w:sz="0" w:val="nil"/>
+          <w:between w:space="0" w:sz="0" w:val="nil"/>
+        </w:pBdr>
+        <w:shd w:fill="auto" w:val="clear"/>
+        <w:spacing w:after="0" w:before="0" w:line="360" w:lineRule="auto"/>
+        <w:ind w:left="0" w:right="0" w:firstLine="709"/>
+        <w:jc w:val="both"/>
+        <w:rPr>
+          <w:rFonts w:ascii="Times New Roman" w:cs="Times New Roman" w:eastAsia="Times New Roman" w:hAnsi="Times New Roman"/>
+          <w:b w:val="0"/>
+          <w:bCs w:val="0"/>
+          <w:i w:val="0"/>
+          <w:iCs w:val="0"/>
+          <w:smallCaps w:val="0"/>
+          <w:strike w:val="0"/>
+          <w:color w:val="000000"/>
+          <w:sz w:val="24"/>
+          <w:szCs w:val="24"/>
+          <w:u w:val="none"/>
+          <w:shd w:fill="auto" w:val="clear"/>
+          <w:vertAlign w:val="baseline"/>
+        </w:rPr>
+      </w:pPr>
+      <w:r>
+        <w:rPr>
+          <w:rFonts w:ascii="Times New Roman" w:hAnsi="Times New Roman" w:cs="Times New Roman" w:eastAsia="Times New Roman"/>
+          <w:sz w:val="24"/>
+          <w:lang w:val="pt-BR"/>
+        </w:rPr>
+        <w:t xml:space="preserve">A análise foi conduzida em quatro etapas:</w:t>
       </w:r>
     </w:p>
     <w:p>
@@ -2432,10 +2748,21 @@
       <w:r>
         <w:rPr>
           <w:rFonts w:ascii="Times New Roman" w:hAnsi="Times New Roman" w:cs="Times New Roman" w:eastAsia="Times New Roman"/>
-          <w:sz w:val="24"/>
-          <w:lang w:val="pt-BR"/>
-        </w:rPr>
-        <w:t xml:space="preserve">Adicionalmente, para avaliar a relação entre o número de certificações e o preço da dose, foi criada e analisada a variável TOTAL_SELOS, que consistia na quantidade total de certificações por touro. Essa contagem considerou os 16 selos presentes no catálogo, inclusive os genéricos (como PO, PESO e REPRODUTIVO) e os de sistema de produção (EXTENSIVO, SEMIEXTENSIVO e SEMI-INTENSIVO), e variou de 3 a 9 certificações por touro.</w:t>
+          <w:b/>
+          <w:bCs/>
+          <w:sz w:val="24"/>
+          <w:lang w:val="pt-BR"/>
+        </w:rPr>
+        <w:lastRenderedPageBreak/>
+        <w:t>Etapa 1.</w:t>
+      </w:r>
+      <w:r>
+        <w:rPr>
+          <w:rFonts w:ascii="Times New Roman" w:hAnsi="Times New Roman" w:cs="Times New Roman" w:eastAsia="Times New Roman"/>
+          <w:sz w:val="24"/>
+          <w:lang w:val="pt-BR"/>
+        </w:rPr>
+        <w:t xml:space="preserve"> Análise de cada dimensão isoladamente. As DEPs, os selos comerciais e as linhagens foram analisados separadamente, por estatística descritiva, pelo ranking de importância do Random Forest e por regressões hedônicas com todas as variáveis da dimensão (18 DEPs, 6 selos ou 7 linhagens). As variáveis com efeito significativo (p &lt; 0,05, com erros-padrão robustos) foram levadas às etapas seguintes; como nenhuma linhagem foi significativa, essa dimensão foi representada pela linhagem de maior importância no Random Forest (EAO).</w:t>
       </w:r>
     </w:p>
     <w:p>
@@ -2474,157 +2801,124 @@
       <w:r>
         <w:rPr>
           <w:rFonts w:ascii="Times New Roman" w:hAnsi="Times New Roman" w:cs="Times New Roman" w:eastAsia="Times New Roman"/>
-          <w:sz w:val="24"/>
-          <w:lang w:val="pt-BR"/>
-        </w:rPr>
-        <w:t xml:space="preserve">A variável linhagem, assim como a anterior, também foi designada como binária no estudo. Essa variável foi criada com base na genealogia (pai, avô paterno e avô materno), na linhagem declarada e no afixo do criador. O touro recebia valor 1 em cada linhagem cujo afixo ou nome (por exemplo, EAO, REM, COL, MAT, MN ou IZ) constasse, como palavra inteira, em seu nome ou no nome do pai ou dos avôs, e 0 caso contrário. A variável indica, portanto, a presença do criatório na genealogia próxima, e não necessariamente a origem do próprio touro; um mesmo animal podia pertencer a mais de uma linhagem (42 touros) ou a nenhuma (10 touros). Neste estudo, foram consideradas 7 linhagens (Troncos), com o número de touros da amostra entre parênteses:</w:t>
-      </w:r>
-    </w:p>
-    <w:p>
-      <w:pPr>
-        <w:pStyle w:val="PargrafodaLista"/>
-        <w:numPr>
-          <w:ilvl w:val="0"/>
-          <w:numId w:val="8"/>
-        </w:numPr>
-        <w:rPr>
-          <w:lang w:val="pt-BR"/>
-        </w:rPr>
-        <w:spacing w:line="360" w:lineRule="auto" w:after="0"/>
-      </w:pPr>
-      <w:r>
-        <w:rPr>
-          <w:rFonts w:ascii="Times New Roman" w:hAnsi="Times New Roman" w:cs="Times New Roman" w:eastAsia="Times New Roman"/>
-          <w:sz w:val="24"/>
-          <w:lang w:val="pt-BR"/>
-        </w:rPr>
-        <w:t xml:space="preserve">TRONCO_EAO – Agropecuária EAO (5).</w:t>
-      </w:r>
-    </w:p>
-    <w:p>
-      <w:pPr>
-        <w:pStyle w:val="PargrafodaLista"/>
-        <w:numPr>
-          <w:ilvl w:val="0"/>
-          <w:numId w:val="8"/>
-        </w:numPr>
-        <w:rPr>
-          <w:lang w:val="pt-BR"/>
-        </w:rPr>
-        <w:spacing w:line="360" w:lineRule="auto" w:after="0"/>
-      </w:pPr>
-      <w:r>
-        <w:rPr>
-          <w:rFonts w:ascii="Times New Roman" w:hAnsi="Times New Roman" w:cs="Times New Roman" w:eastAsia="Times New Roman"/>
-          <w:sz w:val="24"/>
-          <w:lang w:val="pt-BR"/>
-        </w:rPr>
-        <w:t xml:space="preserve">TRONCO_REM – Genética Aditiva, afixo REM (67).</w:t>
-      </w:r>
-    </w:p>
-    <w:p>
-      <w:pPr>
-        <w:pStyle w:val="PargrafodaLista"/>
-        <w:numPr>
-          <w:ilvl w:val="0"/>
-          <w:numId w:val="8"/>
-        </w:numPr>
-        <w:rPr>
-          <w:lang w:val="pt-BR"/>
-        </w:rPr>
-        <w:spacing w:line="360" w:lineRule="auto" w:after="0"/>
-      </w:pPr>
-      <w:r>
-        <w:rPr>
-          <w:rFonts w:ascii="Times New Roman" w:hAnsi="Times New Roman" w:cs="Times New Roman" w:eastAsia="Times New Roman"/>
-          <w:sz w:val="24"/>
-          <w:lang w:val="pt-BR"/>
-        </w:rPr>
-        <w:t xml:space="preserve">TRONCO_NAVIRAI – Fazenda Chupim / Agropecuária Naviraí (3).</w:t>
-      </w:r>
-    </w:p>
-    <w:p>
-      <w:pPr>
-        <w:pStyle w:val="PargrafodaLista"/>
-        <w:numPr>
-          <w:ilvl w:val="0"/>
-          <w:numId w:val="8"/>
-        </w:numPr>
-        <w:rPr>
-          <w:lang w:val="pt-BR"/>
-        </w:rPr>
-        <w:spacing w:line="360" w:lineRule="auto" w:after="0"/>
-      </w:pPr>
-      <w:r>
-        <w:rPr>
-          <w:rFonts w:ascii="Times New Roman" w:hAnsi="Times New Roman" w:cs="Times New Roman" w:eastAsia="Times New Roman"/>
-          <w:sz w:val="24"/>
-          <w:lang w:val="pt-BR"/>
-        </w:rPr>
-        <w:t xml:space="preserve">TRONCO_MATINHA – Rancho da Matinha, afixo MAT (13).</w:t>
-      </w:r>
-    </w:p>
-    <w:p>
-      <w:pPr>
-        <w:pStyle w:val="PargrafodaLista"/>
-        <w:numPr>
-          <w:ilvl w:val="0"/>
-          <w:numId w:val="8"/>
-        </w:numPr>
-        <w:rPr>
-          <w:lang w:val="pt-BR"/>
-        </w:rPr>
-        <w:spacing w:line="360" w:lineRule="auto" w:after="0"/>
-      </w:pPr>
-      <w:r>
-        <w:rPr>
-          <w:rFonts w:ascii="Times New Roman" w:hAnsi="Times New Roman" w:cs="Times New Roman" w:eastAsia="Times New Roman"/>
-          <w:sz w:val="24"/>
-          <w:lang w:val="pt-BR"/>
-        </w:rPr>
-        <w:t xml:space="preserve">TRONCO_COLONIAL – Fazenda Colonial, afixo COL (29).</w:t>
-      </w:r>
-    </w:p>
-    <w:p>
-      <w:pPr>
-        <w:pStyle w:val="PargrafodaLista"/>
-        <w:numPr>
-          <w:ilvl w:val="0"/>
-          <w:numId w:val="8"/>
-        </w:numPr>
-        <w:rPr>
-          <w:lang w:val="pt-BR"/>
-        </w:rPr>
-        <w:spacing w:line="360" w:lineRule="auto" w:after="0"/>
-      </w:pPr>
-      <w:r>
-        <w:rPr>
-          <w:rFonts w:ascii="Times New Roman" w:hAnsi="Times New Roman" w:cs="Times New Roman" w:eastAsia="Times New Roman"/>
-          <w:sz w:val="24"/>
-          <w:lang w:val="pt-BR"/>
-        </w:rPr>
-        <w:t xml:space="preserve">TRONCO_LEMGRUBER_MN – Fazenda Mundo Novo (afixo MN) ou linhagem Lemgruber (22).</w:t>
-      </w:r>
-    </w:p>
-    <w:p>
-      <w:pPr>
-        <w:pStyle w:val="PargrafodaLista"/>
-        <w:numPr>
-          <w:ilvl w:val="0"/>
-          <w:numId w:val="8"/>
-        </w:numPr>
-        <w:rPr>
-          <w:lang w:val="pt-BR"/>
-        </w:rPr>
-        <w:spacing w:line="360" w:lineRule="auto" w:after="0"/>
-      </w:pPr>
-      <w:r>
-        <w:rPr>
-          <w:rFonts w:ascii="Times New Roman" w:hAnsi="Times New Roman" w:cs="Times New Roman" w:eastAsia="Times New Roman"/>
-          <w:sz w:val="24"/>
-          <w:lang w:val="pt-BR"/>
-        </w:rPr>
-        <w:t xml:space="preserve">TRONCO_IZ – Instituto de Zootecnia de Sertãozinho, afixo IZ (13).</w:t>
+          <w:b/>
+          <w:bCs/>
+          <w:sz w:val="24"/>
+          <w:lang w:val="pt-BR"/>
+        </w:rPr>
+        <w:t>Etapa 2.</w:t>
+      </w:r>
+      <w:r>
+        <w:rPr>
+          <w:rFonts w:ascii="Times New Roman" w:hAnsi="Times New Roman" w:cs="Times New Roman" w:eastAsia="Times New Roman"/>
+          <w:sz w:val="24"/>
+          <w:lang w:val="pt-BR"/>
+        </w:rPr>
+        <w:t xml:space="preserve"> Análise das dimensões aos pares. Foram estimados modelos com duas dimensões ao mesmo tempo (DEPs e selos; DEPs e linhagens; selos e linhagens), para verificar se o efeito de uma dimensão se mantém na presença da outra.</w:t>
+      </w:r>
+    </w:p>
+    <w:p>
+      <w:pPr>
+        <w:keepNext w:val="0"/>
+        <w:keepLines w:val="0"/>
+        <w:pageBreakBefore w:val="0"/>
+        <w:widowControl w:val="1"/>
+        <w:pBdr>
+          <w:top w:space="0" w:sz="0" w:val="nil"/>
+          <w:left w:space="0" w:sz="0" w:val="nil"/>
+          <w:bottom w:space="0" w:sz="0" w:val="nil"/>
+          <w:right w:space="0" w:sz="0" w:val="nil"/>
+          <w:between w:space="0" w:sz="0" w:val="nil"/>
+        </w:pBdr>
+        <w:shd w:fill="auto" w:val="clear"/>
+        <w:spacing w:after="0" w:before="0" w:line="360" w:lineRule="auto"/>
+        <w:ind w:left="0" w:right="0" w:firstLine="709"/>
+        <w:jc w:val="both"/>
+        <w:rPr>
+          <w:rFonts w:ascii="Times New Roman" w:cs="Times New Roman" w:eastAsia="Times New Roman" w:hAnsi="Times New Roman"/>
+          <w:b w:val="0"/>
+          <w:bCs w:val="0"/>
+          <w:i w:val="0"/>
+          <w:iCs w:val="0"/>
+          <w:smallCaps w:val="0"/>
+          <w:strike w:val="0"/>
+          <w:color w:val="000000"/>
+          <w:sz w:val="24"/>
+          <w:szCs w:val="24"/>
+          <w:u w:val="none"/>
+          <w:shd w:fill="auto" w:val="clear"/>
+          <w:vertAlign w:val="baseline"/>
+        </w:rPr>
+      </w:pPr>
+      <w:r>
+        <w:rPr>
+          <w:rFonts w:ascii="Times New Roman" w:hAnsi="Times New Roman" w:cs="Times New Roman" w:eastAsia="Times New Roman"/>
+          <w:b/>
+          <w:bCs/>
+          <w:sz w:val="24"/>
+          <w:lang w:val="pt-BR"/>
+        </w:rPr>
+        <w:t>Etapa 3.</w:t>
+      </w:r>
+      <w:r>
+        <w:rPr>
+          <w:rFonts w:ascii="Times New Roman" w:hAnsi="Times New Roman" w:cs="Times New Roman" w:eastAsia="Times New Roman"/>
+          <w:sz w:val="24"/>
+          <w:lang w:val="pt-BR"/>
+        </w:rPr>
+        <w:t xml:space="preserve"> Comparação dos modelos. Foram comparados os sete modelos possíveis com as três dimensões (três com uma dimensão, três com duas e um com as três), pelo R² e pelo Critério de Informação de Akaike (AIC).</w:t>
+      </w:r>
+    </w:p>
+    <w:p>
+      <w:pPr>
+        <w:keepNext w:val="0"/>
+        <w:keepLines w:val="0"/>
+        <w:pageBreakBefore w:val="0"/>
+        <w:widowControl w:val="1"/>
+        <w:pBdr>
+          <w:top w:space="0" w:sz="0" w:val="nil"/>
+          <w:left w:space="0" w:sz="0" w:val="nil"/>
+          <w:bottom w:space="0" w:sz="0" w:val="nil"/>
+          <w:right w:space="0" w:sz="0" w:val="nil"/>
+          <w:between w:space="0" w:sz="0" w:val="nil"/>
+        </w:pBdr>
+        <w:shd w:fill="auto" w:val="clear"/>
+        <w:spacing w:after="0" w:before="0" w:line="360" w:lineRule="auto"/>
+        <w:ind w:left="0" w:right="0" w:firstLine="709"/>
+        <w:jc w:val="both"/>
+        <w:rPr>
+          <w:rFonts w:ascii="Times New Roman" w:cs="Times New Roman" w:eastAsia="Times New Roman" w:hAnsi="Times New Roman"/>
+          <w:b w:val="0"/>
+          <w:bCs w:val="0"/>
+          <w:i w:val="0"/>
+          <w:iCs w:val="0"/>
+          <w:smallCaps w:val="0"/>
+          <w:strike w:val="0"/>
+          <w:color w:val="000000"/>
+          <w:sz w:val="24"/>
+          <w:szCs w:val="24"/>
+          <w:u w:val="none"/>
+          <w:shd w:fill="auto" w:val="clear"/>
+          <w:vertAlign w:val="baseline"/>
+        </w:rPr>
+      </w:pPr>
+      <w:r>
+        <w:rPr>
+          <w:rFonts w:ascii="Times New Roman" w:hAnsi="Times New Roman" w:cs="Times New Roman" w:eastAsia="Times New Roman"/>
+          <w:b/>
+          <w:bCs/>
+          <w:sz w:val="24"/>
+          <w:lang w:val="pt-BR"/>
+        </w:rPr>
+        <w:t>Etapa 4.</w:t>
+      </w:r>
+      <w:r>
+        <w:rPr>
+          <w:rFonts w:ascii="Times New Roman" w:hAnsi="Times New Roman" w:cs="Times New Roman" w:eastAsia="Times New Roman"/>
+          <w:sz w:val="24"/>
+          <w:lang w:val="pt-BR"/>
+        </w:rPr>
+        <w:t xml:space="preserve"> Modelo final e validação. O modelo com menor AIC entre os sete foi submetido ao diagnóstico dos resíduos e da multicolinearidade (Fator de Inflação da Variância – VIF), e o desempenho preditivo do Random Forest e dos modelos de regressão foi avaliado fora da amostra.</w:t>
       </w:r>
     </w:p>
     <w:p>
@@ -2664,10 +2958,10 @@
         <w:rPr>
           <w:rFonts w:ascii="Times New Roman" w:hAnsi="Times New Roman" w:cs="Times New Roman" w:eastAsia="Times New Roman"/>
           <w:b/>
-          <w:i w:val="0"/>
-          <w:sz w:val="24"/>
-        </w:rPr>
-        <w:t xml:space="preserve">Etapas da Análise</w:t>
+          <w:i/>
+          <w:sz w:val="24"/>
+        </w:rPr>
+        <w:t xml:space="preserve">Algoritmo de Aprendizado de Máquina (Random Forest)</w:t>
       </w:r>
     </w:p>
     <w:p>
@@ -2709,313 +3003,19 @@
           <w:sz w:val="24"/>
           <w:lang w:val="pt-BR"/>
         </w:rPr>
-        <w:t xml:space="preserve">A análise foi conduzida em quatro etapas:</w:t>
-      </w:r>
-    </w:p>
-    <w:p>
-      <w:pPr>
-        <w:keepNext w:val="0"/>
-        <w:keepLines w:val="0"/>
-        <w:pageBreakBefore w:val="0"/>
-        <w:widowControl w:val="1"/>
-        <w:pBdr>
-          <w:top w:space="0" w:sz="0" w:val="nil"/>
-          <w:left w:space="0" w:sz="0" w:val="nil"/>
-          <w:bottom w:space="0" w:sz="0" w:val="nil"/>
-          <w:right w:space="0" w:sz="0" w:val="nil"/>
-          <w:between w:space="0" w:sz="0" w:val="nil"/>
-        </w:pBdr>
-        <w:shd w:fill="auto" w:val="clear"/>
-        <w:spacing w:after="0" w:before="0" w:line="360" w:lineRule="auto"/>
-        <w:ind w:left="0" w:right="0" w:firstLine="709"/>
-        <w:jc w:val="both"/>
-        <w:rPr>
-          <w:rFonts w:ascii="Times New Roman" w:cs="Times New Roman" w:eastAsia="Times New Roman" w:hAnsi="Times New Roman"/>
-          <w:b w:val="0"/>
-          <w:bCs w:val="0"/>
-          <w:i w:val="0"/>
-          <w:iCs w:val="0"/>
-          <w:smallCaps w:val="0"/>
-          <w:strike w:val="0"/>
-          <w:color w:val="000000"/>
-          <w:sz w:val="24"/>
-          <w:szCs w:val="24"/>
-          <w:u w:val="none"/>
-          <w:shd w:fill="auto" w:val="clear"/>
-          <w:vertAlign w:val="baseline"/>
-        </w:rPr>
-      </w:pPr>
-      <w:r>
-        <w:rPr>
-          <w:rFonts w:ascii="Times New Roman" w:hAnsi="Times New Roman" w:cs="Times New Roman" w:eastAsia="Times New Roman"/>
-          <w:b/>
-          <w:bCs/>
-          <w:sz w:val="24"/>
-          <w:lang w:val="pt-BR"/>
-        </w:rPr>
-        <w:lastRenderedPageBreak/>
-        <w:t>Etapa 1.</w:t>
-      </w:r>
-      <w:r>
-        <w:rPr>
-          <w:rFonts w:ascii="Times New Roman" w:hAnsi="Times New Roman" w:cs="Times New Roman" w:eastAsia="Times New Roman"/>
-          <w:sz w:val="24"/>
-          <w:lang w:val="pt-BR"/>
-        </w:rPr>
-        <w:t xml:space="preserve"> Análise de cada dimensão isoladamente. As DEPs, os selos comerciais e as linhagens foram analisados separadamente, por estatística descritiva, pelo ranking de importância do Random Forest e por regressões hedônicas com todas as variáveis da dimensão (18 DEPs, 6 selos ou 7 linhagens). As variáveis com efeito significativo (p &lt; 0,05, com erros-padrão robustos) foram levadas às etapas seguintes; como nenhuma linhagem foi significativa, essa dimensão foi representada pela linhagem de maior importância no Random Forest (EAO).</w:t>
-      </w:r>
-    </w:p>
-    <w:p>
-      <w:pPr>
-        <w:keepNext w:val="0"/>
-        <w:keepLines w:val="0"/>
-        <w:pageBreakBefore w:val="0"/>
-        <w:widowControl w:val="1"/>
-        <w:pBdr>
-          <w:top w:space="0" w:sz="0" w:val="nil"/>
-          <w:left w:space="0" w:sz="0" w:val="nil"/>
-          <w:bottom w:space="0" w:sz="0" w:val="nil"/>
-          <w:right w:space="0" w:sz="0" w:val="nil"/>
-          <w:between w:space="0" w:sz="0" w:val="nil"/>
-        </w:pBdr>
-        <w:shd w:fill="auto" w:val="clear"/>
-        <w:spacing w:after="0" w:before="0" w:line="360" w:lineRule="auto"/>
-        <w:ind w:left="0" w:right="0" w:firstLine="709"/>
-        <w:jc w:val="both"/>
-        <w:rPr>
-          <w:rFonts w:ascii="Times New Roman" w:cs="Times New Roman" w:eastAsia="Times New Roman" w:hAnsi="Times New Roman"/>
-          <w:b w:val="0"/>
-          <w:bCs w:val="0"/>
-          <w:i w:val="0"/>
-          <w:iCs w:val="0"/>
-          <w:smallCaps w:val="0"/>
-          <w:strike w:val="0"/>
-          <w:color w:val="000000"/>
-          <w:sz w:val="24"/>
-          <w:szCs w:val="24"/>
-          <w:u w:val="none"/>
-          <w:shd w:fill="auto" w:val="clear"/>
-          <w:vertAlign w:val="baseline"/>
-        </w:rPr>
-      </w:pPr>
-      <w:r>
-        <w:rPr>
-          <w:rFonts w:ascii="Times New Roman" w:hAnsi="Times New Roman" w:cs="Times New Roman" w:eastAsia="Times New Roman"/>
-          <w:b/>
-          <w:bCs/>
-          <w:sz w:val="24"/>
-          <w:lang w:val="pt-BR"/>
-        </w:rPr>
-        <w:t>Etapa 2.</w:t>
-      </w:r>
-      <w:r>
-        <w:rPr>
-          <w:rFonts w:ascii="Times New Roman" w:hAnsi="Times New Roman" w:cs="Times New Roman" w:eastAsia="Times New Roman"/>
-          <w:sz w:val="24"/>
-          <w:lang w:val="pt-BR"/>
-        </w:rPr>
-        <w:t xml:space="preserve"> Análise das dimensões aos pares. Foram estimados modelos com duas dimensões ao mesmo tempo (DEPs e selos; DEPs e linhagens; selos e linhagens), para verificar se o efeito de uma dimensão se mantém na presença da outra.</w:t>
-      </w:r>
-    </w:p>
-    <w:p>
-      <w:pPr>
-        <w:keepNext w:val="0"/>
-        <w:keepLines w:val="0"/>
-        <w:pageBreakBefore w:val="0"/>
-        <w:widowControl w:val="1"/>
-        <w:pBdr>
-          <w:top w:space="0" w:sz="0" w:val="nil"/>
-          <w:left w:space="0" w:sz="0" w:val="nil"/>
-          <w:bottom w:space="0" w:sz="0" w:val="nil"/>
-          <w:right w:space="0" w:sz="0" w:val="nil"/>
-          <w:between w:space="0" w:sz="0" w:val="nil"/>
-        </w:pBdr>
-        <w:shd w:fill="auto" w:val="clear"/>
-        <w:spacing w:after="0" w:before="0" w:line="360" w:lineRule="auto"/>
-        <w:ind w:left="0" w:right="0" w:firstLine="709"/>
-        <w:jc w:val="both"/>
-        <w:rPr>
-          <w:rFonts w:ascii="Times New Roman" w:cs="Times New Roman" w:eastAsia="Times New Roman" w:hAnsi="Times New Roman"/>
-          <w:b w:val="0"/>
-          <w:bCs w:val="0"/>
-          <w:i w:val="0"/>
-          <w:iCs w:val="0"/>
-          <w:smallCaps w:val="0"/>
-          <w:strike w:val="0"/>
-          <w:color w:val="000000"/>
-          <w:sz w:val="24"/>
-          <w:szCs w:val="24"/>
-          <w:u w:val="none"/>
-          <w:shd w:fill="auto" w:val="clear"/>
-          <w:vertAlign w:val="baseline"/>
-        </w:rPr>
-      </w:pPr>
-      <w:r>
-        <w:rPr>
-          <w:rFonts w:ascii="Times New Roman" w:hAnsi="Times New Roman" w:cs="Times New Roman" w:eastAsia="Times New Roman"/>
-          <w:b/>
-          <w:bCs/>
-          <w:sz w:val="24"/>
-          <w:lang w:val="pt-BR"/>
-        </w:rPr>
-        <w:t>Etapa 3.</w:t>
-      </w:r>
-      <w:r>
-        <w:rPr>
-          <w:rFonts w:ascii="Times New Roman" w:hAnsi="Times New Roman" w:cs="Times New Roman" w:eastAsia="Times New Roman"/>
-          <w:sz w:val="24"/>
-          <w:lang w:val="pt-BR"/>
-        </w:rPr>
-        <w:t xml:space="preserve"> Comparação dos modelos. Foram comparados os sete modelos possíveis com as três dimensões (três com uma dimensão, três com duas e um com as três), pelo R² e pelo Critério de Informação de Akaike (AIC).</w:t>
-      </w:r>
-    </w:p>
-    <w:p>
-      <w:pPr>
-        <w:keepNext w:val="0"/>
-        <w:keepLines w:val="0"/>
-        <w:pageBreakBefore w:val="0"/>
-        <w:widowControl w:val="1"/>
-        <w:pBdr>
-          <w:top w:space="0" w:sz="0" w:val="nil"/>
-          <w:left w:space="0" w:sz="0" w:val="nil"/>
-          <w:bottom w:space="0" w:sz="0" w:val="nil"/>
-          <w:right w:space="0" w:sz="0" w:val="nil"/>
-          <w:between w:space="0" w:sz="0" w:val="nil"/>
-        </w:pBdr>
-        <w:shd w:fill="auto" w:val="clear"/>
-        <w:spacing w:after="0" w:before="0" w:line="360" w:lineRule="auto"/>
-        <w:ind w:left="0" w:right="0" w:firstLine="709"/>
-        <w:jc w:val="both"/>
-        <w:rPr>
-          <w:rFonts w:ascii="Times New Roman" w:cs="Times New Roman" w:eastAsia="Times New Roman" w:hAnsi="Times New Roman"/>
-          <w:b w:val="0"/>
-          <w:bCs w:val="0"/>
-          <w:i w:val="0"/>
-          <w:iCs w:val="0"/>
-          <w:smallCaps w:val="0"/>
-          <w:strike w:val="0"/>
-          <w:color w:val="000000"/>
-          <w:sz w:val="24"/>
-          <w:szCs w:val="24"/>
-          <w:u w:val="none"/>
-          <w:shd w:fill="auto" w:val="clear"/>
-          <w:vertAlign w:val="baseline"/>
-        </w:rPr>
-      </w:pPr>
-      <w:r>
-        <w:rPr>
-          <w:rFonts w:ascii="Times New Roman" w:hAnsi="Times New Roman" w:cs="Times New Roman" w:eastAsia="Times New Roman"/>
-          <w:b/>
-          <w:bCs/>
-          <w:sz w:val="24"/>
-          <w:lang w:val="pt-BR"/>
-        </w:rPr>
-        <w:t>Etapa 4.</w:t>
-      </w:r>
-      <w:r>
-        <w:rPr>
-          <w:rFonts w:ascii="Times New Roman" w:hAnsi="Times New Roman" w:cs="Times New Roman" w:eastAsia="Times New Roman"/>
-          <w:sz w:val="24"/>
-          <w:lang w:val="pt-BR"/>
-        </w:rPr>
-        <w:t xml:space="preserve"> Modelo final e validação. O modelo com menor AIC entre os sete foi submetido ao diagnóstico dos resíduos e da multicolinearidade (Fator de Inflação da Variância – VIF), e o desempenho preditivo do Random Forest e dos modelos de regressão foi avaliado fora da amostra.</w:t>
+        <w:t xml:space="preserve">Aplicou-se o algoritmo supervisionado Random Forest Regressor (BREIMAN, 2001), um conjunto de árvores de decisão em que cada árvore é ajustada a uma amostra bootstrap dos dados e, em cada divisão, escolhe a melhor variável entre um subconjunto sorteado. Foram construídos conjuntos com 500 árvores de decisão (n_estimators = 500), semente pseudoaleatória fixada em random_state = 42 para assegurar reprodutibilidade, e seleção de subconjuntos de atributos pela raiz quadrada do total de variáveis</w:t>
+      </w:r>
+      <w:r>
+        <w:rPr>
+          <w:rFonts w:ascii="Times New Roman" w:hAnsi="Times New Roman" w:cs="Times New Roman" w:eastAsia="Times New Roman"/>
+          <w:sz w:val="24"/>
+        </w:rPr>
+        <w:t xml:space="preserve"> (max_features = 'sqrt').</w:t>
       </w:r>
     </w:p>
     <w:p>
       <w:pPr>
         <w:keepNext w:val="1"/>
-        <w:keepLines w:val="0"/>
-        <w:pageBreakBefore w:val="0"/>
-        <w:widowControl w:val="1"/>
-        <w:pBdr>
-          <w:top w:space="0" w:sz="0" w:val="nil"/>
-          <w:left w:space="0" w:sz="0" w:val="nil"/>
-          <w:bottom w:space="0" w:sz="0" w:val="nil"/>
-          <w:right w:space="0" w:sz="0" w:val="nil"/>
-          <w:between w:space="0" w:sz="0" w:val="nil"/>
-        </w:pBdr>
-        <w:shd w:fill="auto" w:val="clear"/>
-        <w:spacing w:after="120" w:before="120" w:line="360" w:lineRule="auto"/>
-        <w:ind w:left="0" w:right="0" w:firstLine="0"/>
-        <w:jc w:val="both"/>
-        <w:rPr>
-          <w:rFonts w:ascii="Times New Roman" w:cs="Times New Roman" w:eastAsia="Times New Roman" w:hAnsi="Times New Roman"/>
-          <w:b w:val="0"/>
-          <w:bCs w:val="0"/>
-          <w:i w:val="0"/>
-          <w:iCs w:val="0"/>
-          <w:smallCaps w:val="0"/>
-          <w:strike w:val="0"/>
-          <w:color w:val="000000"/>
-          <w:sz w:val="24"/>
-          <w:szCs w:val="24"/>
-          <w:u w:val="none"/>
-          <w:shd w:fill="auto" w:val="clear"/>
-          <w:vertAlign w:val="baseline"/>
-        </w:rPr>
-      </w:pPr>
-      <w:r>
-        <w:rPr>
-          <w:rFonts w:ascii="Times New Roman" w:hAnsi="Times New Roman" w:cs="Times New Roman" w:eastAsia="Times New Roman"/>
-          <w:b/>
-          <w:i/>
-          <w:sz w:val="24"/>
-        </w:rPr>
-        <w:t xml:space="preserve">Algoritmo de Aprendizado de Máquina (Random Forest)</w:t>
-      </w:r>
-    </w:p>
-    <w:p>
-      <w:pPr>
-        <w:keepNext w:val="0"/>
-        <w:keepLines w:val="0"/>
-        <w:pageBreakBefore w:val="0"/>
-        <w:widowControl w:val="1"/>
-        <w:pBdr>
-          <w:top w:space="0" w:sz="0" w:val="nil"/>
-          <w:left w:space="0" w:sz="0" w:val="nil"/>
-          <w:bottom w:space="0" w:sz="0" w:val="nil"/>
-          <w:right w:space="0" w:sz="0" w:val="nil"/>
-          <w:between w:space="0" w:sz="0" w:val="nil"/>
-        </w:pBdr>
-        <w:shd w:fill="auto" w:val="clear"/>
-        <w:spacing w:after="0" w:before="0" w:line="360" w:lineRule="auto"/>
-        <w:ind w:left="0" w:right="0" w:firstLine="709"/>
-        <w:jc w:val="both"/>
-        <w:rPr>
-          <w:rFonts w:ascii="Times New Roman" w:cs="Times New Roman" w:eastAsia="Times New Roman" w:hAnsi="Times New Roman"/>
-          <w:b w:val="0"/>
-          <w:bCs w:val="0"/>
-          <w:i w:val="0"/>
-          <w:iCs w:val="0"/>
-          <w:smallCaps w:val="0"/>
-          <w:strike w:val="0"/>
-          <w:color w:val="000000"/>
-          <w:sz w:val="24"/>
-          <w:szCs w:val="24"/>
-          <w:u w:val="none"/>
-          <w:shd w:fill="auto" w:val="clear"/>
-          <w:vertAlign w:val="baseline"/>
-        </w:rPr>
-      </w:pPr>
-      <w:r>
-        <w:rPr>
-          <w:rFonts w:ascii="Times New Roman" w:hAnsi="Times New Roman" w:cs="Times New Roman" w:eastAsia="Times New Roman"/>
-          <w:sz w:val="24"/>
-          <w:lang w:val="pt-BR"/>
-        </w:rPr>
-        <w:t xml:space="preserve">Aplicou-se o algoritmo supervisionado Random Forest Regressor (BREIMAN, 2001), um conjunto de árvores de decisão em que cada árvore é ajustada a uma amostra bootstrap dos dados e, em cada divisão, escolhe a melhor variável entre um subconjunto sorteado. Foram construídos conjuntos com 500 árvores de decisão (n_estimators = 500), semente pseudoaleatória fixada em random_state = 42 para assegurar reprodutibilidade, e seleção de subconjuntos de atributos pela raiz quadrada do total de variáveis</w:t>
-      </w:r>
-      <w:r>
-        <w:rPr>
-          <w:rFonts w:ascii="Times New Roman" w:hAnsi="Times New Roman" w:cs="Times New Roman" w:eastAsia="Times New Roman"/>
-          <w:sz w:val="24"/>
-        </w:rPr>
-        <w:t xml:space="preserve"> (max_features = 'sqrt').</w:t>
-      </w:r>
-    </w:p>
-    <w:p>
-      <w:pPr>
-        <w:keepNext w:val="0"/>
         <w:keepLines w:val="0"/>
         <w:pageBreakBefore w:val="0"/>
         <w:widowControl w:val="1"/>
@@ -3476,7 +3476,7 @@
     </w:p>
     <w:p>
       <w:pPr>
-        <w:keepNext w:val="0"/>
+        <w:keepNext w:val="1"/>
         <w:keepLines w:val="0"/>
         <w:pageBreakBefore w:val="0"/>
         <w:widowControl w:val="1"/>
@@ -3737,7 +3737,7 @@
     </w:p>
     <w:p>
       <w:pPr>
-        <w:keepNext w:val="0"/>
+        <w:keepNext w:val="1"/>
         <w:keepLines w:val="0"/>
         <w:pageBreakBefore w:val="0"/>
         <w:widowControl w:val="1"/>
@@ -11429,7 +11429,7 @@
     </w:p>
     <w:p>
       <w:pPr>
-        <w:keepNext w:val="0"/>
+        <w:keepNext w:val="1"/>
         <w:keepLines w:val="0"/>
         <w:pageBreakBefore w:val="0"/>
         <w:widowControl w:val="1"/>

</xml_diff>